<commit_message>
updated router rip passive interface screenshot
</commit_message>
<xml_diff>
--- a/lab1/IP_Routing_Lab1.docx
+++ b/lab1/IP_Routing_Lab1.docx
@@ -79,7 +79,25 @@
           <w:sz w:val="20"/>
           <w:szCs w:val="20"/>
         </w:rPr>
-        <w:t xml:space="preserve">Wire the lab according to the diagram below. Be sure that the subnet 2 'hub' is actually a switch with VLAN capabilities. </w:t>
+        <w:t xml:space="preserve">Wire the lab according to the diagram below. Be sure that the subnet 2 'hub' is </w:t>
+      </w:r>
+      <w:proofErr w:type="gramStart"/>
+      <w:r>
+        <w:rPr>
+          <w:rFonts w:ascii="Courier New" w:eastAsia="Times New Roman" w:hAnsi="Courier New" w:cs="Courier New"/>
+          <w:sz w:val="20"/>
+          <w:szCs w:val="20"/>
+        </w:rPr>
+        <w:t>actually a</w:t>
+      </w:r>
+      <w:proofErr w:type="gramEnd"/>
+      <w:r>
+        <w:rPr>
+          <w:rFonts w:ascii="Courier New" w:eastAsia="Times New Roman" w:hAnsi="Courier New" w:cs="Courier New"/>
+          <w:sz w:val="20"/>
+          <w:szCs w:val="20"/>
+        </w:rPr>
+        <w:t xml:space="preserve"> switch with VLAN capabilities. </w:t>
       </w:r>
     </w:p>
     <w:p>
@@ -358,7 +376,25 @@
           <w:szCs w:val="20"/>
         </w:rPr>
         <w:lastRenderedPageBreak/>
-        <w:t xml:space="preserve">show ip route </w:t>
+        <w:t xml:space="preserve">show </w:t>
+      </w:r>
+      <w:proofErr w:type="spellStart"/>
+      <w:r>
+        <w:rPr>
+          <w:rFonts w:ascii="Courier New" w:eastAsia="Times New Roman" w:hAnsi="Courier New" w:cs="Courier New"/>
+          <w:sz w:val="20"/>
+          <w:szCs w:val="20"/>
+        </w:rPr>
+        <w:t>ip</w:t>
+      </w:r>
+      <w:proofErr w:type="spellEnd"/>
+      <w:r>
+        <w:rPr>
+          <w:rFonts w:ascii="Courier New" w:eastAsia="Times New Roman" w:hAnsi="Courier New" w:cs="Courier New"/>
+          <w:sz w:val="20"/>
+          <w:szCs w:val="20"/>
+        </w:rPr>
+        <w:t xml:space="preserve"> route </w:t>
       </w:r>
     </w:p>
     <w:p>
@@ -380,7 +416,25 @@
           <w:sz w:val="20"/>
           <w:szCs w:val="20"/>
         </w:rPr>
-        <w:t xml:space="preserve">clear ip route * </w:t>
+        <w:t xml:space="preserve">clear </w:t>
+      </w:r>
+      <w:proofErr w:type="spellStart"/>
+      <w:r>
+        <w:rPr>
+          <w:rFonts w:ascii="Courier New" w:eastAsia="Times New Roman" w:hAnsi="Courier New" w:cs="Courier New"/>
+          <w:sz w:val="20"/>
+          <w:szCs w:val="20"/>
+        </w:rPr>
+        <w:t>ip</w:t>
+      </w:r>
+      <w:proofErr w:type="spellEnd"/>
+      <w:r>
+        <w:rPr>
+          <w:rFonts w:ascii="Courier New" w:eastAsia="Times New Roman" w:hAnsi="Courier New" w:cs="Courier New"/>
+          <w:sz w:val="20"/>
+          <w:szCs w:val="20"/>
+        </w:rPr>
+        <w:t xml:space="preserve"> route * </w:t>
       </w:r>
     </w:p>
     <w:p>
@@ -424,7 +478,25 @@
           <w:sz w:val="20"/>
           <w:szCs w:val="20"/>
         </w:rPr>
-        <w:t xml:space="preserve">show running-config </w:t>
+        <w:t xml:space="preserve">show </w:t>
+      </w:r>
+      <w:proofErr w:type="gramStart"/>
+      <w:r>
+        <w:rPr>
+          <w:rFonts w:ascii="Courier New" w:eastAsia="Times New Roman" w:hAnsi="Courier New" w:cs="Courier New"/>
+          <w:sz w:val="20"/>
+          <w:szCs w:val="20"/>
+        </w:rPr>
+        <w:t>running-config</w:t>
+      </w:r>
+      <w:proofErr w:type="gramEnd"/>
+      <w:r>
+        <w:rPr>
+          <w:rFonts w:ascii="Courier New" w:eastAsia="Times New Roman" w:hAnsi="Courier New" w:cs="Courier New"/>
+          <w:sz w:val="20"/>
+          <w:szCs w:val="20"/>
+        </w:rPr>
+        <w:t xml:space="preserve"> </w:t>
       </w:r>
     </w:p>
     <w:p>
@@ -497,7 +569,25 @@
           <w:sz w:val="20"/>
           <w:szCs w:val="20"/>
         </w:rPr>
-        <w:t xml:space="preserve">Configure IP addressing on you routers. /32s for loopbacks, /30s or /31s for serial segments and /24s for ethernet segments. </w:t>
+        <w:t xml:space="preserve">Configure IP addressing on </w:t>
+      </w:r>
+      <w:proofErr w:type="gramStart"/>
+      <w:r>
+        <w:rPr>
+          <w:rFonts w:ascii="Courier New" w:eastAsia="Times New Roman" w:hAnsi="Courier New" w:cs="Courier New"/>
+          <w:sz w:val="20"/>
+          <w:szCs w:val="20"/>
+        </w:rPr>
+        <w:t>you</w:t>
+      </w:r>
+      <w:proofErr w:type="gramEnd"/>
+      <w:r>
+        <w:rPr>
+          <w:rFonts w:ascii="Courier New" w:eastAsia="Times New Roman" w:hAnsi="Courier New" w:cs="Courier New"/>
+          <w:sz w:val="20"/>
+          <w:szCs w:val="20"/>
+        </w:rPr>
+        <w:t xml:space="preserve"> routers. /32s for loopbacks, /30s or /31s for serial segments and /24s for ethernet segments. </w:t>
       </w:r>
     </w:p>
     <w:p>
@@ -519,7 +609,25 @@
           <w:sz w:val="20"/>
           <w:szCs w:val="20"/>
         </w:rPr>
-        <w:t xml:space="preserve">Configure IP addressing of backbone ethernet to be 200.200.200.xr/24, where x is your group number, r is the router number. </w:t>
+        <w:t>Configure IP addressing of backbone ethernet to be 200.</w:t>
+      </w:r>
+      <w:proofErr w:type="gramStart"/>
+      <w:r>
+        <w:rPr>
+          <w:rFonts w:ascii="Courier New" w:eastAsia="Times New Roman" w:hAnsi="Courier New" w:cs="Courier New"/>
+          <w:sz w:val="20"/>
+          <w:szCs w:val="20"/>
+        </w:rPr>
+        <w:t>200.200.xr</w:t>
+      </w:r>
+      <w:proofErr w:type="gramEnd"/>
+      <w:r>
+        <w:rPr>
+          <w:rFonts w:ascii="Courier New" w:eastAsia="Times New Roman" w:hAnsi="Courier New" w:cs="Courier New"/>
+          <w:sz w:val="20"/>
+          <w:szCs w:val="20"/>
+        </w:rPr>
+        <w:t xml:space="preserve">/24, where x is your group number, r is the router number. </w:t>
       </w:r>
     </w:p>
     <w:p>
@@ -541,7 +649,25 @@
           <w:sz w:val="20"/>
           <w:szCs w:val="20"/>
         </w:rPr>
-        <w:t xml:space="preserve">Be sure to name your routers using the scheme xRr, where x is your group number, r is the router number. </w:t>
+        <w:t xml:space="preserve">Be sure to name your routers using the scheme </w:t>
+      </w:r>
+      <w:proofErr w:type="spellStart"/>
+      <w:r>
+        <w:rPr>
+          <w:rFonts w:ascii="Courier New" w:eastAsia="Times New Roman" w:hAnsi="Courier New" w:cs="Courier New"/>
+          <w:sz w:val="20"/>
+          <w:szCs w:val="20"/>
+        </w:rPr>
+        <w:t>xRr</w:t>
+      </w:r>
+      <w:proofErr w:type="spellEnd"/>
+      <w:r>
+        <w:rPr>
+          <w:rFonts w:ascii="Courier New" w:eastAsia="Times New Roman" w:hAnsi="Courier New" w:cs="Courier New"/>
+          <w:sz w:val="20"/>
+          <w:szCs w:val="20"/>
+        </w:rPr>
+        <w:t xml:space="preserve">, where x is your group number, r is the router number. </w:t>
       </w:r>
     </w:p>
     <w:p>
@@ -563,7 +689,25 @@
           <w:sz w:val="20"/>
           <w:szCs w:val="20"/>
         </w:rPr>
-        <w:t xml:space="preserve">Question 1.1 - How do you tell if all your routers interfaces are 'up' and working. Paste output from one router showing this. </w:t>
+        <w:t xml:space="preserve">Question 1.1 - How do you tell if all your </w:t>
+      </w:r>
+      <w:proofErr w:type="gramStart"/>
+      <w:r>
+        <w:rPr>
+          <w:rFonts w:ascii="Courier New" w:eastAsia="Times New Roman" w:hAnsi="Courier New" w:cs="Courier New"/>
+          <w:sz w:val="20"/>
+          <w:szCs w:val="20"/>
+        </w:rPr>
+        <w:t>routers</w:t>
+      </w:r>
+      <w:proofErr w:type="gramEnd"/>
+      <w:r>
+        <w:rPr>
+          <w:rFonts w:ascii="Courier New" w:eastAsia="Times New Roman" w:hAnsi="Courier New" w:cs="Courier New"/>
+          <w:sz w:val="20"/>
+          <w:szCs w:val="20"/>
+        </w:rPr>
+        <w:t xml:space="preserve"> interfaces are 'up' and working. Paste output from one router showing this. </w:t>
       </w:r>
       <w:r>
         <w:rPr>
@@ -685,6 +829,7 @@
           <w:rFonts w:ascii="Courier New" w:eastAsia="Times New Roman" w:hAnsi="Courier New" w:cs="Courier New"/>
           <w:b/>
           <w:bCs/>
+          <w:noProof/>
           <w:sz w:val="20"/>
           <w:szCs w:val="20"/>
         </w:rPr>
@@ -806,8 +951,98 @@
           <w:sz w:val="20"/>
           <w:szCs w:val="20"/>
         </w:rPr>
-        <w:t xml:space="preserve">Question 2.1 - show reachability using 'ping' between R1 and R5. </w:t>
-      </w:r>
+        <w:t xml:space="preserve">Question 2.1 - show </w:t>
+      </w:r>
+      <w:proofErr w:type="gramStart"/>
+      <w:r>
+        <w:rPr>
+          <w:rFonts w:ascii="Courier New" w:eastAsia="Times New Roman" w:hAnsi="Courier New" w:cs="Courier New"/>
+          <w:sz w:val="20"/>
+          <w:szCs w:val="20"/>
+        </w:rPr>
+        <w:t>reachability</w:t>
+      </w:r>
+      <w:proofErr w:type="gramEnd"/>
+      <w:r>
+        <w:rPr>
+          <w:rFonts w:ascii="Courier New" w:eastAsia="Times New Roman" w:hAnsi="Courier New" w:cs="Courier New"/>
+          <w:sz w:val="20"/>
+          <w:szCs w:val="20"/>
+        </w:rPr>
+        <w:t xml:space="preserve"> using 'ping' between R1 and R5.</w:t>
+      </w:r>
+    </w:p>
+    <w:p>
+      <w:pPr>
+        <w:spacing w:before="100" w:beforeAutospacing="1" w:after="100" w:afterAutospacing="1" w:line="240" w:lineRule="auto"/>
+        <w:ind w:left="360"/>
+        <w:rPr>
+          <w:rFonts w:ascii="Courier New" w:eastAsia="Times New Roman" w:hAnsi="Courier New" w:cs="Courier New"/>
+          <w:sz w:val="20"/>
+          <w:szCs w:val="20"/>
+        </w:rPr>
+      </w:pPr>
+      <w:r>
+        <w:rPr>
+          <w:rFonts w:ascii="Courier New" w:eastAsia="Times New Roman" w:hAnsi="Courier New" w:cs="Courier New"/>
+          <w:sz w:val="20"/>
+          <w:szCs w:val="20"/>
+        </w:rPr>
+        <w:lastRenderedPageBreak/>
+        <w:drawing>
+          <wp:inline distT="0" distB="0" distL="0" distR="0" wp14:anchorId="25D2FE27" wp14:editId="2A6CF3E3">
+            <wp:extent cx="5433531" cy="3863675"/>
+            <wp:effectExtent l="0" t="0" r="0" b="3810"/>
+            <wp:docPr id="1329429939" name="Picture 1"/>
+            <wp:cNvGraphicFramePr>
+              <a:graphicFrameLocks xmlns:a="http://schemas.openxmlformats.org/drawingml/2006/main" noChangeAspect="1"/>
+            </wp:cNvGraphicFramePr>
+            <a:graphic xmlns:a="http://schemas.openxmlformats.org/drawingml/2006/main">
+              <a:graphicData uri="http://schemas.openxmlformats.org/drawingml/2006/picture">
+                <pic:pic xmlns:pic="http://schemas.openxmlformats.org/drawingml/2006/picture">
+                  <pic:nvPicPr>
+                    <pic:cNvPr id="1329429939" name=""/>
+                    <pic:cNvPicPr/>
+                  </pic:nvPicPr>
+                  <pic:blipFill>
+                    <a:blip r:embed="rId8"/>
+                    <a:stretch>
+                      <a:fillRect/>
+                    </a:stretch>
+                  </pic:blipFill>
+                  <pic:spPr>
+                    <a:xfrm>
+                      <a:off x="0" y="0"/>
+                      <a:ext cx="5433531" cy="3863675"/>
+                    </a:xfrm>
+                    <a:prstGeom prst="rect">
+                      <a:avLst/>
+                    </a:prstGeom>
+                  </pic:spPr>
+                </pic:pic>
+              </a:graphicData>
+            </a:graphic>
+          </wp:inline>
+        </w:drawing>
+      </w:r>
+      <w:r>
+        <w:rPr>
+          <w:rFonts w:ascii="Courier New" w:eastAsia="Times New Roman" w:hAnsi="Courier New" w:cs="Courier New"/>
+          <w:sz w:val="20"/>
+          <w:szCs w:val="20"/>
+        </w:rPr>
+        <w:t xml:space="preserve"> </w:t>
+      </w:r>
+    </w:p>
+    <w:p>
+      <w:pPr>
+        <w:spacing w:before="100" w:beforeAutospacing="1" w:after="100" w:afterAutospacing="1" w:line="240" w:lineRule="auto"/>
+        <w:rPr>
+          <w:rFonts w:ascii="Courier New" w:eastAsia="Times New Roman" w:hAnsi="Courier New" w:cs="Courier New"/>
+          <w:sz w:val="20"/>
+          <w:szCs w:val="20"/>
+        </w:rPr>
+      </w:pPr>
     </w:p>
     <w:p>
       <w:pPr>
@@ -833,6 +1068,146 @@
     </w:p>
     <w:p>
       <w:pPr>
+        <w:spacing w:before="100" w:beforeAutospacing="1" w:after="100" w:afterAutospacing="1" w:line="240" w:lineRule="auto"/>
+        <w:ind w:left="720"/>
+        <w:rPr>
+          <w:rFonts w:ascii="Courier New" w:eastAsia="Times New Roman" w:hAnsi="Courier New" w:cs="Courier New"/>
+          <w:b/>
+          <w:bCs/>
+          <w:sz w:val="20"/>
+          <w:szCs w:val="20"/>
+        </w:rPr>
+      </w:pPr>
+      <w:r>
+        <w:rPr>
+          <w:rFonts w:ascii="Courier New" w:eastAsia="Times New Roman" w:hAnsi="Courier New" w:cs="Courier New"/>
+          <w:b/>
+          <w:bCs/>
+          <w:sz w:val="20"/>
+          <w:szCs w:val="20"/>
+        </w:rPr>
+        <w:t>We do not advertise the 200.200.200.0/24 network in rip</w:t>
+      </w:r>
+    </w:p>
+    <w:p>
+      <w:pPr>
+        <w:spacing w:before="100" w:beforeAutospacing="1" w:after="100" w:afterAutospacing="1" w:line="240" w:lineRule="auto"/>
+        <w:ind w:left="720"/>
+        <w:rPr>
+          <w:rFonts w:ascii="Courier New" w:eastAsia="Times New Roman" w:hAnsi="Courier New" w:cs="Courier New"/>
+          <w:sz w:val="20"/>
+          <w:szCs w:val="20"/>
+        </w:rPr>
+      </w:pPr>
+      <w:r>
+        <w:rPr>
+          <w:rFonts w:ascii="Courier New" w:eastAsia="Times New Roman" w:hAnsi="Courier New" w:cs="Courier New"/>
+          <w:sz w:val="20"/>
+          <w:szCs w:val="20"/>
+        </w:rPr>
+        <w:drawing>
+          <wp:inline distT="0" distB="0" distL="0" distR="0" wp14:anchorId="70FDD1D6" wp14:editId="5467F9D9">
+            <wp:extent cx="2674852" cy="1112616"/>
+            <wp:effectExtent l="0" t="0" r="0" b="0"/>
+            <wp:docPr id="1858977781" name="Picture 1"/>
+            <wp:cNvGraphicFramePr>
+              <a:graphicFrameLocks xmlns:a="http://schemas.openxmlformats.org/drawingml/2006/main" noChangeAspect="1"/>
+            </wp:cNvGraphicFramePr>
+            <a:graphic xmlns:a="http://schemas.openxmlformats.org/drawingml/2006/main">
+              <a:graphicData uri="http://schemas.openxmlformats.org/drawingml/2006/picture">
+                <pic:pic xmlns:pic="http://schemas.openxmlformats.org/drawingml/2006/picture">
+                  <pic:nvPicPr>
+                    <pic:cNvPr id="1858977781" name=""/>
+                    <pic:cNvPicPr/>
+                  </pic:nvPicPr>
+                  <pic:blipFill>
+                    <a:blip r:embed="rId9"/>
+                    <a:stretch>
+                      <a:fillRect/>
+                    </a:stretch>
+                  </pic:blipFill>
+                  <pic:spPr>
+                    <a:xfrm>
+                      <a:off x="0" y="0"/>
+                      <a:ext cx="2674852" cy="1112616"/>
+                    </a:xfrm>
+                    <a:prstGeom prst="rect">
+                      <a:avLst/>
+                    </a:prstGeom>
+                  </pic:spPr>
+                </pic:pic>
+              </a:graphicData>
+            </a:graphic>
+          </wp:inline>
+        </w:drawing>
+      </w:r>
+    </w:p>
+    <w:p>
+      <w:pPr>
+        <w:spacing w:before="100" w:beforeAutospacing="1" w:after="100" w:afterAutospacing="1" w:line="240" w:lineRule="auto"/>
+        <w:ind w:left="720"/>
+        <w:rPr>
+          <w:rFonts w:ascii="Courier New" w:eastAsia="Times New Roman" w:hAnsi="Courier New" w:cs="Courier New"/>
+          <w:sz w:val="20"/>
+          <w:szCs w:val="20"/>
+        </w:rPr>
+      </w:pPr>
+      <w:r>
+        <w:rPr>
+          <w:rFonts w:ascii="Courier New" w:eastAsia="Times New Roman" w:hAnsi="Courier New" w:cs="Courier New"/>
+          <w:sz w:val="20"/>
+          <w:szCs w:val="20"/>
+        </w:rPr>
+        <w:drawing>
+          <wp:inline distT="0" distB="0" distL="0" distR="0" wp14:anchorId="320249C1" wp14:editId="1CD44543">
+            <wp:extent cx="2728196" cy="1120237"/>
+            <wp:effectExtent l="0" t="0" r="0" b="3810"/>
+            <wp:docPr id="397167801" name="Picture 1"/>
+            <wp:cNvGraphicFramePr>
+              <a:graphicFrameLocks xmlns:a="http://schemas.openxmlformats.org/drawingml/2006/main" noChangeAspect="1"/>
+            </wp:cNvGraphicFramePr>
+            <a:graphic xmlns:a="http://schemas.openxmlformats.org/drawingml/2006/main">
+              <a:graphicData uri="http://schemas.openxmlformats.org/drawingml/2006/picture">
+                <pic:pic xmlns:pic="http://schemas.openxmlformats.org/drawingml/2006/picture">
+                  <pic:nvPicPr>
+                    <pic:cNvPr id="397167801" name=""/>
+                    <pic:cNvPicPr/>
+                  </pic:nvPicPr>
+                  <pic:blipFill>
+                    <a:blip r:embed="rId10"/>
+                    <a:stretch>
+                      <a:fillRect/>
+                    </a:stretch>
+                  </pic:blipFill>
+                  <pic:spPr>
+                    <a:xfrm>
+                      <a:off x="0" y="0"/>
+                      <a:ext cx="2728196" cy="1120237"/>
+                    </a:xfrm>
+                    <a:prstGeom prst="rect">
+                      <a:avLst/>
+                    </a:prstGeom>
+                  </pic:spPr>
+                </pic:pic>
+              </a:graphicData>
+            </a:graphic>
+          </wp:inline>
+        </w:drawing>
+      </w:r>
+    </w:p>
+    <w:p>
+      <w:pPr>
+        <w:spacing w:before="100" w:beforeAutospacing="1" w:after="100" w:afterAutospacing="1" w:line="240" w:lineRule="auto"/>
+        <w:ind w:left="720"/>
+        <w:rPr>
+          <w:rFonts w:ascii="Courier New" w:eastAsia="Times New Roman" w:hAnsi="Courier New" w:cs="Courier New"/>
+          <w:sz w:val="20"/>
+          <w:szCs w:val="20"/>
+        </w:rPr>
+      </w:pPr>
+    </w:p>
+    <w:p>
+      <w:pPr>
         <w:numPr>
           <w:ilvl w:val="0"/>
           <w:numId w:val="5"/>
@@ -850,7 +1225,133 @@
           <w:sz w:val="20"/>
           <w:szCs w:val="20"/>
         </w:rPr>
+        <w:lastRenderedPageBreak/>
         <w:t xml:space="preserve">Question 2.3 - Show successful ping from R5 to R1 (subnet 1 interface) and R1 to R5 (subnet 3 interface.) </w:t>
+      </w:r>
+    </w:p>
+    <w:p>
+      <w:pPr>
+        <w:spacing w:before="100" w:beforeAutospacing="1" w:after="100" w:afterAutospacing="1" w:line="240" w:lineRule="auto"/>
+        <w:ind w:left="360"/>
+        <w:rPr>
+          <w:rFonts w:ascii="Courier New" w:eastAsia="Times New Roman" w:hAnsi="Courier New" w:cs="Courier New"/>
+          <w:sz w:val="20"/>
+          <w:szCs w:val="20"/>
+        </w:rPr>
+      </w:pPr>
+      <w:r>
+        <w:rPr>
+          <w:rFonts w:ascii="Courier New" w:eastAsia="Times New Roman" w:hAnsi="Courier New" w:cs="Courier New"/>
+          <w:sz w:val="20"/>
+          <w:szCs w:val="20"/>
+        </w:rPr>
+        <w:drawing>
+          <wp:inline distT="0" distB="0" distL="0" distR="0" wp14:anchorId="30A38AA4" wp14:editId="0D0A7173">
+            <wp:extent cx="4961050" cy="1729890"/>
+            <wp:effectExtent l="0" t="0" r="0" b="3810"/>
+            <wp:docPr id="1120568521" name="Picture 1"/>
+            <wp:cNvGraphicFramePr>
+              <a:graphicFrameLocks xmlns:a="http://schemas.openxmlformats.org/drawingml/2006/main" noChangeAspect="1"/>
+            </wp:cNvGraphicFramePr>
+            <a:graphic xmlns:a="http://schemas.openxmlformats.org/drawingml/2006/main">
+              <a:graphicData uri="http://schemas.openxmlformats.org/drawingml/2006/picture">
+                <pic:pic xmlns:pic="http://schemas.openxmlformats.org/drawingml/2006/picture">
+                  <pic:nvPicPr>
+                    <pic:cNvPr id="1120568521" name=""/>
+                    <pic:cNvPicPr/>
+                  </pic:nvPicPr>
+                  <pic:blipFill>
+                    <a:blip r:embed="rId11"/>
+                    <a:stretch>
+                      <a:fillRect/>
+                    </a:stretch>
+                  </pic:blipFill>
+                  <pic:spPr>
+                    <a:xfrm>
+                      <a:off x="0" y="0"/>
+                      <a:ext cx="4961050" cy="1729890"/>
+                    </a:xfrm>
+                    <a:prstGeom prst="rect">
+                      <a:avLst/>
+                    </a:prstGeom>
+                  </pic:spPr>
+                </pic:pic>
+              </a:graphicData>
+            </a:graphic>
+          </wp:inline>
+        </w:drawing>
+      </w:r>
+    </w:p>
+    <w:p>
+      <w:pPr>
+        <w:spacing w:before="100" w:beforeAutospacing="1" w:after="100" w:afterAutospacing="1" w:line="240" w:lineRule="auto"/>
+        <w:ind w:left="360"/>
+        <w:rPr>
+          <w:rFonts w:ascii="Courier New" w:eastAsia="Times New Roman" w:hAnsi="Courier New" w:cs="Courier New"/>
+          <w:sz w:val="20"/>
+          <w:szCs w:val="20"/>
+        </w:rPr>
+      </w:pPr>
+    </w:p>
+    <w:p>
+      <w:pPr>
+        <w:spacing w:before="100" w:beforeAutospacing="1" w:after="100" w:afterAutospacing="1" w:line="240" w:lineRule="auto"/>
+        <w:ind w:left="360"/>
+        <w:rPr>
+          <w:rFonts w:ascii="Courier New" w:eastAsia="Times New Roman" w:hAnsi="Courier New" w:cs="Courier New"/>
+          <w:sz w:val="20"/>
+          <w:szCs w:val="20"/>
+        </w:rPr>
+      </w:pPr>
+      <w:r>
+        <w:rPr>
+          <w:rFonts w:ascii="Courier New" w:eastAsia="Times New Roman" w:hAnsi="Courier New" w:cs="Courier New"/>
+          <w:sz w:val="20"/>
+          <w:szCs w:val="20"/>
+        </w:rPr>
+        <w:drawing>
+          <wp:inline distT="0" distB="0" distL="0" distR="0" wp14:anchorId="32E91401" wp14:editId="32B13358">
+            <wp:extent cx="5090601" cy="998307"/>
+            <wp:effectExtent l="0" t="0" r="0" b="0"/>
+            <wp:docPr id="1406530966" name="Picture 1"/>
+            <wp:cNvGraphicFramePr>
+              <a:graphicFrameLocks xmlns:a="http://schemas.openxmlformats.org/drawingml/2006/main" noChangeAspect="1"/>
+            </wp:cNvGraphicFramePr>
+            <a:graphic xmlns:a="http://schemas.openxmlformats.org/drawingml/2006/main">
+              <a:graphicData uri="http://schemas.openxmlformats.org/drawingml/2006/picture">
+                <pic:pic xmlns:pic="http://schemas.openxmlformats.org/drawingml/2006/picture">
+                  <pic:nvPicPr>
+                    <pic:cNvPr id="1406530966" name=""/>
+                    <pic:cNvPicPr/>
+                  </pic:nvPicPr>
+                  <pic:blipFill>
+                    <a:blip r:embed="rId12"/>
+                    <a:stretch>
+                      <a:fillRect/>
+                    </a:stretch>
+                  </pic:blipFill>
+                  <pic:spPr>
+                    <a:xfrm>
+                      <a:off x="0" y="0"/>
+                      <a:ext cx="5090601" cy="998307"/>
+                    </a:xfrm>
+                    <a:prstGeom prst="rect">
+                      <a:avLst/>
+                    </a:prstGeom>
+                  </pic:spPr>
+                </pic:pic>
+              </a:graphicData>
+            </a:graphic>
+          </wp:inline>
+        </w:drawing>
+      </w:r>
+      <w:r>
+        <w:rPr>
+          <w:rFonts w:ascii="Courier New" w:eastAsia="Times New Roman" w:hAnsi="Courier New" w:cs="Courier New"/>
+          <w:sz w:val="20"/>
+          <w:szCs w:val="20"/>
+        </w:rPr>
+        <w:tab/>
       </w:r>
     </w:p>
     <w:p>
@@ -894,7 +1395,25 @@
           <w:sz w:val="20"/>
           <w:szCs w:val="20"/>
         </w:rPr>
-        <w:t xml:space="preserve">term mon </w:t>
+        <w:t xml:space="preserve">term </w:t>
+      </w:r>
+      <w:proofErr w:type="spellStart"/>
+      <w:r>
+        <w:rPr>
+          <w:rFonts w:ascii="Courier New" w:eastAsia="Times New Roman" w:hAnsi="Courier New" w:cs="Courier New"/>
+          <w:sz w:val="20"/>
+          <w:szCs w:val="20"/>
+        </w:rPr>
+        <w:t>mon</w:t>
+      </w:r>
+      <w:proofErr w:type="spellEnd"/>
+      <w:r>
+        <w:rPr>
+          <w:rFonts w:ascii="Courier New" w:eastAsia="Times New Roman" w:hAnsi="Courier New" w:cs="Courier New"/>
+          <w:sz w:val="20"/>
+          <w:szCs w:val="20"/>
+        </w:rPr>
+        <w:t xml:space="preserve"> </w:t>
       </w:r>
     </w:p>
     <w:p>
@@ -916,7 +1435,25 @@
           <w:sz w:val="20"/>
           <w:szCs w:val="20"/>
         </w:rPr>
-        <w:t xml:space="preserve">debug ip rip </w:t>
+        <w:t xml:space="preserve">debug </w:t>
+      </w:r>
+      <w:proofErr w:type="spellStart"/>
+      <w:r>
+        <w:rPr>
+          <w:rFonts w:ascii="Courier New" w:eastAsia="Times New Roman" w:hAnsi="Courier New" w:cs="Courier New"/>
+          <w:sz w:val="20"/>
+          <w:szCs w:val="20"/>
+        </w:rPr>
+        <w:t>ip</w:t>
+      </w:r>
+      <w:proofErr w:type="spellEnd"/>
+      <w:r>
+        <w:rPr>
+          <w:rFonts w:ascii="Courier New" w:eastAsia="Times New Roman" w:hAnsi="Courier New" w:cs="Courier New"/>
+          <w:sz w:val="20"/>
+          <w:szCs w:val="20"/>
+        </w:rPr>
+        <w:t xml:space="preserve"> rip </w:t>
       </w:r>
     </w:p>
     <w:p>
@@ -960,8 +1497,344 @@
           <w:sz w:val="20"/>
           <w:szCs w:val="20"/>
         </w:rPr>
+        <w:t xml:space="preserve">Question 2.4 - Observe and log the debug messages for 1 minute. Turn in a sample of the log and a description in your words of what the debug messages mean. </w:t>
+      </w:r>
+    </w:p>
+    <w:p>
+      <w:pPr>
+        <w:numPr>
+          <w:ilvl w:val="0"/>
+          <w:numId w:val="5"/>
+        </w:numPr>
+        <w:spacing w:before="100" w:beforeAutospacing="1" w:after="100" w:afterAutospacing="1" w:line="240" w:lineRule="auto"/>
+        <w:rPr>
+          <w:rFonts w:ascii="Courier New" w:eastAsia="Times New Roman" w:hAnsi="Courier New" w:cs="Courier New"/>
+          <w:sz w:val="20"/>
+          <w:szCs w:val="20"/>
+        </w:rPr>
+      </w:pPr>
+      <w:r>
+        <w:rPr>
+          <w:rFonts w:ascii="Courier New" w:eastAsia="Times New Roman" w:hAnsi="Courier New" w:cs="Courier New"/>
+          <w:sz w:val="20"/>
+          <w:szCs w:val="20"/>
+        </w:rPr>
+        <w:t xml:space="preserve">Question 2.5 - Using the log from 2.4 how do you know RIP is not being advertised to the backbone? </w:t>
+      </w:r>
+    </w:p>
+    <w:p>
+      <w:pPr>
+        <w:numPr>
+          <w:ilvl w:val="0"/>
+          <w:numId w:val="5"/>
+        </w:numPr>
+        <w:spacing w:before="100" w:beforeAutospacing="1" w:after="100" w:afterAutospacing="1" w:line="240" w:lineRule="auto"/>
+        <w:rPr>
+          <w:rFonts w:ascii="Courier New" w:eastAsia="Times New Roman" w:hAnsi="Courier New" w:cs="Courier New"/>
+          <w:sz w:val="20"/>
+          <w:szCs w:val="20"/>
+        </w:rPr>
+      </w:pPr>
+      <w:r>
+        <w:rPr>
+          <w:rFonts w:ascii="Courier New" w:eastAsia="Times New Roman" w:hAnsi="Courier New" w:cs="Courier New"/>
+          <w:sz w:val="20"/>
+          <w:szCs w:val="20"/>
+        </w:rPr>
+        <w:t xml:space="preserve">Enable RIP fully on the backbone network. </w:t>
+      </w:r>
+    </w:p>
+    <w:p>
+      <w:pPr>
+        <w:numPr>
+          <w:ilvl w:val="0"/>
+          <w:numId w:val="5"/>
+        </w:numPr>
+        <w:spacing w:before="100" w:beforeAutospacing="1" w:after="100" w:afterAutospacing="1" w:line="240" w:lineRule="auto"/>
+        <w:rPr>
+          <w:rFonts w:ascii="Courier New" w:eastAsia="Times New Roman" w:hAnsi="Courier New" w:cs="Courier New"/>
+          <w:sz w:val="20"/>
+          <w:szCs w:val="20"/>
+        </w:rPr>
+      </w:pPr>
+      <w:r>
+        <w:rPr>
+          <w:rFonts w:ascii="Courier New" w:eastAsia="Times New Roman" w:hAnsi="Courier New" w:cs="Courier New"/>
+          <w:sz w:val="20"/>
+          <w:szCs w:val="20"/>
+        </w:rPr>
+        <w:t xml:space="preserve">Work with other groups to ensure </w:t>
+      </w:r>
+      <w:proofErr w:type="spellStart"/>
+      <w:r>
+        <w:rPr>
+          <w:rFonts w:ascii="Courier New" w:eastAsia="Times New Roman" w:hAnsi="Courier New" w:cs="Courier New"/>
+          <w:sz w:val="20"/>
+          <w:szCs w:val="20"/>
+        </w:rPr>
+        <w:t>interpod</w:t>
+      </w:r>
+      <w:proofErr w:type="spellEnd"/>
+      <w:r>
+        <w:rPr>
+          <w:rFonts w:ascii="Courier New" w:eastAsia="Times New Roman" w:hAnsi="Courier New" w:cs="Courier New"/>
+          <w:sz w:val="20"/>
+          <w:szCs w:val="20"/>
+        </w:rPr>
+        <w:t xml:space="preserve"> connectivity. </w:t>
+      </w:r>
+    </w:p>
+    <w:p>
+      <w:pPr>
+        <w:numPr>
+          <w:ilvl w:val="0"/>
+          <w:numId w:val="5"/>
+        </w:numPr>
+        <w:spacing w:before="100" w:beforeAutospacing="1" w:after="100" w:afterAutospacing="1" w:line="240" w:lineRule="auto"/>
+        <w:rPr>
+          <w:rFonts w:ascii="Courier New" w:eastAsia="Times New Roman" w:hAnsi="Courier New" w:cs="Courier New"/>
+          <w:sz w:val="20"/>
+          <w:szCs w:val="20"/>
+        </w:rPr>
+      </w:pPr>
+      <w:r>
+        <w:rPr>
+          <w:rFonts w:ascii="Courier New" w:eastAsia="Times New Roman" w:hAnsi="Courier New" w:cs="Courier New"/>
+          <w:sz w:val="20"/>
+          <w:szCs w:val="20"/>
+        </w:rPr>
+        <w:t xml:space="preserve">Question 2.6 - Can you reach other groups routers via ping? Why, why not? </w:t>
+      </w:r>
+    </w:p>
+    <w:p>
+      <w:pPr>
+        <w:numPr>
+          <w:ilvl w:val="0"/>
+          <w:numId w:val="5"/>
+        </w:numPr>
+        <w:spacing w:before="100" w:beforeAutospacing="1" w:after="100" w:afterAutospacing="1" w:line="240" w:lineRule="auto"/>
+        <w:rPr>
+          <w:rFonts w:ascii="Courier New" w:eastAsia="Times New Roman" w:hAnsi="Courier New" w:cs="Courier New"/>
+          <w:sz w:val="20"/>
+          <w:szCs w:val="20"/>
+        </w:rPr>
+      </w:pPr>
+      <w:r>
+        <w:rPr>
+          <w:rFonts w:ascii="Courier New" w:eastAsia="Times New Roman" w:hAnsi="Courier New" w:cs="Courier New"/>
+          <w:sz w:val="20"/>
+          <w:szCs w:val="20"/>
+        </w:rPr>
+        <w:t xml:space="preserve">Work with other groups to fix any </w:t>
+      </w:r>
+      <w:proofErr w:type="spellStart"/>
+      <w:r>
+        <w:rPr>
+          <w:rFonts w:ascii="Courier New" w:eastAsia="Times New Roman" w:hAnsi="Courier New" w:cs="Courier New"/>
+          <w:sz w:val="20"/>
+          <w:szCs w:val="20"/>
+        </w:rPr>
+        <w:t>interpod</w:t>
+      </w:r>
+      <w:proofErr w:type="spellEnd"/>
+      <w:r>
+        <w:rPr>
+          <w:rFonts w:ascii="Courier New" w:eastAsia="Times New Roman" w:hAnsi="Courier New" w:cs="Courier New"/>
+          <w:sz w:val="20"/>
+          <w:szCs w:val="20"/>
+        </w:rPr>
+        <w:t xml:space="preserve"> connectivity problems. </w:t>
+      </w:r>
+    </w:p>
+    <w:p>
+      <w:pPr>
+        <w:numPr>
+          <w:ilvl w:val="0"/>
+          <w:numId w:val="5"/>
+        </w:numPr>
+        <w:spacing w:before="100" w:beforeAutospacing="1" w:after="100" w:afterAutospacing="1" w:line="240" w:lineRule="auto"/>
+        <w:rPr>
+          <w:rFonts w:ascii="Courier New" w:eastAsia="Times New Roman" w:hAnsi="Courier New" w:cs="Courier New"/>
+          <w:sz w:val="20"/>
+          <w:szCs w:val="20"/>
+        </w:rPr>
+      </w:pPr>
+      <w:r>
+        <w:rPr>
+          <w:rFonts w:ascii="Courier New" w:eastAsia="Times New Roman" w:hAnsi="Courier New" w:cs="Courier New"/>
+          <w:sz w:val="20"/>
+          <w:szCs w:val="20"/>
+        </w:rPr>
+        <w:t xml:space="preserve">Question 2.7 - Write up a short description of how you fixed any </w:t>
+      </w:r>
+      <w:proofErr w:type="spellStart"/>
+      <w:r>
+        <w:rPr>
+          <w:rFonts w:ascii="Courier New" w:eastAsia="Times New Roman" w:hAnsi="Courier New" w:cs="Courier New"/>
+          <w:sz w:val="20"/>
+          <w:szCs w:val="20"/>
+        </w:rPr>
+        <w:t>interpod</w:t>
+      </w:r>
+      <w:proofErr w:type="spellEnd"/>
+      <w:r>
+        <w:rPr>
+          <w:rFonts w:ascii="Courier New" w:eastAsia="Times New Roman" w:hAnsi="Courier New" w:cs="Courier New"/>
+          <w:sz w:val="20"/>
+          <w:szCs w:val="20"/>
+        </w:rPr>
+        <w:t xml:space="preserve"> connectivity problems. </w:t>
+      </w:r>
+    </w:p>
+    <w:p>
+      <w:pPr>
+        <w:numPr>
+          <w:ilvl w:val="0"/>
+          <w:numId w:val="5"/>
+        </w:numPr>
+        <w:spacing w:before="100" w:beforeAutospacing="1" w:after="100" w:afterAutospacing="1" w:line="240" w:lineRule="auto"/>
+        <w:rPr>
+          <w:rFonts w:ascii="Courier New" w:eastAsia="Times New Roman" w:hAnsi="Courier New" w:cs="Courier New"/>
+          <w:sz w:val="20"/>
+          <w:szCs w:val="20"/>
+        </w:rPr>
+      </w:pPr>
+      <w:r>
+        <w:rPr>
+          <w:rFonts w:ascii="Courier New" w:eastAsia="Times New Roman" w:hAnsi="Courier New" w:cs="Courier New"/>
+          <w:sz w:val="20"/>
+          <w:szCs w:val="20"/>
+        </w:rPr>
+        <w:t xml:space="preserve">Question 2.8 - Write up a short hypothesize on the timeframe for the next instruction using your working knowledge of RIP. </w:t>
+      </w:r>
+    </w:p>
+    <w:p>
+      <w:pPr>
+        <w:numPr>
+          <w:ilvl w:val="0"/>
+          <w:numId w:val="5"/>
+        </w:numPr>
+        <w:spacing w:before="100" w:beforeAutospacing="1" w:after="100" w:afterAutospacing="1" w:line="240" w:lineRule="auto"/>
+        <w:rPr>
+          <w:rFonts w:ascii="Courier New" w:eastAsia="Times New Roman" w:hAnsi="Courier New" w:cs="Courier New"/>
+          <w:sz w:val="20"/>
+          <w:szCs w:val="20"/>
+        </w:rPr>
+      </w:pPr>
+      <w:r>
+        <w:rPr>
+          <w:rFonts w:ascii="Courier New" w:eastAsia="Times New Roman" w:hAnsi="Courier New" w:cs="Courier New"/>
+          <w:sz w:val="20"/>
+          <w:szCs w:val="20"/>
+        </w:rPr>
+        <w:t xml:space="preserve">'Fail' the link between R3 and R5 by unplugging it. How long before R3 can reach R5? Use logging or debug as necessary to understand the sequence of events. </w:t>
+      </w:r>
+    </w:p>
+    <w:p>
+      <w:pPr>
+        <w:numPr>
+          <w:ilvl w:val="0"/>
+          <w:numId w:val="5"/>
+        </w:numPr>
+        <w:spacing w:before="100" w:beforeAutospacing="1" w:after="100" w:afterAutospacing="1" w:line="240" w:lineRule="auto"/>
+        <w:rPr>
+          <w:rFonts w:ascii="Courier New" w:eastAsia="Times New Roman" w:hAnsi="Courier New" w:cs="Courier New"/>
+          <w:sz w:val="20"/>
+          <w:szCs w:val="20"/>
+        </w:rPr>
+      </w:pPr>
+      <w:r>
+        <w:rPr>
+          <w:rFonts w:ascii="Courier New" w:eastAsia="Times New Roman" w:hAnsi="Courier New" w:cs="Courier New"/>
+          <w:sz w:val="20"/>
+          <w:szCs w:val="20"/>
+        </w:rPr>
+        <w:t xml:space="preserve">Question 2.9 - Show and explain the actual timeframe using your logs for support. Explain any difference from your hypothesis. </w:t>
+      </w:r>
+    </w:p>
+    <w:p>
+      <w:pPr>
+        <w:numPr>
+          <w:ilvl w:val="0"/>
+          <w:numId w:val="5"/>
+        </w:numPr>
+        <w:spacing w:before="100" w:beforeAutospacing="1" w:after="100" w:afterAutospacing="1" w:line="240" w:lineRule="auto"/>
+        <w:rPr>
+          <w:rFonts w:ascii="Courier New" w:eastAsia="Times New Roman" w:hAnsi="Courier New" w:cs="Courier New"/>
+          <w:sz w:val="20"/>
+          <w:szCs w:val="20"/>
+        </w:rPr>
+      </w:pPr>
+      <w:r>
+        <w:rPr>
+          <w:rFonts w:ascii="Courier New" w:eastAsia="Times New Roman" w:hAnsi="Courier New" w:cs="Courier New"/>
+          <w:sz w:val="20"/>
+          <w:szCs w:val="20"/>
+        </w:rPr>
+        <w:t xml:space="preserve">Plug the link back in and wait for the network to converge. </w:t>
+      </w:r>
+    </w:p>
+    <w:p>
+      <w:pPr>
+        <w:numPr>
+          <w:ilvl w:val="0"/>
+          <w:numId w:val="5"/>
+        </w:numPr>
+        <w:spacing w:before="100" w:beforeAutospacing="1" w:after="100" w:afterAutospacing="1" w:line="240" w:lineRule="auto"/>
+        <w:rPr>
+          <w:rFonts w:ascii="Courier New" w:eastAsia="Times New Roman" w:hAnsi="Courier New" w:cs="Courier New"/>
+          <w:sz w:val="20"/>
+          <w:szCs w:val="20"/>
+        </w:rPr>
+      </w:pPr>
+      <w:r>
+        <w:rPr>
+          <w:rFonts w:ascii="Courier New" w:eastAsia="Times New Roman" w:hAnsi="Courier New" w:cs="Courier New"/>
+          <w:sz w:val="20"/>
+          <w:szCs w:val="20"/>
+        </w:rPr>
+        <w:t xml:space="preserve">Question 2.10 - Write up a short </w:t>
+      </w:r>
+      <w:proofErr w:type="gramStart"/>
+      <w:r>
+        <w:rPr>
+          <w:rFonts w:ascii="Courier New" w:eastAsia="Times New Roman" w:hAnsi="Courier New" w:cs="Courier New"/>
+          <w:sz w:val="20"/>
+          <w:szCs w:val="20"/>
+        </w:rPr>
+        <w:t>hypothesize</w:t>
+      </w:r>
+      <w:proofErr w:type="gramEnd"/>
+      <w:r>
+        <w:rPr>
+          <w:rFonts w:ascii="Courier New" w:eastAsia="Times New Roman" w:hAnsi="Courier New" w:cs="Courier New"/>
+          <w:sz w:val="20"/>
+          <w:szCs w:val="20"/>
+        </w:rPr>
+        <w:t xml:space="preserve"> on the timeframe for the next instruction using your working knowledge of RIP. </w:t>
+      </w:r>
+    </w:p>
+    <w:p>
+      <w:pPr>
+        <w:numPr>
+          <w:ilvl w:val="0"/>
+          <w:numId w:val="5"/>
+        </w:numPr>
+        <w:spacing w:before="100" w:beforeAutospacing="1" w:after="100" w:afterAutospacing="1" w:line="240" w:lineRule="auto"/>
+        <w:rPr>
+          <w:rFonts w:ascii="Courier New" w:eastAsia="Times New Roman" w:hAnsi="Courier New" w:cs="Courier New"/>
+          <w:sz w:val="20"/>
+          <w:szCs w:val="20"/>
+        </w:rPr>
+      </w:pPr>
+      <w:r>
+        <w:rPr>
+          <w:rFonts w:ascii="Courier New" w:eastAsia="Times New Roman" w:hAnsi="Courier New" w:cs="Courier New"/>
+          <w:sz w:val="20"/>
+          <w:szCs w:val="20"/>
+        </w:rPr>
         <w:lastRenderedPageBreak/>
-        <w:t xml:space="preserve">Question 2.4 - Observe and log the debug messages for 1 minute. Turn in a sample of the log and a description in your words of what the debug messages mean. </w:t>
+        <w:t xml:space="preserve">On the subnet 2 switch, move R3's subnet 2 interface into a new VLAN. How long before R3 can reach R4? </w:t>
       </w:r>
     </w:p>
     <w:p>
@@ -983,7 +1856,7 @@
           <w:sz w:val="20"/>
           <w:szCs w:val="20"/>
         </w:rPr>
-        <w:t xml:space="preserve">Question 2.5 - Using the log from 2.4 how do you know RIP is not being advertised to the backbone? </w:t>
+        <w:t xml:space="preserve">Question 2.11 - Show and explain the actual timeframe using your logs for support. Explain any difference from your hypothesis. </w:t>
       </w:r>
     </w:p>
     <w:p>
@@ -1005,7 +1878,7 @@
           <w:sz w:val="20"/>
           <w:szCs w:val="20"/>
         </w:rPr>
-        <w:t xml:space="preserve">Enable RIP fully on the backbone network. </w:t>
+        <w:t xml:space="preserve">Fix the VLAN mismatch </w:t>
       </w:r>
     </w:p>
     <w:p>
@@ -1027,7 +1900,25 @@
           <w:sz w:val="20"/>
           <w:szCs w:val="20"/>
         </w:rPr>
-        <w:t xml:space="preserve">Work with other groups to ensure interpod connectivity. </w:t>
+        <w:t xml:space="preserve">Question 2.12 - Write up a short </w:t>
+      </w:r>
+      <w:proofErr w:type="gramStart"/>
+      <w:r>
+        <w:rPr>
+          <w:rFonts w:ascii="Courier New" w:eastAsia="Times New Roman" w:hAnsi="Courier New" w:cs="Courier New"/>
+          <w:sz w:val="20"/>
+          <w:szCs w:val="20"/>
+        </w:rPr>
+        <w:t>hypothesize</w:t>
+      </w:r>
+      <w:proofErr w:type="gramEnd"/>
+      <w:r>
+        <w:rPr>
+          <w:rFonts w:ascii="Courier New" w:eastAsia="Times New Roman" w:hAnsi="Courier New" w:cs="Courier New"/>
+          <w:sz w:val="20"/>
+          <w:szCs w:val="20"/>
+        </w:rPr>
+        <w:t xml:space="preserve"> on the timeframe for the next instruction using your working knowledge of RIP. </w:t>
       </w:r>
     </w:p>
     <w:p>
@@ -1049,7 +1940,7 @@
           <w:sz w:val="20"/>
           <w:szCs w:val="20"/>
         </w:rPr>
-        <w:t xml:space="preserve">Question 2.6 - Can you reach other groups routers via ping? Why, why not? </w:t>
+        <w:t xml:space="preserve">'Fail' R3 by unplugging it. How long before R4 can reach R5? Use logging or debug as necessary to understand the sequence of events. </w:t>
       </w:r>
     </w:p>
     <w:p>
@@ -1071,7 +1962,7 @@
           <w:sz w:val="20"/>
           <w:szCs w:val="20"/>
         </w:rPr>
-        <w:t xml:space="preserve">Work with other groups to fix any interpod connectivity problems. </w:t>
+        <w:t xml:space="preserve">Question 2.13 - Show and explain the actual timeframe using your logs for support. Explain any difference from your hypothesis. </w:t>
       </w:r>
     </w:p>
     <w:p>
@@ -1093,7 +1984,7 @@
           <w:sz w:val="20"/>
           <w:szCs w:val="20"/>
         </w:rPr>
-        <w:t xml:space="preserve">Question 2.7 - Write up a short description of how you fixed any interpod connectivity problems. </w:t>
+        <w:t xml:space="preserve">Continue observations, power R3 back on and wait for the network to converge. </w:t>
       </w:r>
     </w:p>
     <w:p>
@@ -1115,7 +2006,7 @@
           <w:sz w:val="20"/>
           <w:szCs w:val="20"/>
         </w:rPr>
-        <w:t xml:space="preserve">Question 2.8 - Write up a short hypothesize on the timeframe for the next instruction using your working knowledge of RIP. </w:t>
+        <w:t xml:space="preserve">Question 2.14 - Any impact as R3 joins the topology? </w:t>
       </w:r>
     </w:p>
     <w:p>
@@ -1137,271 +2028,25 @@
           <w:sz w:val="20"/>
           <w:szCs w:val="20"/>
         </w:rPr>
-        <w:t xml:space="preserve">'Fail' the link between R3 and R5 by unplugging it. How long before R3 can reach R5? Use logging or debug as necessary to understand the sequence of events. </w:t>
-      </w:r>
-    </w:p>
-    <w:p>
-      <w:pPr>
-        <w:numPr>
-          <w:ilvl w:val="0"/>
-          <w:numId w:val="5"/>
-        </w:numPr>
-        <w:spacing w:before="100" w:beforeAutospacing="1" w:after="100" w:afterAutospacing="1" w:line="240" w:lineRule="auto"/>
-        <w:rPr>
-          <w:rFonts w:ascii="Courier New" w:eastAsia="Times New Roman" w:hAnsi="Courier New" w:cs="Courier New"/>
-          <w:sz w:val="20"/>
-          <w:szCs w:val="20"/>
-        </w:rPr>
-      </w:pPr>
-      <w:r>
-        <w:rPr>
-          <w:rFonts w:ascii="Courier New" w:eastAsia="Times New Roman" w:hAnsi="Courier New" w:cs="Courier New"/>
-          <w:sz w:val="20"/>
-          <w:szCs w:val="20"/>
-        </w:rPr>
-        <w:t xml:space="preserve">Question 2.9 - Show and explain the actual timeframe using your logs for support. Explain any difference from your hypothesis. </w:t>
-      </w:r>
-    </w:p>
-    <w:p>
-      <w:pPr>
-        <w:numPr>
-          <w:ilvl w:val="0"/>
-          <w:numId w:val="5"/>
-        </w:numPr>
-        <w:spacing w:before="100" w:beforeAutospacing="1" w:after="100" w:afterAutospacing="1" w:line="240" w:lineRule="auto"/>
-        <w:rPr>
-          <w:rFonts w:ascii="Courier New" w:eastAsia="Times New Roman" w:hAnsi="Courier New" w:cs="Courier New"/>
-          <w:sz w:val="20"/>
-          <w:szCs w:val="20"/>
-        </w:rPr>
-      </w:pPr>
-      <w:r>
-        <w:rPr>
-          <w:rFonts w:ascii="Courier New" w:eastAsia="Times New Roman" w:hAnsi="Courier New" w:cs="Courier New"/>
-          <w:sz w:val="20"/>
-          <w:szCs w:val="20"/>
-        </w:rPr>
-        <w:t xml:space="preserve">Plug the link back in and wait for the network to converge. </w:t>
-      </w:r>
-    </w:p>
-    <w:p>
-      <w:pPr>
-        <w:numPr>
-          <w:ilvl w:val="0"/>
-          <w:numId w:val="5"/>
-        </w:numPr>
-        <w:spacing w:before="100" w:beforeAutospacing="1" w:after="100" w:afterAutospacing="1" w:line="240" w:lineRule="auto"/>
-        <w:rPr>
-          <w:rFonts w:ascii="Courier New" w:eastAsia="Times New Roman" w:hAnsi="Courier New" w:cs="Courier New"/>
-          <w:sz w:val="20"/>
-          <w:szCs w:val="20"/>
-        </w:rPr>
-      </w:pPr>
-      <w:r>
-        <w:rPr>
-          <w:rFonts w:ascii="Courier New" w:eastAsia="Times New Roman" w:hAnsi="Courier New" w:cs="Courier New"/>
-          <w:sz w:val="20"/>
-          <w:szCs w:val="20"/>
-        </w:rPr>
-        <w:t xml:space="preserve">Question 2.10 - Write up a short hypothesize on the timeframe for the next instruction using your working knowledge of RIP. </w:t>
-      </w:r>
-    </w:p>
-    <w:p>
-      <w:pPr>
-        <w:numPr>
-          <w:ilvl w:val="0"/>
-          <w:numId w:val="5"/>
-        </w:numPr>
-        <w:spacing w:before="100" w:beforeAutospacing="1" w:after="100" w:afterAutospacing="1" w:line="240" w:lineRule="auto"/>
-        <w:rPr>
-          <w:rFonts w:ascii="Courier New" w:eastAsia="Times New Roman" w:hAnsi="Courier New" w:cs="Courier New"/>
-          <w:sz w:val="20"/>
-          <w:szCs w:val="20"/>
-        </w:rPr>
-      </w:pPr>
-      <w:r>
-        <w:rPr>
-          <w:rFonts w:ascii="Courier New" w:eastAsia="Times New Roman" w:hAnsi="Courier New" w:cs="Courier New"/>
-          <w:sz w:val="20"/>
-          <w:szCs w:val="20"/>
-        </w:rPr>
-        <w:t xml:space="preserve">On the subnet 2 switch, move R3's subnet 2 interface into a new VLAN. How long before R3 can reach R4? </w:t>
-      </w:r>
-    </w:p>
-    <w:p>
-      <w:pPr>
-        <w:numPr>
-          <w:ilvl w:val="0"/>
-          <w:numId w:val="5"/>
-        </w:numPr>
-        <w:spacing w:before="100" w:beforeAutospacing="1" w:after="100" w:afterAutospacing="1" w:line="240" w:lineRule="auto"/>
-        <w:rPr>
-          <w:rFonts w:ascii="Courier New" w:eastAsia="Times New Roman" w:hAnsi="Courier New" w:cs="Courier New"/>
-          <w:sz w:val="20"/>
-          <w:szCs w:val="20"/>
-        </w:rPr>
-      </w:pPr>
-      <w:r>
-        <w:rPr>
-          <w:rFonts w:ascii="Courier New" w:eastAsia="Times New Roman" w:hAnsi="Courier New" w:cs="Courier New"/>
-          <w:sz w:val="20"/>
-          <w:szCs w:val="20"/>
-        </w:rPr>
-        <w:t xml:space="preserve">Question 2.11 - Show and explain the actual timeframe using your logs for support. Explain any difference from your hypothesis. </w:t>
-      </w:r>
-    </w:p>
-    <w:p>
-      <w:pPr>
-        <w:numPr>
-          <w:ilvl w:val="0"/>
-          <w:numId w:val="5"/>
-        </w:numPr>
-        <w:spacing w:before="100" w:beforeAutospacing="1" w:after="100" w:afterAutospacing="1" w:line="240" w:lineRule="auto"/>
-        <w:rPr>
-          <w:rFonts w:ascii="Courier New" w:eastAsia="Times New Roman" w:hAnsi="Courier New" w:cs="Courier New"/>
-          <w:sz w:val="20"/>
-          <w:szCs w:val="20"/>
-        </w:rPr>
-      </w:pPr>
-      <w:r>
-        <w:rPr>
-          <w:rFonts w:ascii="Courier New" w:eastAsia="Times New Roman" w:hAnsi="Courier New" w:cs="Courier New"/>
-          <w:sz w:val="20"/>
-          <w:szCs w:val="20"/>
-        </w:rPr>
-        <w:t xml:space="preserve">Fix the VLAN mismatch </w:t>
-      </w:r>
-    </w:p>
-    <w:p>
-      <w:pPr>
-        <w:numPr>
-          <w:ilvl w:val="0"/>
-          <w:numId w:val="5"/>
-        </w:numPr>
-        <w:spacing w:before="100" w:beforeAutospacing="1" w:after="100" w:afterAutospacing="1" w:line="240" w:lineRule="auto"/>
-        <w:rPr>
-          <w:rFonts w:ascii="Courier New" w:eastAsia="Times New Roman" w:hAnsi="Courier New" w:cs="Courier New"/>
-          <w:sz w:val="20"/>
-          <w:szCs w:val="20"/>
-        </w:rPr>
-      </w:pPr>
-      <w:r>
-        <w:rPr>
-          <w:rFonts w:ascii="Courier New" w:eastAsia="Times New Roman" w:hAnsi="Courier New" w:cs="Courier New"/>
-          <w:sz w:val="20"/>
-          <w:szCs w:val="20"/>
-        </w:rPr>
-        <w:t xml:space="preserve">Question 2.12 - Write up a short hypothesize on the timeframe for the next instruction using your working knowledge of RIP. </w:t>
-      </w:r>
-    </w:p>
-    <w:p>
-      <w:pPr>
-        <w:numPr>
-          <w:ilvl w:val="0"/>
-          <w:numId w:val="5"/>
-        </w:numPr>
-        <w:spacing w:before="100" w:beforeAutospacing="1" w:after="100" w:afterAutospacing="1" w:line="240" w:lineRule="auto"/>
-        <w:rPr>
-          <w:rFonts w:ascii="Courier New" w:eastAsia="Times New Roman" w:hAnsi="Courier New" w:cs="Courier New"/>
-          <w:sz w:val="20"/>
-          <w:szCs w:val="20"/>
-        </w:rPr>
-      </w:pPr>
-      <w:r>
-        <w:rPr>
-          <w:rFonts w:ascii="Courier New" w:eastAsia="Times New Roman" w:hAnsi="Courier New" w:cs="Courier New"/>
-          <w:sz w:val="20"/>
-          <w:szCs w:val="20"/>
-        </w:rPr>
-        <w:t xml:space="preserve">'Fail' R3 by unplugging it. How long before R4 can reach R5? Use logging or debug as necessary to understand the sequence of events. </w:t>
-      </w:r>
-    </w:p>
-    <w:p>
-      <w:pPr>
-        <w:numPr>
-          <w:ilvl w:val="0"/>
-          <w:numId w:val="5"/>
-        </w:numPr>
-        <w:spacing w:before="100" w:beforeAutospacing="1" w:after="100" w:afterAutospacing="1" w:line="240" w:lineRule="auto"/>
-        <w:rPr>
-          <w:rFonts w:ascii="Courier New" w:eastAsia="Times New Roman" w:hAnsi="Courier New" w:cs="Courier New"/>
-          <w:sz w:val="20"/>
-          <w:szCs w:val="20"/>
-        </w:rPr>
-      </w:pPr>
-      <w:r>
-        <w:rPr>
-          <w:rFonts w:ascii="Courier New" w:eastAsia="Times New Roman" w:hAnsi="Courier New" w:cs="Courier New"/>
-          <w:sz w:val="20"/>
-          <w:szCs w:val="20"/>
-        </w:rPr>
-        <w:t xml:space="preserve">Question 2.13 - Show and explain the actual timeframe using your logs for support. Explain any difference from your hypothesis. </w:t>
-      </w:r>
-    </w:p>
-    <w:p>
-      <w:pPr>
-        <w:numPr>
-          <w:ilvl w:val="0"/>
-          <w:numId w:val="5"/>
-        </w:numPr>
-        <w:spacing w:before="100" w:beforeAutospacing="1" w:after="100" w:afterAutospacing="1" w:line="240" w:lineRule="auto"/>
-        <w:rPr>
-          <w:rFonts w:ascii="Courier New" w:eastAsia="Times New Roman" w:hAnsi="Courier New" w:cs="Courier New"/>
-          <w:sz w:val="20"/>
-          <w:szCs w:val="20"/>
-        </w:rPr>
-      </w:pPr>
-      <w:r>
-        <w:rPr>
-          <w:rFonts w:ascii="Courier New" w:eastAsia="Times New Roman" w:hAnsi="Courier New" w:cs="Courier New"/>
-          <w:sz w:val="20"/>
-          <w:szCs w:val="20"/>
-        </w:rPr>
-        <w:t xml:space="preserve">Continue observations, power R3 back on and wait for the network to converge. </w:t>
-      </w:r>
-    </w:p>
-    <w:p>
-      <w:pPr>
-        <w:numPr>
-          <w:ilvl w:val="0"/>
-          <w:numId w:val="5"/>
-        </w:numPr>
-        <w:spacing w:before="100" w:beforeAutospacing="1" w:after="100" w:afterAutospacing="1" w:line="240" w:lineRule="auto"/>
-        <w:rPr>
-          <w:rFonts w:ascii="Courier New" w:eastAsia="Times New Roman" w:hAnsi="Courier New" w:cs="Courier New"/>
-          <w:sz w:val="20"/>
-          <w:szCs w:val="20"/>
-        </w:rPr>
-      </w:pPr>
-      <w:r>
-        <w:rPr>
-          <w:rFonts w:ascii="Courier New" w:eastAsia="Times New Roman" w:hAnsi="Courier New" w:cs="Courier New"/>
-          <w:sz w:val="20"/>
-          <w:szCs w:val="20"/>
-        </w:rPr>
-        <w:t xml:space="preserve">Question 2.14 - Any impact as R3 joins the topology? </w:t>
-      </w:r>
-    </w:p>
-    <w:p>
-      <w:pPr>
-        <w:numPr>
-          <w:ilvl w:val="0"/>
-          <w:numId w:val="5"/>
-        </w:numPr>
-        <w:spacing w:before="100" w:beforeAutospacing="1" w:after="100" w:afterAutospacing="1" w:line="240" w:lineRule="auto"/>
-        <w:rPr>
-          <w:rFonts w:ascii="Courier New" w:eastAsia="Times New Roman" w:hAnsi="Courier New" w:cs="Courier New"/>
-          <w:sz w:val="20"/>
-          <w:szCs w:val="20"/>
-        </w:rPr>
-      </w:pPr>
-      <w:r>
-        <w:rPr>
-          <w:rFonts w:ascii="Courier New" w:eastAsia="Times New Roman" w:hAnsi="Courier New" w:cs="Courier New"/>
-          <w:sz w:val="20"/>
-          <w:szCs w:val="20"/>
-        </w:rPr>
-        <w:t xml:space="preserve">Question 2.15 - Explain the difference if any between the three failure and one recovery scenario. </w:t>
+        <w:t xml:space="preserve">Question 2.15 - Explain the difference if any between the three </w:t>
+      </w:r>
+      <w:proofErr w:type="gramStart"/>
+      <w:r>
+        <w:rPr>
+          <w:rFonts w:ascii="Courier New" w:eastAsia="Times New Roman" w:hAnsi="Courier New" w:cs="Courier New"/>
+          <w:sz w:val="20"/>
+          <w:szCs w:val="20"/>
+        </w:rPr>
+        <w:t>failure</w:t>
+      </w:r>
+      <w:proofErr w:type="gramEnd"/>
+      <w:r>
+        <w:rPr>
+          <w:rFonts w:ascii="Courier New" w:eastAsia="Times New Roman" w:hAnsi="Courier New" w:cs="Courier New"/>
+          <w:sz w:val="20"/>
+          <w:szCs w:val="20"/>
+        </w:rPr>
+        <w:t xml:space="preserve"> and one recovery scenario. </w:t>
       </w:r>
     </w:p>
     <w:p>
@@ -1540,8 +2185,216 @@
           <w:sz w:val="20"/>
           <w:szCs w:val="20"/>
         </w:rPr>
-        <w:t xml:space="preserve">Question 3.2 - Debug OSPF such that you can view the neighbor establishment between 2 routers. Turn in a sample of the log and a </w:t>
-      </w:r>
+        <w:t xml:space="preserve">Question 3.2 - Debug OSPF such that you can view the neighbor establishment between 2 routers. Turn in a sample of the log and a description in your words of what is </w:t>
+      </w:r>
+      <w:proofErr w:type="spellStart"/>
+      <w:r>
+        <w:rPr>
+          <w:rFonts w:ascii="Courier New" w:eastAsia="Times New Roman" w:hAnsi="Courier New" w:cs="Courier New"/>
+          <w:sz w:val="20"/>
+          <w:szCs w:val="20"/>
+        </w:rPr>
+        <w:t>occuring</w:t>
+      </w:r>
+      <w:proofErr w:type="spellEnd"/>
+      <w:r>
+        <w:rPr>
+          <w:rFonts w:ascii="Courier New" w:eastAsia="Times New Roman" w:hAnsi="Courier New" w:cs="Courier New"/>
+          <w:sz w:val="20"/>
+          <w:szCs w:val="20"/>
+        </w:rPr>
+        <w:t xml:space="preserve"> at each stage of the neighbor establishment. </w:t>
+      </w:r>
+    </w:p>
+    <w:p>
+      <w:pPr>
+        <w:numPr>
+          <w:ilvl w:val="0"/>
+          <w:numId w:val="6"/>
+        </w:numPr>
+        <w:spacing w:before="100" w:beforeAutospacing="1" w:after="100" w:afterAutospacing="1" w:line="240" w:lineRule="auto"/>
+        <w:rPr>
+          <w:rFonts w:ascii="Courier New" w:eastAsia="Times New Roman" w:hAnsi="Courier New" w:cs="Courier New"/>
+          <w:sz w:val="20"/>
+          <w:szCs w:val="20"/>
+        </w:rPr>
+      </w:pPr>
+      <w:r>
+        <w:rPr>
+          <w:rFonts w:ascii="Courier New" w:eastAsia="Times New Roman" w:hAnsi="Courier New" w:cs="Courier New"/>
+          <w:sz w:val="20"/>
+          <w:szCs w:val="20"/>
+        </w:rPr>
+        <w:t xml:space="preserve">Question 3.3 - Provide output and a reason for the current DR/BDR setup of your R2, R3, R4 ethernet link. </w:t>
+      </w:r>
+    </w:p>
+    <w:p>
+      <w:pPr>
+        <w:numPr>
+          <w:ilvl w:val="0"/>
+          <w:numId w:val="6"/>
+        </w:numPr>
+        <w:spacing w:before="100" w:beforeAutospacing="1" w:after="100" w:afterAutospacing="1" w:line="240" w:lineRule="auto"/>
+        <w:rPr>
+          <w:rFonts w:ascii="Courier New" w:eastAsia="Times New Roman" w:hAnsi="Courier New" w:cs="Courier New"/>
+          <w:sz w:val="20"/>
+          <w:szCs w:val="20"/>
+        </w:rPr>
+      </w:pPr>
+      <w:r>
+        <w:rPr>
+          <w:rFonts w:ascii="Courier New" w:eastAsia="Times New Roman" w:hAnsi="Courier New" w:cs="Courier New"/>
+          <w:sz w:val="20"/>
+          <w:szCs w:val="20"/>
+        </w:rPr>
+        <w:t xml:space="preserve">Question 3.4 - Configure the routers such that R2 is the DR, and R4 is the BDR, and R3 will never compete in an election. Provide show command output showing the new setup/configuration. Did this work after configuration changes or require something additional? Why? </w:t>
+      </w:r>
+    </w:p>
+    <w:p>
+      <w:pPr>
+        <w:numPr>
+          <w:ilvl w:val="0"/>
+          <w:numId w:val="6"/>
+        </w:numPr>
+        <w:spacing w:before="100" w:beforeAutospacing="1" w:after="100" w:afterAutospacing="1" w:line="240" w:lineRule="auto"/>
+        <w:rPr>
+          <w:rFonts w:ascii="Courier New" w:eastAsia="Times New Roman" w:hAnsi="Courier New" w:cs="Courier New"/>
+          <w:sz w:val="20"/>
+          <w:szCs w:val="20"/>
+        </w:rPr>
+      </w:pPr>
+      <w:r>
+        <w:rPr>
+          <w:rFonts w:ascii="Courier New" w:eastAsia="Times New Roman" w:hAnsi="Courier New" w:cs="Courier New"/>
+          <w:sz w:val="20"/>
+          <w:szCs w:val="20"/>
+        </w:rPr>
+        <w:t xml:space="preserve">Configure OSPF router authentication on the ethernet R2, R3, and R4 routers. Purposely configure one of the routers to have an incorrect password. </w:t>
+      </w:r>
+    </w:p>
+    <w:p>
+      <w:pPr>
+        <w:numPr>
+          <w:ilvl w:val="0"/>
+          <w:numId w:val="6"/>
+        </w:numPr>
+        <w:spacing w:before="100" w:beforeAutospacing="1" w:after="100" w:afterAutospacing="1" w:line="240" w:lineRule="auto"/>
+        <w:rPr>
+          <w:rFonts w:ascii="Courier New" w:eastAsia="Times New Roman" w:hAnsi="Courier New" w:cs="Courier New"/>
+          <w:sz w:val="20"/>
+          <w:szCs w:val="20"/>
+        </w:rPr>
+      </w:pPr>
+      <w:r>
+        <w:rPr>
+          <w:rFonts w:ascii="Courier New" w:eastAsia="Times New Roman" w:hAnsi="Courier New" w:cs="Courier New"/>
+          <w:sz w:val="20"/>
+          <w:szCs w:val="20"/>
+        </w:rPr>
+        <w:t xml:space="preserve">Question 3.5 - Show relevant debug output which details the authentication issue. Fix the issue. </w:t>
+      </w:r>
+    </w:p>
+    <w:p>
+      <w:pPr>
+        <w:numPr>
+          <w:ilvl w:val="0"/>
+          <w:numId w:val="6"/>
+        </w:numPr>
+        <w:spacing w:before="100" w:beforeAutospacing="1" w:after="100" w:afterAutospacing="1" w:line="240" w:lineRule="auto"/>
+        <w:rPr>
+          <w:rFonts w:ascii="Courier New" w:eastAsia="Times New Roman" w:hAnsi="Courier New" w:cs="Courier New"/>
+          <w:sz w:val="20"/>
+          <w:szCs w:val="20"/>
+        </w:rPr>
+      </w:pPr>
+      <w:r>
+        <w:rPr>
+          <w:rFonts w:ascii="Courier New" w:eastAsia="Times New Roman" w:hAnsi="Courier New" w:cs="Courier New"/>
+          <w:sz w:val="20"/>
+          <w:szCs w:val="20"/>
+        </w:rPr>
+        <w:t xml:space="preserve">Question 3.6 - Examine the LSA database on a group router. Paste a sample along with a description of each field header. </w:t>
+      </w:r>
+    </w:p>
+    <w:p>
+      <w:pPr>
+        <w:numPr>
+          <w:ilvl w:val="0"/>
+          <w:numId w:val="6"/>
+        </w:numPr>
+        <w:spacing w:before="100" w:beforeAutospacing="1" w:after="100" w:afterAutospacing="1" w:line="240" w:lineRule="auto"/>
+        <w:rPr>
+          <w:rFonts w:ascii="Courier New" w:eastAsia="Times New Roman" w:hAnsi="Courier New" w:cs="Courier New"/>
+          <w:sz w:val="20"/>
+          <w:szCs w:val="20"/>
+        </w:rPr>
+      </w:pPr>
+      <w:r>
+        <w:rPr>
+          <w:rFonts w:ascii="Courier New" w:eastAsia="Times New Roman" w:hAnsi="Courier New" w:cs="Courier New"/>
+          <w:sz w:val="20"/>
+          <w:szCs w:val="20"/>
+        </w:rPr>
+        <w:t xml:space="preserve">Configure your group such that R1 and R5 are ABRs with their backbone links in Area 0 and their group facing links in Area x, where x is group number. All other routers in group are part of site area. </w:t>
+      </w:r>
+    </w:p>
+    <w:p>
+      <w:pPr>
+        <w:numPr>
+          <w:ilvl w:val="0"/>
+          <w:numId w:val="6"/>
+        </w:numPr>
+        <w:spacing w:before="100" w:beforeAutospacing="1" w:after="100" w:afterAutospacing="1" w:line="240" w:lineRule="auto"/>
+        <w:rPr>
+          <w:rFonts w:ascii="Courier New" w:eastAsia="Times New Roman" w:hAnsi="Courier New" w:cs="Courier New"/>
+          <w:sz w:val="20"/>
+          <w:szCs w:val="20"/>
+        </w:rPr>
+      </w:pPr>
+      <w:r>
+        <w:rPr>
+          <w:rFonts w:ascii="Courier New" w:eastAsia="Times New Roman" w:hAnsi="Courier New" w:cs="Courier New"/>
+          <w:sz w:val="20"/>
+          <w:szCs w:val="20"/>
+        </w:rPr>
+        <w:t xml:space="preserve">Question 3.7 - Ping the loopback for R1 from R5, be sure to use the loopback of R5 as the ping source. Cut and paste the command showing this. </w:t>
+      </w:r>
+    </w:p>
+    <w:p>
+      <w:pPr>
+        <w:numPr>
+          <w:ilvl w:val="0"/>
+          <w:numId w:val="6"/>
+        </w:numPr>
+        <w:spacing w:before="100" w:beforeAutospacing="1" w:after="100" w:afterAutospacing="1" w:line="240" w:lineRule="auto"/>
+        <w:rPr>
+          <w:rFonts w:ascii="Courier New" w:eastAsia="Times New Roman" w:hAnsi="Courier New" w:cs="Courier New"/>
+          <w:sz w:val="20"/>
+          <w:szCs w:val="20"/>
+        </w:rPr>
+      </w:pPr>
+      <w:r>
+        <w:rPr>
+          <w:rFonts w:ascii="Courier New" w:eastAsia="Times New Roman" w:hAnsi="Courier New" w:cs="Courier New"/>
+          <w:sz w:val="20"/>
+          <w:szCs w:val="20"/>
+        </w:rPr>
+        <w:t xml:space="preserve">Question 3.8 - Examine the LSA database and routing table of R1 and R5, how are they the same/different. Why? </w:t>
+      </w:r>
+    </w:p>
+    <w:p>
+      <w:pPr>
+        <w:numPr>
+          <w:ilvl w:val="0"/>
+          <w:numId w:val="6"/>
+        </w:numPr>
+        <w:spacing w:before="100" w:beforeAutospacing="1" w:after="100" w:afterAutospacing="1" w:line="240" w:lineRule="auto"/>
+        <w:rPr>
+          <w:rFonts w:ascii="Courier New" w:eastAsia="Times New Roman" w:hAnsi="Courier New" w:cs="Courier New"/>
+          <w:sz w:val="20"/>
+          <w:szCs w:val="20"/>
+        </w:rPr>
+      </w:pPr>
       <w:r>
         <w:rPr>
           <w:rFonts w:ascii="Courier New" w:eastAsia="Times New Roman" w:hAnsi="Courier New" w:cs="Courier New"/>
@@ -1549,7 +2402,25 @@
           <w:szCs w:val="20"/>
         </w:rPr>
         <w:lastRenderedPageBreak/>
-        <w:t xml:space="preserve">description in your words of what is occuring at each stage of the neighbor establishment. </w:t>
+        <w:t xml:space="preserve">Question 3.9 - Ping successfully between your R5 router and another </w:t>
+      </w:r>
+      <w:proofErr w:type="gramStart"/>
+      <w:r>
+        <w:rPr>
+          <w:rFonts w:ascii="Courier New" w:eastAsia="Times New Roman" w:hAnsi="Courier New" w:cs="Courier New"/>
+          <w:sz w:val="20"/>
+          <w:szCs w:val="20"/>
+        </w:rPr>
+        <w:t>groups</w:t>
+      </w:r>
+      <w:proofErr w:type="gramEnd"/>
+      <w:r>
+        <w:rPr>
+          <w:rFonts w:ascii="Courier New" w:eastAsia="Times New Roman" w:hAnsi="Courier New" w:cs="Courier New"/>
+          <w:sz w:val="20"/>
+          <w:szCs w:val="20"/>
+        </w:rPr>
+        <w:t xml:space="preserve"> R5 router. Cut and paste the results. </w:t>
       </w:r>
     </w:p>
     <w:p>
@@ -1571,7 +2442,7 @@
           <w:sz w:val="20"/>
           <w:szCs w:val="20"/>
         </w:rPr>
-        <w:t xml:space="preserve">Question 3.3 - Provide output and a reason for the current DR/BDR setup of your R2, R3, R4 ethernet link. </w:t>
+        <w:t xml:space="preserve">Question 3.10 - Write up a short hypothesize on the timeframe for the next instruction using your working knowledge of OSPF. </w:t>
       </w:r>
     </w:p>
     <w:p>
@@ -1593,7 +2464,7 @@
           <w:sz w:val="20"/>
           <w:szCs w:val="20"/>
         </w:rPr>
-        <w:t xml:space="preserve">Question 3.4 - Configure the routers such that R2 is the DR, and R4 is the BDR, and R3 will never compete in an election. Provide show command output showing the new setup/configuration. Did this work after configuration changes or require something additional? Why? </w:t>
+        <w:t xml:space="preserve">'Fail' the link between R3 and R5 by unplugging it. How long before R3 can reach R5. Use logging or debug as necessary to understand the sequence of events and specify how you tested the convergence. </w:t>
       </w:r>
     </w:p>
     <w:p>
@@ -1615,7 +2486,7 @@
           <w:sz w:val="20"/>
           <w:szCs w:val="20"/>
         </w:rPr>
-        <w:t xml:space="preserve">Configure OSPF router authentication on the ethernet R2, R3, and R4 routers. Purposely configure one of the routers to have an incorrect password. </w:t>
+        <w:t xml:space="preserve">Question 3.11 - Show and explain the actual timeframe using your logs for support. Explain any difference from your hypothesis. </w:t>
       </w:r>
     </w:p>
     <w:p>
@@ -1637,7 +2508,7 @@
           <w:sz w:val="20"/>
           <w:szCs w:val="20"/>
         </w:rPr>
-        <w:t xml:space="preserve">Question 3.5 - Show relevant debug output which details the authentication issue. Fix the issue. </w:t>
+        <w:t xml:space="preserve">Plug the link back in and wait for the network to converge. </w:t>
       </w:r>
     </w:p>
     <w:p>
@@ -1659,7 +2530,7 @@
           <w:sz w:val="20"/>
           <w:szCs w:val="20"/>
         </w:rPr>
-        <w:t xml:space="preserve">Question 3.6 - Examine the LSA database on a group router. Paste a sample along with a description of each field header. </w:t>
+        <w:t xml:space="preserve">Question 3.12 - Write up a short hypothesize on the timeframe for the next instruction using your working knowledge of OSPF. </w:t>
       </w:r>
     </w:p>
     <w:p>
@@ -1681,7 +2552,7 @@
           <w:sz w:val="20"/>
           <w:szCs w:val="20"/>
         </w:rPr>
-        <w:t xml:space="preserve">Configure your group such that R1 and R5 are ABRs with their backbone links in Area 0 and their group facing links in Area x, where x is group number. All other routers in group are part of site area. </w:t>
+        <w:t xml:space="preserve">On the subnet 2 switch, move R3's subnet 2 interface into a new VLAN. How long before R3 can reach R4. </w:t>
       </w:r>
     </w:p>
     <w:p>
@@ -1703,7 +2574,7 @@
           <w:sz w:val="20"/>
           <w:szCs w:val="20"/>
         </w:rPr>
-        <w:t xml:space="preserve">Question 3.7 - Ping the loopback for R1 from R5, be sure to use the loopback of R5 as the ping source. Cut and paste the command showing this. </w:t>
+        <w:t xml:space="preserve">Question 3.13 - Show and explain the actual timeframe using your logs for support. Explain any difference from your hypothesis. </w:t>
       </w:r>
     </w:p>
     <w:p>
@@ -1725,7 +2596,25 @@
           <w:sz w:val="20"/>
           <w:szCs w:val="20"/>
         </w:rPr>
-        <w:t xml:space="preserve">Question 3.8 - Examine the LSA database and routing table of R1 and R5, how are they the same/different. Why? </w:t>
+        <w:t xml:space="preserve">Question 3.14 - Write up a short </w:t>
+      </w:r>
+      <w:proofErr w:type="gramStart"/>
+      <w:r>
+        <w:rPr>
+          <w:rFonts w:ascii="Courier New" w:eastAsia="Times New Roman" w:hAnsi="Courier New" w:cs="Courier New"/>
+          <w:sz w:val="20"/>
+          <w:szCs w:val="20"/>
+        </w:rPr>
+        <w:t>hypothesize</w:t>
+      </w:r>
+      <w:proofErr w:type="gramEnd"/>
+      <w:r>
+        <w:rPr>
+          <w:rFonts w:ascii="Courier New" w:eastAsia="Times New Roman" w:hAnsi="Courier New" w:cs="Courier New"/>
+          <w:sz w:val="20"/>
+          <w:szCs w:val="20"/>
+        </w:rPr>
+        <w:t xml:space="preserve"> on the timeframe for the next instruction using your working knowledge of OSPF. </w:t>
       </w:r>
     </w:p>
     <w:p>
@@ -1747,7 +2636,7 @@
           <w:sz w:val="20"/>
           <w:szCs w:val="20"/>
         </w:rPr>
-        <w:t xml:space="preserve">Question 3.9 - Ping successfully between your R5 router and another groups R5 router. Cut and paste the results. </w:t>
+        <w:t xml:space="preserve">'Fail' R3 by unplugging it. How long before R4 can reach R5? Use logging or debug as necessary to understand the sequence of events. </w:t>
       </w:r>
     </w:p>
     <w:p>
@@ -1769,7 +2658,7 @@
           <w:sz w:val="20"/>
           <w:szCs w:val="20"/>
         </w:rPr>
-        <w:t xml:space="preserve">Question 3.10 - Write up a short hypothesize on the timeframe for the next instruction using your working knowledge of OSPF. </w:t>
+        <w:t xml:space="preserve">Question 3.15 - Show and explain the actual timeframe using your logs for support. Explain any difference from your hypothesis. </w:t>
       </w:r>
     </w:p>
     <w:p>
@@ -1791,7 +2680,7 @@
           <w:sz w:val="20"/>
           <w:szCs w:val="20"/>
         </w:rPr>
-        <w:t xml:space="preserve">'Fail' the link between R3 and R5 by unplugging it. How long before R3 can reach R5. Use logging or debug as necessary to understand the sequence of events and specify how you tested the convergence. </w:t>
+        <w:t xml:space="preserve">Continue observations, power R3 back on and wait for the network to converge. </w:t>
       </w:r>
     </w:p>
     <w:p>
@@ -1813,7 +2702,7 @@
           <w:sz w:val="20"/>
           <w:szCs w:val="20"/>
         </w:rPr>
-        <w:t xml:space="preserve">Question 3.11 - Show and explain the actual timeframe using your logs for support. Explain any difference from your hypothesis. </w:t>
+        <w:t xml:space="preserve">Question 3.16 - Any impact as R3 joins the topology? </w:t>
       </w:r>
     </w:p>
     <w:p>
@@ -1835,7 +2724,25 @@
           <w:sz w:val="20"/>
           <w:szCs w:val="20"/>
         </w:rPr>
-        <w:t xml:space="preserve">Plug the link back in and wait for the network to converge. </w:t>
+        <w:t xml:space="preserve">Question 3.17 - Explain the difference if any between the three </w:t>
+      </w:r>
+      <w:proofErr w:type="gramStart"/>
+      <w:r>
+        <w:rPr>
+          <w:rFonts w:ascii="Courier New" w:eastAsia="Times New Roman" w:hAnsi="Courier New" w:cs="Courier New"/>
+          <w:sz w:val="20"/>
+          <w:szCs w:val="20"/>
+        </w:rPr>
+        <w:t>failure</w:t>
+      </w:r>
+      <w:proofErr w:type="gramEnd"/>
+      <w:r>
+        <w:rPr>
+          <w:rFonts w:ascii="Courier New" w:eastAsia="Times New Roman" w:hAnsi="Courier New" w:cs="Courier New"/>
+          <w:sz w:val="20"/>
+          <w:szCs w:val="20"/>
+        </w:rPr>
+        <w:t xml:space="preserve"> and one recovery scenario. </w:t>
       </w:r>
     </w:p>
     <w:p>
@@ -1857,7 +2764,7 @@
           <w:sz w:val="20"/>
           <w:szCs w:val="20"/>
         </w:rPr>
-        <w:t xml:space="preserve">Question 3.12 - Write up a short hypothesize on the timeframe for the next instruction using your working knowledge of OSPF. </w:t>
+        <w:t xml:space="preserve">Question 3.18 - How did you test the convergence times across these scenarios? Discuss the positives and negatives of this test method. </w:t>
       </w:r>
     </w:p>
     <w:p>
@@ -1879,7 +2786,7 @@
           <w:sz w:val="20"/>
           <w:szCs w:val="20"/>
         </w:rPr>
-        <w:t xml:space="preserve">On the subnet 2 switch, move R3's subnet 2 interface into a new VLAN. How long before R3 can reach R4. </w:t>
+        <w:t xml:space="preserve">Configure your group area to be a stub. </w:t>
       </w:r>
     </w:p>
     <w:p>
@@ -1901,205 +2808,6 @@
           <w:sz w:val="20"/>
           <w:szCs w:val="20"/>
         </w:rPr>
-        <w:t xml:space="preserve">Question 3.13 - Show and explain the actual timeframe using your logs for support. Explain any difference from your hypothesis. </w:t>
-      </w:r>
-    </w:p>
-    <w:p>
-      <w:pPr>
-        <w:numPr>
-          <w:ilvl w:val="0"/>
-          <w:numId w:val="6"/>
-        </w:numPr>
-        <w:spacing w:before="100" w:beforeAutospacing="1" w:after="100" w:afterAutospacing="1" w:line="240" w:lineRule="auto"/>
-        <w:rPr>
-          <w:rFonts w:ascii="Courier New" w:eastAsia="Times New Roman" w:hAnsi="Courier New" w:cs="Courier New"/>
-          <w:sz w:val="20"/>
-          <w:szCs w:val="20"/>
-        </w:rPr>
-      </w:pPr>
-      <w:r>
-        <w:rPr>
-          <w:rFonts w:ascii="Courier New" w:eastAsia="Times New Roman" w:hAnsi="Courier New" w:cs="Courier New"/>
-          <w:sz w:val="20"/>
-          <w:szCs w:val="20"/>
-        </w:rPr>
-        <w:t xml:space="preserve">Question 3.14 - Write up a short hypothesize on the timeframe for the next instruction using your working knowledge of OSPF. </w:t>
-      </w:r>
-    </w:p>
-    <w:p>
-      <w:pPr>
-        <w:numPr>
-          <w:ilvl w:val="0"/>
-          <w:numId w:val="6"/>
-        </w:numPr>
-        <w:spacing w:before="100" w:beforeAutospacing="1" w:after="100" w:afterAutospacing="1" w:line="240" w:lineRule="auto"/>
-        <w:rPr>
-          <w:rFonts w:ascii="Courier New" w:eastAsia="Times New Roman" w:hAnsi="Courier New" w:cs="Courier New"/>
-          <w:sz w:val="20"/>
-          <w:szCs w:val="20"/>
-        </w:rPr>
-      </w:pPr>
-      <w:r>
-        <w:rPr>
-          <w:rFonts w:ascii="Courier New" w:eastAsia="Times New Roman" w:hAnsi="Courier New" w:cs="Courier New"/>
-          <w:sz w:val="20"/>
-          <w:szCs w:val="20"/>
-        </w:rPr>
-        <w:t xml:space="preserve">'Fail' R3 by unplugging it. How long before R4 can reach R5? Use logging or debug as necessary to understand the sequence of events. </w:t>
-      </w:r>
-    </w:p>
-    <w:p>
-      <w:pPr>
-        <w:numPr>
-          <w:ilvl w:val="0"/>
-          <w:numId w:val="6"/>
-        </w:numPr>
-        <w:spacing w:before="100" w:beforeAutospacing="1" w:after="100" w:afterAutospacing="1" w:line="240" w:lineRule="auto"/>
-        <w:rPr>
-          <w:rFonts w:ascii="Courier New" w:eastAsia="Times New Roman" w:hAnsi="Courier New" w:cs="Courier New"/>
-          <w:sz w:val="20"/>
-          <w:szCs w:val="20"/>
-        </w:rPr>
-      </w:pPr>
-      <w:r>
-        <w:rPr>
-          <w:rFonts w:ascii="Courier New" w:eastAsia="Times New Roman" w:hAnsi="Courier New" w:cs="Courier New"/>
-          <w:sz w:val="20"/>
-          <w:szCs w:val="20"/>
-        </w:rPr>
-        <w:t xml:space="preserve">Question 3.15 - Show and explain the actual timeframe using your logs for support. Explain any difference from your hypothesis. </w:t>
-      </w:r>
-    </w:p>
-    <w:p>
-      <w:pPr>
-        <w:numPr>
-          <w:ilvl w:val="0"/>
-          <w:numId w:val="6"/>
-        </w:numPr>
-        <w:spacing w:before="100" w:beforeAutospacing="1" w:after="100" w:afterAutospacing="1" w:line="240" w:lineRule="auto"/>
-        <w:rPr>
-          <w:rFonts w:ascii="Courier New" w:eastAsia="Times New Roman" w:hAnsi="Courier New" w:cs="Courier New"/>
-          <w:sz w:val="20"/>
-          <w:szCs w:val="20"/>
-        </w:rPr>
-      </w:pPr>
-      <w:r>
-        <w:rPr>
-          <w:rFonts w:ascii="Courier New" w:eastAsia="Times New Roman" w:hAnsi="Courier New" w:cs="Courier New"/>
-          <w:sz w:val="20"/>
-          <w:szCs w:val="20"/>
-        </w:rPr>
-        <w:t xml:space="preserve">Continue observations, power R3 back on and wait for the network to converge. </w:t>
-      </w:r>
-    </w:p>
-    <w:p>
-      <w:pPr>
-        <w:numPr>
-          <w:ilvl w:val="0"/>
-          <w:numId w:val="6"/>
-        </w:numPr>
-        <w:spacing w:before="100" w:beforeAutospacing="1" w:after="100" w:afterAutospacing="1" w:line="240" w:lineRule="auto"/>
-        <w:rPr>
-          <w:rFonts w:ascii="Courier New" w:eastAsia="Times New Roman" w:hAnsi="Courier New" w:cs="Courier New"/>
-          <w:sz w:val="20"/>
-          <w:szCs w:val="20"/>
-        </w:rPr>
-      </w:pPr>
-      <w:r>
-        <w:rPr>
-          <w:rFonts w:ascii="Courier New" w:eastAsia="Times New Roman" w:hAnsi="Courier New" w:cs="Courier New"/>
-          <w:sz w:val="20"/>
-          <w:szCs w:val="20"/>
-        </w:rPr>
-        <w:t xml:space="preserve">Question 3.16 - Any impact as R3 joins the topology? </w:t>
-      </w:r>
-    </w:p>
-    <w:p>
-      <w:pPr>
-        <w:numPr>
-          <w:ilvl w:val="0"/>
-          <w:numId w:val="6"/>
-        </w:numPr>
-        <w:spacing w:before="100" w:beforeAutospacing="1" w:after="100" w:afterAutospacing="1" w:line="240" w:lineRule="auto"/>
-        <w:rPr>
-          <w:rFonts w:ascii="Courier New" w:eastAsia="Times New Roman" w:hAnsi="Courier New" w:cs="Courier New"/>
-          <w:sz w:val="20"/>
-          <w:szCs w:val="20"/>
-        </w:rPr>
-      </w:pPr>
-      <w:r>
-        <w:rPr>
-          <w:rFonts w:ascii="Courier New" w:eastAsia="Times New Roman" w:hAnsi="Courier New" w:cs="Courier New"/>
-          <w:sz w:val="20"/>
-          <w:szCs w:val="20"/>
-        </w:rPr>
-        <w:t xml:space="preserve">Question 3.17 - Explain the difference if any between the three failure and one recovery scenario. </w:t>
-      </w:r>
-    </w:p>
-    <w:p>
-      <w:pPr>
-        <w:numPr>
-          <w:ilvl w:val="0"/>
-          <w:numId w:val="6"/>
-        </w:numPr>
-        <w:spacing w:before="100" w:beforeAutospacing="1" w:after="100" w:afterAutospacing="1" w:line="240" w:lineRule="auto"/>
-        <w:rPr>
-          <w:rFonts w:ascii="Courier New" w:eastAsia="Times New Roman" w:hAnsi="Courier New" w:cs="Courier New"/>
-          <w:sz w:val="20"/>
-          <w:szCs w:val="20"/>
-        </w:rPr>
-      </w:pPr>
-      <w:r>
-        <w:rPr>
-          <w:rFonts w:ascii="Courier New" w:eastAsia="Times New Roman" w:hAnsi="Courier New" w:cs="Courier New"/>
-          <w:sz w:val="20"/>
-          <w:szCs w:val="20"/>
-        </w:rPr>
-        <w:t xml:space="preserve">Question 3.18 - How did you test the convergence times across these scenarios? Discuss the positives and negatives of this test method. </w:t>
-      </w:r>
-    </w:p>
-    <w:p>
-      <w:pPr>
-        <w:numPr>
-          <w:ilvl w:val="0"/>
-          <w:numId w:val="6"/>
-        </w:numPr>
-        <w:spacing w:before="100" w:beforeAutospacing="1" w:after="100" w:afterAutospacing="1" w:line="240" w:lineRule="auto"/>
-        <w:rPr>
-          <w:rFonts w:ascii="Courier New" w:eastAsia="Times New Roman" w:hAnsi="Courier New" w:cs="Courier New"/>
-          <w:sz w:val="20"/>
-          <w:szCs w:val="20"/>
-        </w:rPr>
-      </w:pPr>
-      <w:r>
-        <w:rPr>
-          <w:rFonts w:ascii="Courier New" w:eastAsia="Times New Roman" w:hAnsi="Courier New" w:cs="Courier New"/>
-          <w:sz w:val="20"/>
-          <w:szCs w:val="20"/>
-        </w:rPr>
-        <w:t xml:space="preserve">Configure your group area to be a stub. </w:t>
-      </w:r>
-    </w:p>
-    <w:p>
-      <w:pPr>
-        <w:numPr>
-          <w:ilvl w:val="0"/>
-          <w:numId w:val="6"/>
-        </w:numPr>
-        <w:spacing w:before="100" w:beforeAutospacing="1" w:after="100" w:afterAutospacing="1" w:line="240" w:lineRule="auto"/>
-        <w:rPr>
-          <w:rFonts w:ascii="Courier New" w:eastAsia="Times New Roman" w:hAnsi="Courier New" w:cs="Courier New"/>
-          <w:sz w:val="20"/>
-          <w:szCs w:val="20"/>
-        </w:rPr>
-      </w:pPr>
-      <w:r>
-        <w:rPr>
-          <w:rFonts w:ascii="Courier New" w:eastAsia="Times New Roman" w:hAnsi="Courier New" w:cs="Courier New"/>
-          <w:sz w:val="20"/>
-          <w:szCs w:val="20"/>
-        </w:rPr>
-        <w:lastRenderedPageBreak/>
         <w:t xml:space="preserve">Question 3.19 - Examine the LSA database and routing table of R1 and R5, how are they same/different from Question 3.8? Explain any differences. </w:t>
       </w:r>
     </w:p>
@@ -2195,7 +2903,25 @@
           <w:sz w:val="20"/>
           <w:szCs w:val="20"/>
         </w:rPr>
-        <w:t xml:space="preserve">Configure RIP on R4 and on R2 and R3 links facing R4. Be sure to passive interface non RIP interfaces on R2 and R3 </w:t>
+        <w:t xml:space="preserve">Configure RIP on R4 and on R2 and R3 links facing R4. Be sure to passive interface </w:t>
+      </w:r>
+      <w:proofErr w:type="gramStart"/>
+      <w:r>
+        <w:rPr>
+          <w:rFonts w:ascii="Courier New" w:eastAsia="Times New Roman" w:hAnsi="Courier New" w:cs="Courier New"/>
+          <w:sz w:val="20"/>
+          <w:szCs w:val="20"/>
+        </w:rPr>
+        <w:t>non RIP</w:t>
+      </w:r>
+      <w:proofErr w:type="gramEnd"/>
+      <w:r>
+        <w:rPr>
+          <w:rFonts w:ascii="Courier New" w:eastAsia="Times New Roman" w:hAnsi="Courier New" w:cs="Courier New"/>
+          <w:sz w:val="20"/>
+          <w:szCs w:val="20"/>
+        </w:rPr>
+        <w:t xml:space="preserve"> interfaces on R2 and R3 </w:t>
       </w:r>
     </w:p>
     <w:p>
@@ -2305,6 +3031,7 @@
           <w:sz w:val="20"/>
           <w:szCs w:val="20"/>
         </w:rPr>
+        <w:lastRenderedPageBreak/>
         <w:t xml:space="preserve">Question 4.4 - Traceroute between your R4 routers loopback and a different groups R4 router loopback. Show me the output. For each router in the path between R5 routers explain how the router knew where to forward it onto next. I'm interested in understanding the routing updates and LSA types flowing along the path. </w:t>
       </w:r>
     </w:p>

</xml_diff>

<commit_message>
Added explination for backbone questions in docx
</commit_message>
<xml_diff>
--- a/lab1/IP_Routing_Lab1.docx
+++ b/lab1/IP_Routing_Lab1.docx
@@ -1798,425 +1798,8 @@
     </w:p>
     <w:p>
       <w:pPr>
-        <w:numPr>
-          <w:ilvl w:val="0"/>
-          <w:numId w:val="5"/>
-        </w:numPr>
-        <w:spacing w:before="100" w:beforeAutospacing="1" w:after="100" w:afterAutospacing="1" w:line="240" w:lineRule="auto"/>
-        <w:rPr>
-          <w:rFonts w:ascii="Courier New" w:eastAsia="Times New Roman" w:hAnsi="Courier New" w:cs="Courier New"/>
-          <w:sz w:val="20"/>
-          <w:szCs w:val="20"/>
-        </w:rPr>
-      </w:pPr>
-      <w:r>
-        <w:rPr>
-          <w:rFonts w:ascii="Courier New" w:eastAsia="Times New Roman" w:hAnsi="Courier New" w:cs="Courier New"/>
-          <w:sz w:val="20"/>
-          <w:szCs w:val="20"/>
-        </w:rPr>
-        <w:t xml:space="preserve">Work with other groups to fix any </w:t>
-      </w:r>
-      <w:proofErr w:type="spellStart"/>
-      <w:r>
-        <w:rPr>
-          <w:rFonts w:ascii="Courier New" w:eastAsia="Times New Roman" w:hAnsi="Courier New" w:cs="Courier New"/>
-          <w:sz w:val="20"/>
-          <w:szCs w:val="20"/>
-        </w:rPr>
-        <w:t>interpod</w:t>
-      </w:r>
-      <w:proofErr w:type="spellEnd"/>
-      <w:r>
-        <w:rPr>
-          <w:rFonts w:ascii="Courier New" w:eastAsia="Times New Roman" w:hAnsi="Courier New" w:cs="Courier New"/>
-          <w:sz w:val="20"/>
-          <w:szCs w:val="20"/>
-        </w:rPr>
-        <w:t xml:space="preserve"> connectivity problems. </w:t>
-      </w:r>
-    </w:p>
-    <w:p>
-      <w:pPr>
-        <w:numPr>
-          <w:ilvl w:val="0"/>
-          <w:numId w:val="5"/>
-        </w:numPr>
-        <w:spacing w:before="100" w:beforeAutospacing="1" w:after="100" w:afterAutospacing="1" w:line="240" w:lineRule="auto"/>
-        <w:rPr>
-          <w:rFonts w:ascii="Courier New" w:eastAsia="Times New Roman" w:hAnsi="Courier New" w:cs="Courier New"/>
-          <w:sz w:val="20"/>
-          <w:szCs w:val="20"/>
-        </w:rPr>
-      </w:pPr>
-      <w:r>
-        <w:rPr>
-          <w:rFonts w:ascii="Courier New" w:eastAsia="Times New Roman" w:hAnsi="Courier New" w:cs="Courier New"/>
-          <w:sz w:val="20"/>
-          <w:szCs w:val="20"/>
-        </w:rPr>
-        <w:t xml:space="preserve">Question 2.7 - Write up a short description of how you fixed any </w:t>
-      </w:r>
-      <w:proofErr w:type="spellStart"/>
-      <w:r>
-        <w:rPr>
-          <w:rFonts w:ascii="Courier New" w:eastAsia="Times New Roman" w:hAnsi="Courier New" w:cs="Courier New"/>
-          <w:sz w:val="20"/>
-          <w:szCs w:val="20"/>
-        </w:rPr>
-        <w:t>interpod</w:t>
-      </w:r>
-      <w:proofErr w:type="spellEnd"/>
-      <w:r>
-        <w:rPr>
-          <w:rFonts w:ascii="Courier New" w:eastAsia="Times New Roman" w:hAnsi="Courier New" w:cs="Courier New"/>
-          <w:sz w:val="20"/>
-          <w:szCs w:val="20"/>
-        </w:rPr>
-        <w:t xml:space="preserve"> connectivity problems. </w:t>
-      </w:r>
-    </w:p>
-    <w:p>
-      <w:pPr>
-        <w:numPr>
-          <w:ilvl w:val="0"/>
-          <w:numId w:val="5"/>
-        </w:numPr>
-        <w:spacing w:before="100" w:beforeAutospacing="1" w:after="100" w:afterAutospacing="1" w:line="240" w:lineRule="auto"/>
-        <w:rPr>
-          <w:rFonts w:ascii="Courier New" w:eastAsia="Times New Roman" w:hAnsi="Courier New" w:cs="Courier New"/>
-          <w:sz w:val="20"/>
-          <w:szCs w:val="20"/>
-        </w:rPr>
-      </w:pPr>
-      <w:r>
-        <w:rPr>
-          <w:rFonts w:ascii="Courier New" w:eastAsia="Times New Roman" w:hAnsi="Courier New" w:cs="Courier New"/>
-          <w:sz w:val="20"/>
-          <w:szCs w:val="20"/>
-        </w:rPr>
-        <w:t xml:space="preserve">Question 2.8 - Write up a short hypothesize on the timeframe for the next instruction using your working knowledge of RIP. </w:t>
-      </w:r>
-    </w:p>
-    <w:p>
-      <w:pPr>
-        <w:numPr>
-          <w:ilvl w:val="0"/>
-          <w:numId w:val="5"/>
-        </w:numPr>
-        <w:spacing w:before="100" w:beforeAutospacing="1" w:after="100" w:afterAutospacing="1" w:line="240" w:lineRule="auto"/>
-        <w:rPr>
-          <w:rFonts w:ascii="Courier New" w:eastAsia="Times New Roman" w:hAnsi="Courier New" w:cs="Courier New"/>
-          <w:sz w:val="20"/>
-          <w:szCs w:val="20"/>
-        </w:rPr>
-      </w:pPr>
-      <w:r>
-        <w:rPr>
-          <w:rFonts w:ascii="Courier New" w:eastAsia="Times New Roman" w:hAnsi="Courier New" w:cs="Courier New"/>
-          <w:sz w:val="20"/>
-          <w:szCs w:val="20"/>
-        </w:rPr>
-        <w:t xml:space="preserve">'Fail' the link between R3 and R5 by unplugging it. How long before R3 can reach R5? Use logging or debug as necessary to understand the sequence of events. </w:t>
-      </w:r>
-    </w:p>
-    <w:p>
-      <w:pPr>
-        <w:numPr>
-          <w:ilvl w:val="0"/>
-          <w:numId w:val="5"/>
-        </w:numPr>
-        <w:spacing w:before="100" w:beforeAutospacing="1" w:after="100" w:afterAutospacing="1" w:line="240" w:lineRule="auto"/>
-        <w:rPr>
-          <w:rFonts w:ascii="Courier New" w:eastAsia="Times New Roman" w:hAnsi="Courier New" w:cs="Courier New"/>
-          <w:sz w:val="20"/>
-          <w:szCs w:val="20"/>
-        </w:rPr>
-      </w:pPr>
-      <w:r>
-        <w:rPr>
-          <w:rFonts w:ascii="Courier New" w:eastAsia="Times New Roman" w:hAnsi="Courier New" w:cs="Courier New"/>
-          <w:sz w:val="20"/>
-          <w:szCs w:val="20"/>
-        </w:rPr>
-        <w:t xml:space="preserve">Question 2.9 - Show and explain the actual timeframe using your logs for support. Explain any difference from your hypothesis. </w:t>
-      </w:r>
-    </w:p>
-    <w:p>
-      <w:pPr>
-        <w:numPr>
-          <w:ilvl w:val="0"/>
-          <w:numId w:val="5"/>
-        </w:numPr>
-        <w:spacing w:before="100" w:beforeAutospacing="1" w:after="100" w:afterAutospacing="1" w:line="240" w:lineRule="auto"/>
-        <w:rPr>
-          <w:rFonts w:ascii="Courier New" w:eastAsia="Times New Roman" w:hAnsi="Courier New" w:cs="Courier New"/>
-          <w:sz w:val="20"/>
-          <w:szCs w:val="20"/>
-        </w:rPr>
-      </w:pPr>
-      <w:r>
-        <w:rPr>
-          <w:rFonts w:ascii="Courier New" w:eastAsia="Times New Roman" w:hAnsi="Courier New" w:cs="Courier New"/>
-          <w:sz w:val="20"/>
-          <w:szCs w:val="20"/>
-        </w:rPr>
-        <w:t xml:space="preserve">Plug the link back in and wait for the network to converge. </w:t>
-      </w:r>
-    </w:p>
-    <w:p>
-      <w:pPr>
-        <w:numPr>
-          <w:ilvl w:val="0"/>
-          <w:numId w:val="5"/>
-        </w:numPr>
-        <w:spacing w:before="100" w:beforeAutospacing="1" w:after="100" w:afterAutospacing="1" w:line="240" w:lineRule="auto"/>
-        <w:rPr>
-          <w:rFonts w:ascii="Courier New" w:eastAsia="Times New Roman" w:hAnsi="Courier New" w:cs="Courier New"/>
-          <w:sz w:val="20"/>
-          <w:szCs w:val="20"/>
-        </w:rPr>
-      </w:pPr>
-      <w:r>
-        <w:rPr>
-          <w:rFonts w:ascii="Courier New" w:eastAsia="Times New Roman" w:hAnsi="Courier New" w:cs="Courier New"/>
-          <w:sz w:val="20"/>
-          <w:szCs w:val="20"/>
-        </w:rPr>
-        <w:t xml:space="preserve">Question 2.10 - Write up a short hypothesize on the timeframe for the next instruction using your working knowledge of RIP. </w:t>
-      </w:r>
-    </w:p>
-    <w:p>
-      <w:pPr>
-        <w:numPr>
-          <w:ilvl w:val="0"/>
-          <w:numId w:val="5"/>
-        </w:numPr>
-        <w:spacing w:before="100" w:beforeAutospacing="1" w:after="100" w:afterAutospacing="1" w:line="240" w:lineRule="auto"/>
-        <w:rPr>
-          <w:rFonts w:ascii="Courier New" w:eastAsia="Times New Roman" w:hAnsi="Courier New" w:cs="Courier New"/>
-          <w:sz w:val="20"/>
-          <w:szCs w:val="20"/>
-        </w:rPr>
-      </w:pPr>
-      <w:r>
-        <w:rPr>
-          <w:rFonts w:ascii="Courier New" w:eastAsia="Times New Roman" w:hAnsi="Courier New" w:cs="Courier New"/>
-          <w:sz w:val="20"/>
-          <w:szCs w:val="20"/>
-        </w:rPr>
-        <w:t xml:space="preserve">On the subnet 2 switch, move R3's subnet 2 interface into a new VLAN. How long before R3 can reach R4? </w:t>
-      </w:r>
-    </w:p>
-    <w:p>
-      <w:pPr>
-        <w:numPr>
-          <w:ilvl w:val="0"/>
-          <w:numId w:val="5"/>
-        </w:numPr>
-        <w:spacing w:before="100" w:beforeAutospacing="1" w:after="100" w:afterAutospacing="1" w:line="240" w:lineRule="auto"/>
-        <w:rPr>
-          <w:rFonts w:ascii="Courier New" w:eastAsia="Times New Roman" w:hAnsi="Courier New" w:cs="Courier New"/>
-          <w:sz w:val="20"/>
-          <w:szCs w:val="20"/>
-        </w:rPr>
-      </w:pPr>
-      <w:r>
-        <w:rPr>
-          <w:rFonts w:ascii="Courier New" w:eastAsia="Times New Roman" w:hAnsi="Courier New" w:cs="Courier New"/>
-          <w:sz w:val="20"/>
-          <w:szCs w:val="20"/>
-        </w:rPr>
-        <w:t xml:space="preserve">Question 2.11 - Show and explain the actual timeframe using your logs for support. Explain any difference from your hypothesis. </w:t>
-      </w:r>
-    </w:p>
-    <w:p>
-      <w:pPr>
-        <w:numPr>
-          <w:ilvl w:val="0"/>
-          <w:numId w:val="5"/>
-        </w:numPr>
-        <w:spacing w:before="100" w:beforeAutospacing="1" w:after="100" w:afterAutospacing="1" w:line="240" w:lineRule="auto"/>
-        <w:rPr>
-          <w:rFonts w:ascii="Courier New" w:eastAsia="Times New Roman" w:hAnsi="Courier New" w:cs="Courier New"/>
-          <w:sz w:val="20"/>
-          <w:szCs w:val="20"/>
-        </w:rPr>
-      </w:pPr>
-      <w:r>
-        <w:rPr>
-          <w:rFonts w:ascii="Courier New" w:eastAsia="Times New Roman" w:hAnsi="Courier New" w:cs="Courier New"/>
-          <w:sz w:val="20"/>
-          <w:szCs w:val="20"/>
-        </w:rPr>
-        <w:t xml:space="preserve">Fix the VLAN mismatch </w:t>
-      </w:r>
-    </w:p>
-    <w:p>
-      <w:pPr>
-        <w:numPr>
-          <w:ilvl w:val="0"/>
-          <w:numId w:val="5"/>
-        </w:numPr>
-        <w:spacing w:before="100" w:beforeAutospacing="1" w:after="100" w:afterAutospacing="1" w:line="240" w:lineRule="auto"/>
-        <w:rPr>
-          <w:rFonts w:ascii="Courier New" w:eastAsia="Times New Roman" w:hAnsi="Courier New" w:cs="Courier New"/>
-          <w:sz w:val="20"/>
-          <w:szCs w:val="20"/>
-        </w:rPr>
-      </w:pPr>
-      <w:r>
-        <w:rPr>
-          <w:rFonts w:ascii="Courier New" w:eastAsia="Times New Roman" w:hAnsi="Courier New" w:cs="Courier New"/>
-          <w:sz w:val="20"/>
-          <w:szCs w:val="20"/>
-        </w:rPr>
-        <w:t xml:space="preserve">Question 2.12 - Write up a short hypothesize on the timeframe for the next instruction using your working knowledge of RIP. </w:t>
-      </w:r>
-    </w:p>
-    <w:p>
-      <w:pPr>
-        <w:numPr>
-          <w:ilvl w:val="0"/>
-          <w:numId w:val="5"/>
-        </w:numPr>
-        <w:spacing w:before="100" w:beforeAutospacing="1" w:after="100" w:afterAutospacing="1" w:line="240" w:lineRule="auto"/>
-        <w:rPr>
-          <w:rFonts w:ascii="Courier New" w:eastAsia="Times New Roman" w:hAnsi="Courier New" w:cs="Courier New"/>
-          <w:sz w:val="20"/>
-          <w:szCs w:val="20"/>
-        </w:rPr>
-      </w:pPr>
-      <w:r>
-        <w:rPr>
-          <w:rFonts w:ascii="Courier New" w:eastAsia="Times New Roman" w:hAnsi="Courier New" w:cs="Courier New"/>
-          <w:sz w:val="20"/>
-          <w:szCs w:val="20"/>
-        </w:rPr>
-        <w:t xml:space="preserve">'Fail' R3 by unplugging it. How long before R4 can reach R5? Use logging or debug as necessary to understand the sequence of events. </w:t>
-      </w:r>
-    </w:p>
-    <w:p>
-      <w:pPr>
-        <w:numPr>
-          <w:ilvl w:val="0"/>
-          <w:numId w:val="5"/>
-        </w:numPr>
-        <w:spacing w:before="100" w:beforeAutospacing="1" w:after="100" w:afterAutospacing="1" w:line="240" w:lineRule="auto"/>
-        <w:rPr>
-          <w:rFonts w:ascii="Courier New" w:eastAsia="Times New Roman" w:hAnsi="Courier New" w:cs="Courier New"/>
-          <w:sz w:val="20"/>
-          <w:szCs w:val="20"/>
-        </w:rPr>
-      </w:pPr>
-      <w:r>
-        <w:rPr>
-          <w:rFonts w:ascii="Courier New" w:eastAsia="Times New Roman" w:hAnsi="Courier New" w:cs="Courier New"/>
-          <w:sz w:val="20"/>
-          <w:szCs w:val="20"/>
-        </w:rPr>
-        <w:t xml:space="preserve">Question 2.13 - Show and explain the actual timeframe using your logs for support. Explain any difference from your hypothesis. </w:t>
-      </w:r>
-    </w:p>
-    <w:p>
-      <w:pPr>
-        <w:numPr>
-          <w:ilvl w:val="0"/>
-          <w:numId w:val="5"/>
-        </w:numPr>
-        <w:spacing w:before="100" w:beforeAutospacing="1" w:after="100" w:afterAutospacing="1" w:line="240" w:lineRule="auto"/>
-        <w:rPr>
-          <w:rFonts w:ascii="Courier New" w:eastAsia="Times New Roman" w:hAnsi="Courier New" w:cs="Courier New"/>
-          <w:sz w:val="20"/>
-          <w:szCs w:val="20"/>
-        </w:rPr>
-      </w:pPr>
-      <w:r>
-        <w:rPr>
-          <w:rFonts w:ascii="Courier New" w:eastAsia="Times New Roman" w:hAnsi="Courier New" w:cs="Courier New"/>
-          <w:sz w:val="20"/>
-          <w:szCs w:val="20"/>
-        </w:rPr>
-        <w:t xml:space="preserve">Continue observations, power R3 back on and wait for the network to converge. </w:t>
-      </w:r>
-    </w:p>
-    <w:p>
-      <w:pPr>
-        <w:numPr>
-          <w:ilvl w:val="0"/>
-          <w:numId w:val="5"/>
-        </w:numPr>
-        <w:spacing w:before="100" w:beforeAutospacing="1" w:after="100" w:afterAutospacing="1" w:line="240" w:lineRule="auto"/>
-        <w:rPr>
-          <w:rFonts w:ascii="Courier New" w:eastAsia="Times New Roman" w:hAnsi="Courier New" w:cs="Courier New"/>
-          <w:sz w:val="20"/>
-          <w:szCs w:val="20"/>
-        </w:rPr>
-      </w:pPr>
-      <w:r>
-        <w:rPr>
-          <w:rFonts w:ascii="Courier New" w:eastAsia="Times New Roman" w:hAnsi="Courier New" w:cs="Courier New"/>
-          <w:sz w:val="20"/>
-          <w:szCs w:val="20"/>
-        </w:rPr>
-        <w:t xml:space="preserve">Question 2.14 - Any impact as R3 joins the topology? </w:t>
-      </w:r>
-    </w:p>
-    <w:p>
-      <w:pPr>
-        <w:numPr>
-          <w:ilvl w:val="0"/>
-          <w:numId w:val="5"/>
-        </w:numPr>
-        <w:spacing w:before="100" w:beforeAutospacing="1" w:after="100" w:afterAutospacing="1" w:line="240" w:lineRule="auto"/>
-        <w:rPr>
-          <w:rFonts w:ascii="Courier New" w:eastAsia="Times New Roman" w:hAnsi="Courier New" w:cs="Courier New"/>
-          <w:sz w:val="20"/>
-          <w:szCs w:val="20"/>
-        </w:rPr>
-      </w:pPr>
-      <w:r>
-        <w:rPr>
-          <w:rFonts w:ascii="Courier New" w:eastAsia="Times New Roman" w:hAnsi="Courier New" w:cs="Courier New"/>
-          <w:sz w:val="20"/>
-          <w:szCs w:val="20"/>
-        </w:rPr>
-        <w:t xml:space="preserve">Question 2.15 - Explain the difference if any between the three failure and one recovery scenario. </w:t>
-      </w:r>
-    </w:p>
-    <w:p>
-      <w:pPr>
-        <w:numPr>
-          <w:ilvl w:val="0"/>
-          <w:numId w:val="5"/>
-        </w:numPr>
-        <w:spacing w:before="100" w:beforeAutospacing="1" w:after="100" w:afterAutospacing="1" w:line="240" w:lineRule="auto"/>
-        <w:rPr>
-          <w:rFonts w:ascii="Courier New" w:eastAsia="Times New Roman" w:hAnsi="Courier New" w:cs="Courier New"/>
-          <w:sz w:val="20"/>
-          <w:szCs w:val="20"/>
-        </w:rPr>
-      </w:pPr>
-      <w:r>
-        <w:rPr>
-          <w:rFonts w:ascii="Courier New" w:eastAsia="Times New Roman" w:hAnsi="Courier New" w:cs="Courier New"/>
-          <w:sz w:val="20"/>
-          <w:szCs w:val="20"/>
-        </w:rPr>
-        <w:lastRenderedPageBreak/>
-        <w:t xml:space="preserve">Question 2.16 - How did you test the convergence times across these scenarios? Discuss the positives and negatives of this test method. </w:t>
-      </w:r>
-    </w:p>
-    <w:p>
-      <w:pPr>
-        <w:spacing w:before="100" w:beforeAutospacing="1" w:after="100" w:afterAutospacing="1" w:line="240" w:lineRule="auto"/>
-        <w:rPr>
-          <w:rFonts w:ascii="Courier New" w:eastAsia="Times New Roman" w:hAnsi="Courier New" w:cs="Courier New"/>
-          <w:sz w:val="20"/>
-          <w:szCs w:val="20"/>
-        </w:rPr>
-      </w:pPr>
-      <w:r>
+        <w:spacing w:before="100" w:beforeAutospacing="1" w:after="100" w:afterAutospacing="1" w:line="240" w:lineRule="auto"/>
+        <w:ind w:left="720"/>
         <w:rPr>
           <w:rFonts w:ascii="Courier New" w:eastAsia="Times New Roman" w:hAnsi="Courier New" w:cs="Courier New"/>
           <w:b/>
@@ -2224,6 +1807,711 @@
           <w:sz w:val="20"/>
           <w:szCs w:val="20"/>
         </w:rPr>
+      </w:pPr>
+      <w:r>
+        <w:rPr>
+          <w:rFonts w:ascii="Courier New" w:eastAsia="Times New Roman" w:hAnsi="Courier New" w:cs="Courier New"/>
+          <w:b/>
+          <w:bCs/>
+          <w:sz w:val="20"/>
+          <w:szCs w:val="20"/>
+        </w:rPr>
+        <w:t xml:space="preserve">We can reach other groups, because they have RIPv2 </w:t>
+      </w:r>
+      <w:proofErr w:type="gramStart"/>
+      <w:r>
+        <w:rPr>
+          <w:rFonts w:ascii="Courier New" w:eastAsia="Times New Roman" w:hAnsi="Courier New" w:cs="Courier New"/>
+          <w:b/>
+          <w:bCs/>
+          <w:sz w:val="20"/>
+          <w:szCs w:val="20"/>
+        </w:rPr>
+        <w:t>enable</w:t>
+      </w:r>
+      <w:proofErr w:type="gramEnd"/>
+      <w:r>
+        <w:rPr>
+          <w:rFonts w:ascii="Courier New" w:eastAsia="Times New Roman" w:hAnsi="Courier New" w:cs="Courier New"/>
+          <w:b/>
+          <w:bCs/>
+          <w:sz w:val="20"/>
+          <w:szCs w:val="20"/>
+        </w:rPr>
+        <w:t xml:space="preserve"> and we are advertising RIPv2 on backbone network as well. Please look at the screenshot below.</w:t>
+      </w:r>
+    </w:p>
+    <w:p>
+      <w:pPr>
+        <w:spacing w:before="100" w:beforeAutospacing="1" w:after="100" w:afterAutospacing="1" w:line="240" w:lineRule="auto"/>
+        <w:ind w:left="720"/>
+        <w:rPr>
+          <w:rFonts w:ascii="Courier New" w:eastAsia="Times New Roman" w:hAnsi="Courier New" w:cs="Courier New"/>
+          <w:sz w:val="20"/>
+          <w:szCs w:val="20"/>
+        </w:rPr>
+      </w:pPr>
+      <w:r>
+        <w:rPr>
+          <w:rFonts w:ascii="Courier New" w:eastAsia="Times New Roman" w:hAnsi="Courier New" w:cs="Courier New"/>
+          <w:noProof/>
+          <w:sz w:val="20"/>
+          <w:szCs w:val="20"/>
+        </w:rPr>
+        <w:drawing>
+          <wp:inline distT="0" distB="0" distL="0" distR="0" wp14:anchorId="07C231DB" wp14:editId="0F075CFD">
+            <wp:extent cx="5943600" cy="3510915"/>
+            <wp:effectExtent l="0" t="0" r="0" b="0"/>
+            <wp:docPr id="1357850157" name="Picture 1" descr="A screenshot of a computer program&#10;&#10;AI-generated content may be incorrect."/>
+            <wp:cNvGraphicFramePr>
+              <a:graphicFrameLocks xmlns:a="http://schemas.openxmlformats.org/drawingml/2006/main" noChangeAspect="1"/>
+            </wp:cNvGraphicFramePr>
+            <a:graphic xmlns:a="http://schemas.openxmlformats.org/drawingml/2006/main">
+              <a:graphicData uri="http://schemas.openxmlformats.org/drawingml/2006/picture">
+                <pic:pic xmlns:pic="http://schemas.openxmlformats.org/drawingml/2006/picture">
+                  <pic:nvPicPr>
+                    <pic:cNvPr id="1357850157" name="Picture 1" descr="A screenshot of a computer program&#10;&#10;AI-generated content may be incorrect."/>
+                    <pic:cNvPicPr/>
+                  </pic:nvPicPr>
+                  <pic:blipFill>
+                    <a:blip r:embed="rId15">
+                      <a:extLst>
+                        <a:ext uri="{28A0092B-C50C-407E-A947-70E740481C1C}">
+                          <a14:useLocalDpi xmlns:a14="http://schemas.microsoft.com/office/drawing/2010/main" val="0"/>
+                        </a:ext>
+                      </a:extLst>
+                    </a:blip>
+                    <a:stretch>
+                      <a:fillRect/>
+                    </a:stretch>
+                  </pic:blipFill>
+                  <pic:spPr>
+                    <a:xfrm>
+                      <a:off x="0" y="0"/>
+                      <a:ext cx="5943600" cy="3510915"/>
+                    </a:xfrm>
+                    <a:prstGeom prst="rect">
+                      <a:avLst/>
+                    </a:prstGeom>
+                  </pic:spPr>
+                </pic:pic>
+              </a:graphicData>
+            </a:graphic>
+          </wp:inline>
+        </w:drawing>
+      </w:r>
+    </w:p>
+    <w:p>
+      <w:pPr>
+        <w:spacing w:before="100" w:beforeAutospacing="1" w:after="100" w:afterAutospacing="1" w:line="240" w:lineRule="auto"/>
+        <w:ind w:left="720"/>
+        <w:rPr>
+          <w:rFonts w:ascii="Courier New" w:eastAsia="Times New Roman" w:hAnsi="Courier New" w:cs="Courier New"/>
+          <w:sz w:val="20"/>
+          <w:szCs w:val="20"/>
+        </w:rPr>
+      </w:pPr>
+    </w:p>
+    <w:p>
+      <w:pPr>
+        <w:spacing w:before="100" w:beforeAutospacing="1" w:after="100" w:afterAutospacing="1" w:line="240" w:lineRule="auto"/>
+        <w:ind w:left="720"/>
+        <w:rPr>
+          <w:rFonts w:ascii="Courier New" w:eastAsia="Times New Roman" w:hAnsi="Courier New" w:cs="Courier New"/>
+          <w:sz w:val="20"/>
+          <w:szCs w:val="20"/>
+        </w:rPr>
+      </w:pPr>
+      <w:r>
+        <w:rPr>
+          <w:rFonts w:ascii="Courier New" w:eastAsia="Times New Roman" w:hAnsi="Courier New" w:cs="Courier New"/>
+          <w:b/>
+          <w:bCs/>
+          <w:sz w:val="20"/>
+          <w:szCs w:val="20"/>
+        </w:rPr>
+        <w:lastRenderedPageBreak/>
+        <w:t>Pinging Group 1</w:t>
+      </w:r>
+      <w:r>
+        <w:rPr>
+          <w:rFonts w:ascii="Courier New" w:eastAsia="Times New Roman" w:hAnsi="Courier New" w:cs="Courier New"/>
+          <w:sz w:val="20"/>
+          <w:szCs w:val="20"/>
+        </w:rPr>
+        <w:br/>
+      </w:r>
+      <w:r>
+        <w:rPr>
+          <w:rFonts w:ascii="Courier New" w:eastAsia="Times New Roman" w:hAnsi="Courier New" w:cs="Courier New"/>
+          <w:noProof/>
+          <w:sz w:val="20"/>
+          <w:szCs w:val="20"/>
+        </w:rPr>
+        <w:drawing>
+          <wp:inline distT="0" distB="0" distL="0" distR="0" wp14:anchorId="1606A2BB" wp14:editId="40D743A6">
+            <wp:extent cx="5943600" cy="1126490"/>
+            <wp:effectExtent l="0" t="0" r="0" b="3810"/>
+            <wp:docPr id="54046589" name="Picture 2" descr="A screenshot of a computer&#10;&#10;AI-generated content may be incorrect."/>
+            <wp:cNvGraphicFramePr>
+              <a:graphicFrameLocks xmlns:a="http://schemas.openxmlformats.org/drawingml/2006/main" noChangeAspect="1"/>
+            </wp:cNvGraphicFramePr>
+            <a:graphic xmlns:a="http://schemas.openxmlformats.org/drawingml/2006/main">
+              <a:graphicData uri="http://schemas.openxmlformats.org/drawingml/2006/picture">
+                <pic:pic xmlns:pic="http://schemas.openxmlformats.org/drawingml/2006/picture">
+                  <pic:nvPicPr>
+                    <pic:cNvPr id="54046589" name="Picture 2" descr="A screenshot of a computer&#10;&#10;AI-generated content may be incorrect."/>
+                    <pic:cNvPicPr/>
+                  </pic:nvPicPr>
+                  <pic:blipFill>
+                    <a:blip r:embed="rId16">
+                      <a:extLst>
+                        <a:ext uri="{28A0092B-C50C-407E-A947-70E740481C1C}">
+                          <a14:useLocalDpi xmlns:a14="http://schemas.microsoft.com/office/drawing/2010/main" val="0"/>
+                        </a:ext>
+                      </a:extLst>
+                    </a:blip>
+                    <a:stretch>
+                      <a:fillRect/>
+                    </a:stretch>
+                  </pic:blipFill>
+                  <pic:spPr>
+                    <a:xfrm>
+                      <a:off x="0" y="0"/>
+                      <a:ext cx="5943600" cy="1126490"/>
+                    </a:xfrm>
+                    <a:prstGeom prst="rect">
+                      <a:avLst/>
+                    </a:prstGeom>
+                  </pic:spPr>
+                </pic:pic>
+              </a:graphicData>
+            </a:graphic>
+          </wp:inline>
+        </w:drawing>
+      </w:r>
+    </w:p>
+    <w:p>
+      <w:pPr>
+        <w:numPr>
+          <w:ilvl w:val="0"/>
+          <w:numId w:val="5"/>
+        </w:numPr>
+        <w:spacing w:before="100" w:beforeAutospacing="1" w:after="100" w:afterAutospacing="1" w:line="240" w:lineRule="auto"/>
+        <w:rPr>
+          <w:rFonts w:ascii="Courier New" w:eastAsia="Times New Roman" w:hAnsi="Courier New" w:cs="Courier New"/>
+          <w:sz w:val="20"/>
+          <w:szCs w:val="20"/>
+        </w:rPr>
+      </w:pPr>
+      <w:r>
+        <w:rPr>
+          <w:rFonts w:ascii="Courier New" w:eastAsia="Times New Roman" w:hAnsi="Courier New" w:cs="Courier New"/>
+          <w:sz w:val="20"/>
+          <w:szCs w:val="20"/>
+        </w:rPr>
+        <w:t xml:space="preserve">Work with other groups to fix any </w:t>
+      </w:r>
+      <w:proofErr w:type="spellStart"/>
+      <w:r>
+        <w:rPr>
+          <w:rFonts w:ascii="Courier New" w:eastAsia="Times New Roman" w:hAnsi="Courier New" w:cs="Courier New"/>
+          <w:sz w:val="20"/>
+          <w:szCs w:val="20"/>
+        </w:rPr>
+        <w:t>interpod</w:t>
+      </w:r>
+      <w:proofErr w:type="spellEnd"/>
+      <w:r>
+        <w:rPr>
+          <w:rFonts w:ascii="Courier New" w:eastAsia="Times New Roman" w:hAnsi="Courier New" w:cs="Courier New"/>
+          <w:sz w:val="20"/>
+          <w:szCs w:val="20"/>
+        </w:rPr>
+        <w:t xml:space="preserve"> connectivity problems. </w:t>
+      </w:r>
+      <w:r>
+        <w:rPr>
+          <w:rFonts w:ascii="Courier New" w:eastAsia="Times New Roman" w:hAnsi="Courier New" w:cs="Courier New"/>
+          <w:sz w:val="20"/>
+          <w:szCs w:val="20"/>
+        </w:rPr>
+        <w:br/>
+      </w:r>
+    </w:p>
+    <w:p>
+      <w:pPr>
+        <w:numPr>
+          <w:ilvl w:val="0"/>
+          <w:numId w:val="5"/>
+        </w:numPr>
+        <w:spacing w:before="100" w:beforeAutospacing="1" w:after="100" w:afterAutospacing="1" w:line="240" w:lineRule="auto"/>
+        <w:rPr>
+          <w:rFonts w:ascii="Courier New" w:eastAsia="Times New Roman" w:hAnsi="Courier New" w:cs="Courier New"/>
+          <w:sz w:val="20"/>
+          <w:szCs w:val="20"/>
+        </w:rPr>
+      </w:pPr>
+      <w:r>
+        <w:rPr>
+          <w:rFonts w:ascii="Courier New" w:eastAsia="Times New Roman" w:hAnsi="Courier New" w:cs="Courier New"/>
+          <w:sz w:val="20"/>
+          <w:szCs w:val="20"/>
+        </w:rPr>
+        <w:t xml:space="preserve">Question 2.7 - Write up a short description of how you fixed any </w:t>
+      </w:r>
+      <w:proofErr w:type="spellStart"/>
+      <w:r>
+        <w:rPr>
+          <w:rFonts w:ascii="Courier New" w:eastAsia="Times New Roman" w:hAnsi="Courier New" w:cs="Courier New"/>
+          <w:sz w:val="20"/>
+          <w:szCs w:val="20"/>
+        </w:rPr>
+        <w:t>interpod</w:t>
+      </w:r>
+      <w:proofErr w:type="spellEnd"/>
+      <w:r>
+        <w:rPr>
+          <w:rFonts w:ascii="Courier New" w:eastAsia="Times New Roman" w:hAnsi="Courier New" w:cs="Courier New"/>
+          <w:sz w:val="20"/>
+          <w:szCs w:val="20"/>
+        </w:rPr>
+        <w:t xml:space="preserve"> connectivity problems.</w:t>
+      </w:r>
+      <w:r>
+        <w:rPr>
+          <w:rFonts w:ascii="Courier New" w:eastAsia="Times New Roman" w:hAnsi="Courier New" w:cs="Courier New"/>
+          <w:sz w:val="20"/>
+          <w:szCs w:val="20"/>
+        </w:rPr>
+        <w:br/>
+      </w:r>
+      <w:r>
+        <w:rPr>
+          <w:rFonts w:ascii="Courier New" w:eastAsia="Times New Roman" w:hAnsi="Courier New" w:cs="Courier New"/>
+          <w:sz w:val="20"/>
+          <w:szCs w:val="20"/>
+        </w:rPr>
+        <w:br/>
+      </w:r>
+      <w:r>
+        <w:rPr>
+          <w:rFonts w:ascii="Courier New" w:eastAsia="Times New Roman" w:hAnsi="Courier New" w:cs="Courier New"/>
+          <w:b/>
+          <w:bCs/>
+          <w:sz w:val="20"/>
+          <w:szCs w:val="20"/>
+        </w:rPr>
+        <w:t>We did not face any connectivity issues with any groups that had RIP enabled on the backbone.</w:t>
+      </w:r>
+      <w:r>
+        <w:rPr>
+          <w:rFonts w:ascii="Courier New" w:eastAsia="Times New Roman" w:hAnsi="Courier New" w:cs="Courier New"/>
+          <w:b/>
+          <w:bCs/>
+          <w:sz w:val="20"/>
+          <w:szCs w:val="20"/>
+        </w:rPr>
+        <w:br/>
+      </w:r>
+      <w:r>
+        <w:rPr>
+          <w:rFonts w:ascii="Courier New" w:eastAsia="Times New Roman" w:hAnsi="Courier New" w:cs="Courier New"/>
+          <w:sz w:val="20"/>
+          <w:szCs w:val="20"/>
+        </w:rPr>
+        <w:t xml:space="preserve"> </w:t>
+      </w:r>
+    </w:p>
+    <w:p>
+      <w:pPr>
+        <w:numPr>
+          <w:ilvl w:val="0"/>
+          <w:numId w:val="5"/>
+        </w:numPr>
+        <w:spacing w:before="100" w:beforeAutospacing="1" w:after="100" w:afterAutospacing="1" w:line="240" w:lineRule="auto"/>
+        <w:rPr>
+          <w:rFonts w:ascii="Courier New" w:eastAsia="Times New Roman" w:hAnsi="Courier New" w:cs="Courier New"/>
+          <w:sz w:val="20"/>
+          <w:szCs w:val="20"/>
+        </w:rPr>
+      </w:pPr>
+      <w:r>
+        <w:rPr>
+          <w:rFonts w:ascii="Courier New" w:eastAsia="Times New Roman" w:hAnsi="Courier New" w:cs="Courier New"/>
+          <w:sz w:val="20"/>
+          <w:szCs w:val="20"/>
+        </w:rPr>
+        <w:t xml:space="preserve">Question 2.8 - Write up a short hypothesize on the timeframe for the next instruction using your working knowledge of RIP. </w:t>
+      </w:r>
+      <w:r>
+        <w:rPr>
+          <w:rFonts w:ascii="Courier New" w:eastAsia="Times New Roman" w:hAnsi="Courier New" w:cs="Courier New"/>
+          <w:sz w:val="20"/>
+          <w:szCs w:val="20"/>
+        </w:rPr>
+        <w:br/>
+      </w:r>
+    </w:p>
+    <w:p>
+      <w:pPr>
+        <w:spacing w:before="100" w:beforeAutospacing="1" w:after="100" w:afterAutospacing="1" w:line="240" w:lineRule="auto"/>
+        <w:ind w:left="720"/>
+        <w:rPr>
+          <w:rFonts w:ascii="Courier New" w:eastAsia="Times New Roman" w:hAnsi="Courier New" w:cs="Courier New"/>
+          <w:b/>
+          <w:bCs/>
+          <w:sz w:val="20"/>
+          <w:szCs w:val="20"/>
+        </w:rPr>
+      </w:pPr>
+      <w:r>
+        <w:rPr>
+          <w:rFonts w:ascii="Courier New" w:eastAsia="Times New Roman" w:hAnsi="Courier New" w:cs="Courier New"/>
+          <w:b/>
+          <w:bCs/>
+          <w:sz w:val="20"/>
+          <w:szCs w:val="20"/>
+        </w:rPr>
+        <w:t>We hypothesize based on our knowledge of RIP that if the link between R3 and R5 fails then it should take less than 20 seconds for R1 to learn about R5 via the backbone network.</w:t>
+      </w:r>
+      <w:r>
+        <w:rPr>
+          <w:rFonts w:ascii="Courier New" w:eastAsia="Times New Roman" w:hAnsi="Courier New" w:cs="Courier New"/>
+          <w:b/>
+          <w:bCs/>
+          <w:sz w:val="20"/>
+          <w:szCs w:val="20"/>
+        </w:rPr>
+        <w:br/>
+      </w:r>
+    </w:p>
+    <w:p>
+      <w:pPr>
+        <w:numPr>
+          <w:ilvl w:val="0"/>
+          <w:numId w:val="5"/>
+        </w:numPr>
+        <w:spacing w:before="100" w:beforeAutospacing="1" w:after="100" w:afterAutospacing="1" w:line="240" w:lineRule="auto"/>
+        <w:rPr>
+          <w:rFonts w:ascii="Courier New" w:eastAsia="Times New Roman" w:hAnsi="Courier New" w:cs="Courier New"/>
+          <w:sz w:val="20"/>
+          <w:szCs w:val="20"/>
+        </w:rPr>
+      </w:pPr>
+      <w:r>
+        <w:rPr>
+          <w:rFonts w:ascii="Courier New" w:eastAsia="Times New Roman" w:hAnsi="Courier New" w:cs="Courier New"/>
+          <w:sz w:val="20"/>
+          <w:szCs w:val="20"/>
+        </w:rPr>
+        <w:t xml:space="preserve">'Fail' the link between R3 and R5 by unplugging it. How long before R3 can reach R5? Use logging or debug as necessary to understand the sequence of events. </w:t>
+      </w:r>
+    </w:p>
+    <w:p>
+      <w:pPr>
+        <w:numPr>
+          <w:ilvl w:val="0"/>
+          <w:numId w:val="5"/>
+        </w:numPr>
+        <w:spacing w:before="100" w:beforeAutospacing="1" w:after="100" w:afterAutospacing="1" w:line="240" w:lineRule="auto"/>
+        <w:rPr>
+          <w:rFonts w:ascii="Courier New" w:eastAsia="Times New Roman" w:hAnsi="Courier New" w:cs="Courier New"/>
+          <w:sz w:val="20"/>
+          <w:szCs w:val="20"/>
+        </w:rPr>
+      </w:pPr>
+      <w:r>
+        <w:rPr>
+          <w:rFonts w:ascii="Courier New" w:eastAsia="Times New Roman" w:hAnsi="Courier New" w:cs="Courier New"/>
+          <w:sz w:val="20"/>
+          <w:szCs w:val="20"/>
+        </w:rPr>
+        <w:t xml:space="preserve">Question 2.9 - Show and explain the actual timeframe using your logs for support. Explain any difference from your hypothesis. </w:t>
+      </w:r>
+    </w:p>
+    <w:p>
+      <w:pPr>
+        <w:numPr>
+          <w:ilvl w:val="0"/>
+          <w:numId w:val="5"/>
+        </w:numPr>
+        <w:spacing w:before="100" w:beforeAutospacing="1" w:after="100" w:afterAutospacing="1" w:line="240" w:lineRule="auto"/>
+        <w:rPr>
+          <w:rFonts w:ascii="Courier New" w:eastAsia="Times New Roman" w:hAnsi="Courier New" w:cs="Courier New"/>
+          <w:sz w:val="20"/>
+          <w:szCs w:val="20"/>
+        </w:rPr>
+      </w:pPr>
+      <w:r>
+        <w:rPr>
+          <w:rFonts w:ascii="Courier New" w:eastAsia="Times New Roman" w:hAnsi="Courier New" w:cs="Courier New"/>
+          <w:sz w:val="20"/>
+          <w:szCs w:val="20"/>
+        </w:rPr>
+        <w:t xml:space="preserve">Plug the link back in and wait for the network to converge. </w:t>
+      </w:r>
+    </w:p>
+    <w:p>
+      <w:pPr>
+        <w:numPr>
+          <w:ilvl w:val="0"/>
+          <w:numId w:val="5"/>
+        </w:numPr>
+        <w:spacing w:before="100" w:beforeAutospacing="1" w:after="100" w:afterAutospacing="1" w:line="240" w:lineRule="auto"/>
+        <w:rPr>
+          <w:rFonts w:ascii="Courier New" w:eastAsia="Times New Roman" w:hAnsi="Courier New" w:cs="Courier New"/>
+          <w:sz w:val="20"/>
+          <w:szCs w:val="20"/>
+        </w:rPr>
+      </w:pPr>
+      <w:r>
+        <w:rPr>
+          <w:rFonts w:ascii="Courier New" w:eastAsia="Times New Roman" w:hAnsi="Courier New" w:cs="Courier New"/>
+          <w:sz w:val="20"/>
+          <w:szCs w:val="20"/>
+        </w:rPr>
+        <w:t xml:space="preserve">Question 2.10 - Write up a short hypothesize on the timeframe for the next instruction using your working knowledge of RIP. </w:t>
+      </w:r>
+    </w:p>
+    <w:p>
+      <w:pPr>
+        <w:numPr>
+          <w:ilvl w:val="0"/>
+          <w:numId w:val="5"/>
+        </w:numPr>
+        <w:spacing w:before="100" w:beforeAutospacing="1" w:after="100" w:afterAutospacing="1" w:line="240" w:lineRule="auto"/>
+        <w:rPr>
+          <w:rFonts w:ascii="Courier New" w:eastAsia="Times New Roman" w:hAnsi="Courier New" w:cs="Courier New"/>
+          <w:sz w:val="20"/>
+          <w:szCs w:val="20"/>
+        </w:rPr>
+      </w:pPr>
+      <w:r>
+        <w:rPr>
+          <w:rFonts w:ascii="Courier New" w:eastAsia="Times New Roman" w:hAnsi="Courier New" w:cs="Courier New"/>
+          <w:sz w:val="20"/>
+          <w:szCs w:val="20"/>
+        </w:rPr>
+        <w:t xml:space="preserve">On the subnet 2 switch, move R3's subnet 2 interface into a new VLAN. How long before R3 can reach R4? </w:t>
+      </w:r>
+    </w:p>
+    <w:p>
+      <w:pPr>
+        <w:numPr>
+          <w:ilvl w:val="0"/>
+          <w:numId w:val="5"/>
+        </w:numPr>
+        <w:spacing w:before="100" w:beforeAutospacing="1" w:after="100" w:afterAutospacing="1" w:line="240" w:lineRule="auto"/>
+        <w:rPr>
+          <w:rFonts w:ascii="Courier New" w:eastAsia="Times New Roman" w:hAnsi="Courier New" w:cs="Courier New"/>
+          <w:sz w:val="20"/>
+          <w:szCs w:val="20"/>
+        </w:rPr>
+      </w:pPr>
+      <w:r>
+        <w:rPr>
+          <w:rFonts w:ascii="Courier New" w:eastAsia="Times New Roman" w:hAnsi="Courier New" w:cs="Courier New"/>
+          <w:sz w:val="20"/>
+          <w:szCs w:val="20"/>
+        </w:rPr>
+        <w:t xml:space="preserve">Question 2.11 - Show and explain the actual timeframe using your logs for support. Explain any difference from your hypothesis. </w:t>
+      </w:r>
+    </w:p>
+    <w:p>
+      <w:pPr>
+        <w:numPr>
+          <w:ilvl w:val="0"/>
+          <w:numId w:val="5"/>
+        </w:numPr>
+        <w:spacing w:before="100" w:beforeAutospacing="1" w:after="100" w:afterAutospacing="1" w:line="240" w:lineRule="auto"/>
+        <w:rPr>
+          <w:rFonts w:ascii="Courier New" w:eastAsia="Times New Roman" w:hAnsi="Courier New" w:cs="Courier New"/>
+          <w:sz w:val="20"/>
+          <w:szCs w:val="20"/>
+        </w:rPr>
+      </w:pPr>
+      <w:r>
+        <w:rPr>
+          <w:rFonts w:ascii="Courier New" w:eastAsia="Times New Roman" w:hAnsi="Courier New" w:cs="Courier New"/>
+          <w:sz w:val="20"/>
+          <w:szCs w:val="20"/>
+        </w:rPr>
+        <w:t xml:space="preserve">Fix the VLAN mismatch </w:t>
+      </w:r>
+    </w:p>
+    <w:p>
+      <w:pPr>
+        <w:numPr>
+          <w:ilvl w:val="0"/>
+          <w:numId w:val="5"/>
+        </w:numPr>
+        <w:spacing w:before="100" w:beforeAutospacing="1" w:after="100" w:afterAutospacing="1" w:line="240" w:lineRule="auto"/>
+        <w:rPr>
+          <w:rFonts w:ascii="Courier New" w:eastAsia="Times New Roman" w:hAnsi="Courier New" w:cs="Courier New"/>
+          <w:sz w:val="20"/>
+          <w:szCs w:val="20"/>
+        </w:rPr>
+      </w:pPr>
+      <w:r>
+        <w:rPr>
+          <w:rFonts w:ascii="Courier New" w:eastAsia="Times New Roman" w:hAnsi="Courier New" w:cs="Courier New"/>
+          <w:sz w:val="20"/>
+          <w:szCs w:val="20"/>
+        </w:rPr>
+        <w:t xml:space="preserve">Question 2.12 - Write up a short hypothesize on the timeframe for the next instruction using your working knowledge of RIP. </w:t>
+      </w:r>
+    </w:p>
+    <w:p>
+      <w:pPr>
+        <w:numPr>
+          <w:ilvl w:val="0"/>
+          <w:numId w:val="5"/>
+        </w:numPr>
+        <w:spacing w:before="100" w:beforeAutospacing="1" w:after="100" w:afterAutospacing="1" w:line="240" w:lineRule="auto"/>
+        <w:rPr>
+          <w:rFonts w:ascii="Courier New" w:eastAsia="Times New Roman" w:hAnsi="Courier New" w:cs="Courier New"/>
+          <w:sz w:val="20"/>
+          <w:szCs w:val="20"/>
+        </w:rPr>
+      </w:pPr>
+      <w:r>
+        <w:rPr>
+          <w:rFonts w:ascii="Courier New" w:eastAsia="Times New Roman" w:hAnsi="Courier New" w:cs="Courier New"/>
+          <w:sz w:val="20"/>
+          <w:szCs w:val="20"/>
+        </w:rPr>
+        <w:t xml:space="preserve">'Fail' R3 by unplugging it. How long before R4 can reach R5? Use logging or debug as necessary to understand the sequence of events. </w:t>
+      </w:r>
+    </w:p>
+    <w:p>
+      <w:pPr>
+        <w:numPr>
+          <w:ilvl w:val="0"/>
+          <w:numId w:val="5"/>
+        </w:numPr>
+        <w:spacing w:before="100" w:beforeAutospacing="1" w:after="100" w:afterAutospacing="1" w:line="240" w:lineRule="auto"/>
+        <w:rPr>
+          <w:rFonts w:ascii="Courier New" w:eastAsia="Times New Roman" w:hAnsi="Courier New" w:cs="Courier New"/>
+          <w:sz w:val="20"/>
+          <w:szCs w:val="20"/>
+        </w:rPr>
+      </w:pPr>
+      <w:r>
+        <w:rPr>
+          <w:rFonts w:ascii="Courier New" w:eastAsia="Times New Roman" w:hAnsi="Courier New" w:cs="Courier New"/>
+          <w:sz w:val="20"/>
+          <w:szCs w:val="20"/>
+        </w:rPr>
+        <w:t xml:space="preserve">Question 2.13 - Show and explain the actual timeframe using your logs for support. Explain any difference from your hypothesis. </w:t>
+      </w:r>
+    </w:p>
+    <w:p>
+      <w:pPr>
+        <w:numPr>
+          <w:ilvl w:val="0"/>
+          <w:numId w:val="5"/>
+        </w:numPr>
+        <w:spacing w:before="100" w:beforeAutospacing="1" w:after="100" w:afterAutospacing="1" w:line="240" w:lineRule="auto"/>
+        <w:rPr>
+          <w:rFonts w:ascii="Courier New" w:eastAsia="Times New Roman" w:hAnsi="Courier New" w:cs="Courier New"/>
+          <w:sz w:val="20"/>
+          <w:szCs w:val="20"/>
+        </w:rPr>
+      </w:pPr>
+      <w:r>
+        <w:rPr>
+          <w:rFonts w:ascii="Courier New" w:eastAsia="Times New Roman" w:hAnsi="Courier New" w:cs="Courier New"/>
+          <w:sz w:val="20"/>
+          <w:szCs w:val="20"/>
+        </w:rPr>
+        <w:t xml:space="preserve">Continue observations, power R3 back on and wait for the network to converge. </w:t>
+      </w:r>
+    </w:p>
+    <w:p>
+      <w:pPr>
+        <w:numPr>
+          <w:ilvl w:val="0"/>
+          <w:numId w:val="5"/>
+        </w:numPr>
+        <w:spacing w:before="100" w:beforeAutospacing="1" w:after="100" w:afterAutospacing="1" w:line="240" w:lineRule="auto"/>
+        <w:rPr>
+          <w:rFonts w:ascii="Courier New" w:eastAsia="Times New Roman" w:hAnsi="Courier New" w:cs="Courier New"/>
+          <w:sz w:val="20"/>
+          <w:szCs w:val="20"/>
+        </w:rPr>
+      </w:pPr>
+      <w:r>
+        <w:rPr>
+          <w:rFonts w:ascii="Courier New" w:eastAsia="Times New Roman" w:hAnsi="Courier New" w:cs="Courier New"/>
+          <w:sz w:val="20"/>
+          <w:szCs w:val="20"/>
+        </w:rPr>
+        <w:t xml:space="preserve">Question 2.14 - Any impact as R3 joins the topology? </w:t>
+      </w:r>
+    </w:p>
+    <w:p>
+      <w:pPr>
+        <w:numPr>
+          <w:ilvl w:val="0"/>
+          <w:numId w:val="5"/>
+        </w:numPr>
+        <w:spacing w:before="100" w:beforeAutospacing="1" w:after="100" w:afterAutospacing="1" w:line="240" w:lineRule="auto"/>
+        <w:rPr>
+          <w:rFonts w:ascii="Courier New" w:eastAsia="Times New Roman" w:hAnsi="Courier New" w:cs="Courier New"/>
+          <w:sz w:val="20"/>
+          <w:szCs w:val="20"/>
+        </w:rPr>
+      </w:pPr>
+      <w:r>
+        <w:rPr>
+          <w:rFonts w:ascii="Courier New" w:eastAsia="Times New Roman" w:hAnsi="Courier New" w:cs="Courier New"/>
+          <w:sz w:val="20"/>
+          <w:szCs w:val="20"/>
+        </w:rPr>
+        <w:t xml:space="preserve">Question 2.15 - Explain the difference if any between the three failure and one recovery scenario. </w:t>
+      </w:r>
+    </w:p>
+    <w:p>
+      <w:pPr>
+        <w:numPr>
+          <w:ilvl w:val="0"/>
+          <w:numId w:val="5"/>
+        </w:numPr>
+        <w:spacing w:before="100" w:beforeAutospacing="1" w:after="100" w:afterAutospacing="1" w:line="240" w:lineRule="auto"/>
+        <w:rPr>
+          <w:rFonts w:ascii="Courier New" w:eastAsia="Times New Roman" w:hAnsi="Courier New" w:cs="Courier New"/>
+          <w:sz w:val="20"/>
+          <w:szCs w:val="20"/>
+        </w:rPr>
+      </w:pPr>
+      <w:r>
+        <w:rPr>
+          <w:rFonts w:ascii="Courier New" w:eastAsia="Times New Roman" w:hAnsi="Courier New" w:cs="Courier New"/>
+          <w:sz w:val="20"/>
+          <w:szCs w:val="20"/>
+        </w:rPr>
+        <w:t xml:space="preserve">Question 2.16 - How did you test the convergence times across these scenarios? Discuss the positives and negatives of this test method. </w:t>
+      </w:r>
+    </w:p>
+    <w:p>
+      <w:pPr>
+        <w:spacing w:before="100" w:beforeAutospacing="1" w:after="100" w:afterAutospacing="1" w:line="240" w:lineRule="auto"/>
+        <w:rPr>
+          <w:rFonts w:ascii="Courier New" w:eastAsia="Times New Roman" w:hAnsi="Courier New" w:cs="Courier New"/>
+          <w:sz w:val="20"/>
+          <w:szCs w:val="20"/>
+        </w:rPr>
+      </w:pPr>
+      <w:r>
+        <w:rPr>
+          <w:rFonts w:ascii="Courier New" w:eastAsia="Times New Roman" w:hAnsi="Courier New" w:cs="Courier New"/>
+          <w:b/>
+          <w:bCs/>
+          <w:sz w:val="20"/>
+          <w:szCs w:val="20"/>
+        </w:rPr>
+        <w:lastRenderedPageBreak/>
         <w:t>OBJECTIVE 3</w:t>
       </w:r>
       <w:r>
@@ -2713,51 +3001,51 @@
           <w:sz w:val="20"/>
           <w:szCs w:val="20"/>
         </w:rPr>
+        <w:t xml:space="preserve">Question 3.14 - Write up a short hypothesize on the timeframe for the next instruction using your working knowledge of OSPF. </w:t>
+      </w:r>
+    </w:p>
+    <w:p>
+      <w:pPr>
+        <w:numPr>
+          <w:ilvl w:val="0"/>
+          <w:numId w:val="6"/>
+        </w:numPr>
+        <w:spacing w:before="100" w:beforeAutospacing="1" w:after="100" w:afterAutospacing="1" w:line="240" w:lineRule="auto"/>
+        <w:rPr>
+          <w:rFonts w:ascii="Courier New" w:eastAsia="Times New Roman" w:hAnsi="Courier New" w:cs="Courier New"/>
+          <w:sz w:val="20"/>
+          <w:szCs w:val="20"/>
+        </w:rPr>
+      </w:pPr>
+      <w:r>
+        <w:rPr>
+          <w:rFonts w:ascii="Courier New" w:eastAsia="Times New Roman" w:hAnsi="Courier New" w:cs="Courier New"/>
+          <w:sz w:val="20"/>
+          <w:szCs w:val="20"/>
+        </w:rPr>
+        <w:t xml:space="preserve">'Fail' R3 by unplugging it. How long before R4 can reach R5? Use logging or debug as necessary to understand the sequence of events. </w:t>
+      </w:r>
+    </w:p>
+    <w:p>
+      <w:pPr>
+        <w:numPr>
+          <w:ilvl w:val="0"/>
+          <w:numId w:val="6"/>
+        </w:numPr>
+        <w:spacing w:before="100" w:beforeAutospacing="1" w:after="100" w:afterAutospacing="1" w:line="240" w:lineRule="auto"/>
+        <w:rPr>
+          <w:rFonts w:ascii="Courier New" w:eastAsia="Times New Roman" w:hAnsi="Courier New" w:cs="Courier New"/>
+          <w:sz w:val="20"/>
+          <w:szCs w:val="20"/>
+        </w:rPr>
+      </w:pPr>
+      <w:r>
+        <w:rPr>
+          <w:rFonts w:ascii="Courier New" w:eastAsia="Times New Roman" w:hAnsi="Courier New" w:cs="Courier New"/>
+          <w:sz w:val="20"/>
+          <w:szCs w:val="20"/>
+        </w:rPr>
         <w:lastRenderedPageBreak/>
-        <w:t xml:space="preserve">Question 3.14 - Write up a short hypothesize on the timeframe for the next instruction using your working knowledge of OSPF. </w:t>
-      </w:r>
-    </w:p>
-    <w:p>
-      <w:pPr>
-        <w:numPr>
-          <w:ilvl w:val="0"/>
-          <w:numId w:val="6"/>
-        </w:numPr>
-        <w:spacing w:before="100" w:beforeAutospacing="1" w:after="100" w:afterAutospacing="1" w:line="240" w:lineRule="auto"/>
-        <w:rPr>
-          <w:rFonts w:ascii="Courier New" w:eastAsia="Times New Roman" w:hAnsi="Courier New" w:cs="Courier New"/>
-          <w:sz w:val="20"/>
-          <w:szCs w:val="20"/>
-        </w:rPr>
-      </w:pPr>
-      <w:r>
-        <w:rPr>
-          <w:rFonts w:ascii="Courier New" w:eastAsia="Times New Roman" w:hAnsi="Courier New" w:cs="Courier New"/>
-          <w:sz w:val="20"/>
-          <w:szCs w:val="20"/>
-        </w:rPr>
-        <w:t xml:space="preserve">'Fail' R3 by unplugging it. How long before R4 can reach R5? Use logging or debug as necessary to understand the sequence of events. </w:t>
-      </w:r>
-    </w:p>
-    <w:p>
-      <w:pPr>
-        <w:numPr>
-          <w:ilvl w:val="0"/>
-          <w:numId w:val="6"/>
-        </w:numPr>
-        <w:spacing w:before="100" w:beforeAutospacing="1" w:after="100" w:afterAutospacing="1" w:line="240" w:lineRule="auto"/>
-        <w:rPr>
-          <w:rFonts w:ascii="Courier New" w:eastAsia="Times New Roman" w:hAnsi="Courier New" w:cs="Courier New"/>
-          <w:sz w:val="20"/>
-          <w:szCs w:val="20"/>
-        </w:rPr>
-      </w:pPr>
-      <w:r>
-        <w:rPr>
-          <w:rFonts w:ascii="Courier New" w:eastAsia="Times New Roman" w:hAnsi="Courier New" w:cs="Courier New"/>
-          <w:sz w:val="20"/>
-          <w:szCs w:val="20"/>
-        </w:rPr>
         <w:t xml:space="preserve">Question 3.15 - Show and explain the actual timeframe using your logs for support. Explain any difference from your hypothesis. </w:t>
       </w:r>
     </w:p>
@@ -3281,7 +3569,6 @@
           <w:sz w:val="20"/>
           <w:szCs w:val="20"/>
         </w:rPr>
-        <w:lastRenderedPageBreak/>
         <w:t xml:space="preserve">Did you finish early? Overachievers? Want a good job after graduation? If so replace R1 with a Juniper and rerun objectives 2 and 3. </w:t>
       </w:r>
     </w:p>

</xml_diff>

<commit_message>
Update the written document
</commit_message>
<xml_diff>
--- a/lab1/IP_Routing_Lab1.docx
+++ b/lab1/IP_Routing_Lab1.docx
@@ -1637,8 +1637,9 @@
           <w:sz w:val="20"/>
           <w:szCs w:val="20"/>
         </w:rPr>
-        <w:t xml:space="preserve">We need the RIP is not been advertise to the backbone because we didn’t receive any RIPv2 updates </w:t>
-      </w:r>
+        <w:t xml:space="preserve">We need the RIP </w:t>
+      </w:r>
+      <w:proofErr w:type="gramStart"/>
       <w:r>
         <w:rPr>
           <w:rFonts w:ascii="Courier New" w:eastAsia="Times New Roman" w:hAnsi="Courier New" w:cs="Courier New"/>
@@ -1647,7 +1648,72 @@
           <w:sz w:val="20"/>
           <w:szCs w:val="20"/>
         </w:rPr>
-        <w:t xml:space="preserve">and we did not send a update </w:t>
+        <w:t>is not been</w:t>
+      </w:r>
+      <w:proofErr w:type="gramEnd"/>
+      <w:r>
+        <w:rPr>
+          <w:rFonts w:ascii="Courier New" w:eastAsia="Times New Roman" w:hAnsi="Courier New" w:cs="Courier New"/>
+          <w:b/>
+          <w:bCs/>
+          <w:sz w:val="20"/>
+          <w:szCs w:val="20"/>
+        </w:rPr>
+        <w:t xml:space="preserve"> </w:t>
+      </w:r>
+      <w:proofErr w:type="gramStart"/>
+      <w:r>
+        <w:rPr>
+          <w:rFonts w:ascii="Courier New" w:eastAsia="Times New Roman" w:hAnsi="Courier New" w:cs="Courier New"/>
+          <w:b/>
+          <w:bCs/>
+          <w:sz w:val="20"/>
+          <w:szCs w:val="20"/>
+        </w:rPr>
+        <w:t>advertise</w:t>
+      </w:r>
+      <w:proofErr w:type="gramEnd"/>
+      <w:r>
+        <w:rPr>
+          <w:rFonts w:ascii="Courier New" w:eastAsia="Times New Roman" w:hAnsi="Courier New" w:cs="Courier New"/>
+          <w:b/>
+          <w:bCs/>
+          <w:sz w:val="20"/>
+          <w:szCs w:val="20"/>
+        </w:rPr>
+        <w:t xml:space="preserve"> to the backbone because we didn’t receive any RIPv2 updates </w:t>
+      </w:r>
+      <w:r>
+        <w:rPr>
+          <w:rFonts w:ascii="Courier New" w:eastAsia="Times New Roman" w:hAnsi="Courier New" w:cs="Courier New"/>
+          <w:b/>
+          <w:bCs/>
+          <w:sz w:val="20"/>
+          <w:szCs w:val="20"/>
+        </w:rPr>
+        <w:t xml:space="preserve">and we did not send </w:t>
+      </w:r>
+      <w:proofErr w:type="gramStart"/>
+      <w:r>
+        <w:rPr>
+          <w:rFonts w:ascii="Courier New" w:eastAsia="Times New Roman" w:hAnsi="Courier New" w:cs="Courier New"/>
+          <w:b/>
+          <w:bCs/>
+          <w:sz w:val="20"/>
+          <w:szCs w:val="20"/>
+        </w:rPr>
+        <w:t>a</w:t>
+      </w:r>
+      <w:proofErr w:type="gramEnd"/>
+      <w:r>
+        <w:rPr>
+          <w:rFonts w:ascii="Courier New" w:eastAsia="Times New Roman" w:hAnsi="Courier New" w:cs="Courier New"/>
+          <w:b/>
+          <w:bCs/>
+          <w:sz w:val="20"/>
+          <w:szCs w:val="20"/>
+        </w:rPr>
+        <w:t xml:space="preserve"> update </w:t>
       </w:r>
       <w:r>
         <w:rPr>
@@ -3572,7 +3638,6 @@
         <w:t xml:space="preserve">Did you finish early? Overachievers? Want a good job after graduation? If so replace R1 with a Juniper and rerun objectives 2 and 3. </w:t>
       </w:r>
     </w:p>
-    <w:p/>
     <w:sectPr>
       <w:pgSz w:w="12240" w:h="15840"/>
       <w:pgMar w:top="1440" w:right="1440" w:bottom="1440" w:left="1440" w:header="720" w:footer="720" w:gutter="0"/>

</xml_diff>

<commit_message>
pushing all change uptill Objective 2 finish
</commit_message>
<xml_diff>
--- a/lab1/IP_Routing_Lab1.docx
+++ b/lab1/IP_Routing_Lab1.docx
@@ -2271,7 +2271,144 @@
           <w:sz w:val="20"/>
           <w:szCs w:val="20"/>
         </w:rPr>
-        <w:t xml:space="preserve">'Fail' the link between R3 and R5 by unplugging it. How long before R3 can reach R5? Use logging or debug as necessary to understand the sequence of events. </w:t>
+        <w:t>'Fail' the link between R3 and R5 by unplugging it. How long before R3 can reach R5? Use logging or debug as necessary to understand the sequence of events.</w:t>
+      </w:r>
+    </w:p>
+    <w:p>
+      <w:pPr>
+        <w:spacing w:before="100" w:beforeAutospacing="1" w:after="100" w:afterAutospacing="1" w:line="240" w:lineRule="auto"/>
+        <w:ind w:left="720"/>
+        <w:rPr>
+          <w:rFonts w:ascii="Courier New" w:eastAsia="Times New Roman" w:hAnsi="Courier New" w:cs="Courier New"/>
+          <w:sz w:val="20"/>
+          <w:szCs w:val="20"/>
+        </w:rPr>
+      </w:pPr>
+      <w:r>
+        <w:rPr>
+          <w:rFonts w:ascii="Courier New" w:eastAsia="Times New Roman" w:hAnsi="Courier New" w:cs="Courier New"/>
+          <w:sz w:val="20"/>
+          <w:szCs w:val="20"/>
+        </w:rPr>
+        <w:drawing>
+          <wp:inline distT="0" distB="0" distL="0" distR="0" wp14:anchorId="472C48A1" wp14:editId="5F8E5AD9">
+            <wp:extent cx="5943600" cy="3091815"/>
+            <wp:effectExtent l="0" t="0" r="0" b="0"/>
+            <wp:docPr id="1165030169" name="Picture 1"/>
+            <wp:cNvGraphicFramePr>
+              <a:graphicFrameLocks xmlns:a="http://schemas.openxmlformats.org/drawingml/2006/main" noChangeAspect="1"/>
+            </wp:cNvGraphicFramePr>
+            <a:graphic xmlns:a="http://schemas.openxmlformats.org/drawingml/2006/main">
+              <a:graphicData uri="http://schemas.openxmlformats.org/drawingml/2006/picture">
+                <pic:pic xmlns:pic="http://schemas.openxmlformats.org/drawingml/2006/picture">
+                  <pic:nvPicPr>
+                    <pic:cNvPr id="1165030169" name=""/>
+                    <pic:cNvPicPr/>
+                  </pic:nvPicPr>
+                  <pic:blipFill>
+                    <a:blip r:embed="rId17"/>
+                    <a:stretch>
+                      <a:fillRect/>
+                    </a:stretch>
+                  </pic:blipFill>
+                  <pic:spPr>
+                    <a:xfrm>
+                      <a:off x="0" y="0"/>
+                      <a:ext cx="5943600" cy="3091815"/>
+                    </a:xfrm>
+                    <a:prstGeom prst="rect">
+                      <a:avLst/>
+                    </a:prstGeom>
+                  </pic:spPr>
+                </pic:pic>
+              </a:graphicData>
+            </a:graphic>
+          </wp:inline>
+        </w:drawing>
+      </w:r>
+    </w:p>
+    <w:p>
+      <w:pPr>
+        <w:spacing w:before="100" w:beforeAutospacing="1" w:after="100" w:afterAutospacing="1" w:line="240" w:lineRule="auto"/>
+        <w:ind w:left="720"/>
+        <w:rPr>
+          <w:rFonts w:ascii="Courier New" w:eastAsia="Times New Roman" w:hAnsi="Courier New" w:cs="Courier New"/>
+          <w:sz w:val="20"/>
+          <w:szCs w:val="20"/>
+        </w:rPr>
+      </w:pPr>
+    </w:p>
+    <w:p>
+      <w:pPr>
+        <w:spacing w:before="100" w:beforeAutospacing="1" w:after="100" w:afterAutospacing="1" w:line="240" w:lineRule="auto"/>
+        <w:ind w:left="720"/>
+        <w:rPr>
+          <w:rFonts w:ascii="Courier New" w:eastAsia="Times New Roman" w:hAnsi="Courier New" w:cs="Courier New"/>
+          <w:sz w:val="20"/>
+          <w:szCs w:val="20"/>
+        </w:rPr>
+      </w:pPr>
+      <w:r>
+        <w:rPr>
+          <w:rFonts w:ascii="Courier New" w:eastAsia="Times New Roman" w:hAnsi="Courier New" w:cs="Courier New"/>
+          <w:sz w:val="20"/>
+          <w:szCs w:val="20"/>
+        </w:rPr>
+        <w:lastRenderedPageBreak/>
+        <w:drawing>
+          <wp:inline distT="0" distB="0" distL="0" distR="0" wp14:anchorId="0B3ED0BE" wp14:editId="03DAC8A4">
+            <wp:extent cx="5715495" cy="3406435"/>
+            <wp:effectExtent l="0" t="0" r="0" b="3810"/>
+            <wp:docPr id="151622333" name="Picture 1"/>
+            <wp:cNvGraphicFramePr>
+              <a:graphicFrameLocks xmlns:a="http://schemas.openxmlformats.org/drawingml/2006/main" noChangeAspect="1"/>
+            </wp:cNvGraphicFramePr>
+            <a:graphic xmlns:a="http://schemas.openxmlformats.org/drawingml/2006/main">
+              <a:graphicData uri="http://schemas.openxmlformats.org/drawingml/2006/picture">
+                <pic:pic xmlns:pic="http://schemas.openxmlformats.org/drawingml/2006/picture">
+                  <pic:nvPicPr>
+                    <pic:cNvPr id="151622333" name=""/>
+                    <pic:cNvPicPr/>
+                  </pic:nvPicPr>
+                  <pic:blipFill>
+                    <a:blip r:embed="rId18"/>
+                    <a:stretch>
+                      <a:fillRect/>
+                    </a:stretch>
+                  </pic:blipFill>
+                  <pic:spPr>
+                    <a:xfrm>
+                      <a:off x="0" y="0"/>
+                      <a:ext cx="5715495" cy="3406435"/>
+                    </a:xfrm>
+                    <a:prstGeom prst="rect">
+                      <a:avLst/>
+                    </a:prstGeom>
+                  </pic:spPr>
+                </pic:pic>
+              </a:graphicData>
+            </a:graphic>
+          </wp:inline>
+        </w:drawing>
+      </w:r>
+    </w:p>
+    <w:p>
+      <w:pPr>
+        <w:spacing w:before="100" w:beforeAutospacing="1" w:after="100" w:afterAutospacing="1" w:line="240" w:lineRule="auto"/>
+        <w:ind w:left="720"/>
+        <w:rPr>
+          <w:rFonts w:ascii="Courier New" w:eastAsia="Times New Roman" w:hAnsi="Courier New" w:cs="Courier New"/>
+          <w:sz w:val="20"/>
+          <w:szCs w:val="20"/>
+        </w:rPr>
+      </w:pPr>
+      <w:r>
+        <w:rPr>
+          <w:rFonts w:ascii="Courier New" w:eastAsia="Times New Roman" w:hAnsi="Courier New" w:cs="Courier New"/>
+          <w:sz w:val="20"/>
+          <w:szCs w:val="20"/>
+        </w:rPr>
+        <w:t xml:space="preserve"> </w:t>
       </w:r>
     </w:p>
     <w:p>
@@ -2298,6 +2435,143 @@
     </w:p>
     <w:p>
       <w:pPr>
+        <w:spacing w:before="100" w:beforeAutospacing="1" w:after="100" w:afterAutospacing="1" w:line="240" w:lineRule="auto"/>
+        <w:ind w:left="720"/>
+        <w:rPr>
+          <w:rFonts w:ascii="Courier New" w:eastAsia="Times New Roman" w:hAnsi="Courier New" w:cs="Courier New"/>
+          <w:b/>
+          <w:bCs/>
+          <w:sz w:val="20"/>
+          <w:szCs w:val="20"/>
+        </w:rPr>
+      </w:pPr>
+      <w:r>
+        <w:rPr>
+          <w:rFonts w:ascii="Courier New" w:eastAsia="Times New Roman" w:hAnsi="Courier New" w:cs="Courier New"/>
+          <w:b/>
+          <w:bCs/>
+          <w:sz w:val="20"/>
+          <w:szCs w:val="20"/>
+        </w:rPr>
+        <w:t xml:space="preserve">What we see as you can see </w:t>
+      </w:r>
+      <w:proofErr w:type="gramStart"/>
+      <w:r>
+        <w:rPr>
+          <w:rFonts w:ascii="Courier New" w:eastAsia="Times New Roman" w:hAnsi="Courier New" w:cs="Courier New"/>
+          <w:b/>
+          <w:bCs/>
+          <w:sz w:val="20"/>
+          <w:szCs w:val="20"/>
+        </w:rPr>
+        <w:t>in</w:t>
+      </w:r>
+      <w:proofErr w:type="gramEnd"/>
+      <w:r>
+        <w:rPr>
+          <w:rFonts w:ascii="Courier New" w:eastAsia="Times New Roman" w:hAnsi="Courier New" w:cs="Courier New"/>
+          <w:b/>
+          <w:bCs/>
+          <w:sz w:val="20"/>
+          <w:szCs w:val="20"/>
+        </w:rPr>
+        <w:t xml:space="preserve"> the logs is that the ping fails for about 10 seconds before it is successful again. </w:t>
+      </w:r>
+      <w:proofErr w:type="gramStart"/>
+      <w:r>
+        <w:rPr>
+          <w:rFonts w:ascii="Courier New" w:eastAsia="Times New Roman" w:hAnsi="Courier New" w:cs="Courier New"/>
+          <w:b/>
+          <w:bCs/>
+          <w:sz w:val="20"/>
+          <w:szCs w:val="20"/>
+        </w:rPr>
+        <w:t>So</w:t>
+      </w:r>
+      <w:proofErr w:type="gramEnd"/>
+      <w:r>
+        <w:rPr>
+          <w:rFonts w:ascii="Courier New" w:eastAsia="Times New Roman" w:hAnsi="Courier New" w:cs="Courier New"/>
+          <w:b/>
+          <w:bCs/>
+          <w:sz w:val="20"/>
+          <w:szCs w:val="20"/>
+        </w:rPr>
+        <w:t xml:space="preserve"> our hypothesis was off by 10 seconds which we think in such a small network is still bad.</w:t>
+      </w:r>
+    </w:p>
+    <w:p>
+      <w:pPr>
+        <w:spacing w:before="100" w:beforeAutospacing="1" w:after="100" w:afterAutospacing="1" w:line="240" w:lineRule="auto"/>
+        <w:ind w:left="720"/>
+        <w:rPr>
+          <w:rFonts w:ascii="Courier New" w:eastAsia="Times New Roman" w:hAnsi="Courier New" w:cs="Courier New"/>
+          <w:b/>
+          <w:bCs/>
+          <w:sz w:val="20"/>
+          <w:szCs w:val="20"/>
+        </w:rPr>
+      </w:pPr>
+      <w:r>
+        <w:rPr>
+          <w:rFonts w:ascii="Courier New" w:eastAsia="Times New Roman" w:hAnsi="Courier New" w:cs="Courier New"/>
+          <w:b/>
+          <w:bCs/>
+          <w:sz w:val="20"/>
+          <w:szCs w:val="20"/>
+        </w:rPr>
+        <w:drawing>
+          <wp:inline distT="0" distB="0" distL="0" distR="0" wp14:anchorId="0E863699" wp14:editId="2AB9D76E">
+            <wp:extent cx="5943600" cy="2625725"/>
+            <wp:effectExtent l="0" t="0" r="0" b="3175"/>
+            <wp:docPr id="131988781" name="Picture 1"/>
+            <wp:cNvGraphicFramePr>
+              <a:graphicFrameLocks xmlns:a="http://schemas.openxmlformats.org/drawingml/2006/main" noChangeAspect="1"/>
+            </wp:cNvGraphicFramePr>
+            <a:graphic xmlns:a="http://schemas.openxmlformats.org/drawingml/2006/main">
+              <a:graphicData uri="http://schemas.openxmlformats.org/drawingml/2006/picture">
+                <pic:pic xmlns:pic="http://schemas.openxmlformats.org/drawingml/2006/picture">
+                  <pic:nvPicPr>
+                    <pic:cNvPr id="131988781" name=""/>
+                    <pic:cNvPicPr/>
+                  </pic:nvPicPr>
+                  <pic:blipFill>
+                    <a:blip r:embed="rId19"/>
+                    <a:stretch>
+                      <a:fillRect/>
+                    </a:stretch>
+                  </pic:blipFill>
+                  <pic:spPr>
+                    <a:xfrm>
+                      <a:off x="0" y="0"/>
+                      <a:ext cx="5943600" cy="2625725"/>
+                    </a:xfrm>
+                    <a:prstGeom prst="rect">
+                      <a:avLst/>
+                    </a:prstGeom>
+                  </pic:spPr>
+                </pic:pic>
+              </a:graphicData>
+            </a:graphic>
+          </wp:inline>
+        </w:drawing>
+      </w:r>
+    </w:p>
+    <w:p>
+      <w:pPr>
+        <w:spacing w:before="100" w:beforeAutospacing="1" w:after="100" w:afterAutospacing="1" w:line="240" w:lineRule="auto"/>
+        <w:ind w:left="720"/>
+        <w:rPr>
+          <w:rFonts w:ascii="Courier New" w:eastAsia="Times New Roman" w:hAnsi="Courier New" w:cs="Courier New"/>
+          <w:b/>
+          <w:bCs/>
+          <w:sz w:val="20"/>
+          <w:szCs w:val="20"/>
+        </w:rPr>
+      </w:pPr>
+    </w:p>
+    <w:p>
+      <w:pPr>
         <w:numPr>
           <w:ilvl w:val="0"/>
           <w:numId w:val="5"/>
@@ -2315,6 +2589,7 @@
           <w:sz w:val="20"/>
           <w:szCs w:val="20"/>
         </w:rPr>
+        <w:lastRenderedPageBreak/>
         <w:t xml:space="preserve">Plug the link back in and wait for the network to converge. </w:t>
       </w:r>
     </w:p>
@@ -2337,8 +2612,68 @@
           <w:sz w:val="20"/>
           <w:szCs w:val="20"/>
         </w:rPr>
-        <w:t xml:space="preserve">Question 2.10 - Write up a short hypothesize on the timeframe for the next instruction using your working knowledge of RIP. </w:t>
-      </w:r>
+        <w:t xml:space="preserve">Question 2.10 - Write up a short </w:t>
+      </w:r>
+      <w:proofErr w:type="gramStart"/>
+      <w:r>
+        <w:rPr>
+          <w:rFonts w:ascii="Courier New" w:eastAsia="Times New Roman" w:hAnsi="Courier New" w:cs="Courier New"/>
+          <w:sz w:val="20"/>
+          <w:szCs w:val="20"/>
+        </w:rPr>
+        <w:t>hypothesize</w:t>
+      </w:r>
+      <w:proofErr w:type="gramEnd"/>
+      <w:r>
+        <w:rPr>
+          <w:rFonts w:ascii="Courier New" w:eastAsia="Times New Roman" w:hAnsi="Courier New" w:cs="Courier New"/>
+          <w:sz w:val="20"/>
+          <w:szCs w:val="20"/>
+        </w:rPr>
+        <w:t xml:space="preserve"> on the timeframe for the next instruction using your working knowledge of RIP. </w:t>
+      </w:r>
+      <w:r>
+        <w:rPr>
+          <w:rFonts w:ascii="Courier New" w:eastAsia="Times New Roman" w:hAnsi="Courier New" w:cs="Courier New"/>
+          <w:sz w:val="20"/>
+          <w:szCs w:val="20"/>
+        </w:rPr>
+        <w:br/>
+      </w:r>
+    </w:p>
+    <w:p>
+      <w:pPr>
+        <w:spacing w:before="100" w:beforeAutospacing="1" w:after="100" w:afterAutospacing="1" w:line="240" w:lineRule="auto"/>
+        <w:ind w:left="720"/>
+        <w:rPr>
+          <w:rFonts w:ascii="Courier New" w:eastAsia="Times New Roman" w:hAnsi="Courier New" w:cs="Courier New"/>
+          <w:b/>
+          <w:bCs/>
+          <w:sz w:val="20"/>
+          <w:szCs w:val="20"/>
+        </w:rPr>
+      </w:pPr>
+      <w:r>
+        <w:rPr>
+          <w:rFonts w:ascii="Courier New" w:eastAsia="Times New Roman" w:hAnsi="Courier New" w:cs="Courier New"/>
+          <w:b/>
+          <w:bCs/>
+          <w:sz w:val="20"/>
+          <w:szCs w:val="20"/>
+        </w:rPr>
+        <w:t>We would think this process would also take about 10 seconds given that we realize that the converge time for this topology is about 10 seconds. In this case R3 will have to Route via R5-R1-R2 to get to R4.</w:t>
+      </w:r>
+    </w:p>
+    <w:p>
+      <w:pPr>
+        <w:spacing w:before="100" w:beforeAutospacing="1" w:after="100" w:afterAutospacing="1" w:line="240" w:lineRule="auto"/>
+        <w:ind w:left="720"/>
+        <w:rPr>
+          <w:rFonts w:ascii="Courier New" w:eastAsia="Times New Roman" w:hAnsi="Courier New" w:cs="Courier New"/>
+          <w:sz w:val="20"/>
+          <w:szCs w:val="20"/>
+        </w:rPr>
+      </w:pPr>
     </w:p>
     <w:p>
       <w:pPr>
@@ -2386,6 +2721,248 @@
     </w:p>
     <w:p>
       <w:pPr>
+        <w:spacing w:before="100" w:beforeAutospacing="1" w:after="100" w:afterAutospacing="1" w:line="240" w:lineRule="auto"/>
+        <w:ind w:left="720"/>
+        <w:rPr>
+          <w:rFonts w:ascii="Courier New" w:eastAsia="Times New Roman" w:hAnsi="Courier New" w:cs="Courier New"/>
+          <w:b/>
+          <w:bCs/>
+          <w:sz w:val="20"/>
+          <w:szCs w:val="20"/>
+        </w:rPr>
+      </w:pPr>
+      <w:r>
+        <w:rPr>
+          <w:rFonts w:ascii="Courier New" w:eastAsia="Times New Roman" w:hAnsi="Courier New" w:cs="Courier New"/>
+          <w:b/>
+          <w:bCs/>
+          <w:sz w:val="20"/>
+          <w:szCs w:val="20"/>
+        </w:rPr>
+        <w:t xml:space="preserve">What we see is that with </w:t>
+      </w:r>
+      <w:proofErr w:type="spellStart"/>
+      <w:r>
+        <w:rPr>
+          <w:rFonts w:ascii="Courier New" w:eastAsia="Times New Roman" w:hAnsi="Courier New" w:cs="Courier New"/>
+          <w:b/>
+          <w:bCs/>
+          <w:sz w:val="20"/>
+          <w:szCs w:val="20"/>
+        </w:rPr>
+        <w:t>vlan</w:t>
+      </w:r>
+      <w:proofErr w:type="spellEnd"/>
+      <w:r>
+        <w:rPr>
+          <w:rFonts w:ascii="Courier New" w:eastAsia="Times New Roman" w:hAnsi="Courier New" w:cs="Courier New"/>
+          <w:b/>
+          <w:bCs/>
+          <w:sz w:val="20"/>
+          <w:szCs w:val="20"/>
+        </w:rPr>
+        <w:t xml:space="preserve">-mismatch it took way longer for it to converge. In our research we see that the RIP triggered updates just get sent when the interface goes down but for a </w:t>
+      </w:r>
+      <w:proofErr w:type="spellStart"/>
+      <w:r>
+        <w:rPr>
+          <w:rFonts w:ascii="Courier New" w:eastAsia="Times New Roman" w:hAnsi="Courier New" w:cs="Courier New"/>
+          <w:b/>
+          <w:bCs/>
+          <w:sz w:val="20"/>
+          <w:szCs w:val="20"/>
+        </w:rPr>
+        <w:t>vlan</w:t>
+      </w:r>
+      <w:proofErr w:type="spellEnd"/>
+      <w:r>
+        <w:rPr>
+          <w:rFonts w:ascii="Courier New" w:eastAsia="Times New Roman" w:hAnsi="Courier New" w:cs="Courier New"/>
+          <w:b/>
+          <w:bCs/>
+          <w:sz w:val="20"/>
+          <w:szCs w:val="20"/>
+        </w:rPr>
+        <w:t xml:space="preserve"> mismatch the routers wait for the RIP timers to happen before they converge.</w:t>
+      </w:r>
+      <w:r>
+        <w:rPr>
+          <w:rFonts w:ascii="Courier New" w:eastAsia="Times New Roman" w:hAnsi="Courier New" w:cs="Courier New"/>
+          <w:b/>
+          <w:bCs/>
+          <w:sz w:val="20"/>
+          <w:szCs w:val="20"/>
+        </w:rPr>
+        <w:t xml:space="preserve"> It took close to </w:t>
+      </w:r>
+      <w:r>
+        <w:rPr>
+          <w:rFonts w:ascii="Courier New" w:eastAsia="Times New Roman" w:hAnsi="Courier New" w:cs="Courier New"/>
+          <w:b/>
+          <w:bCs/>
+          <w:sz w:val="20"/>
+          <w:szCs w:val="20"/>
+          <w:u w:val="single"/>
+        </w:rPr>
+        <w:t>4 minutes</w:t>
+      </w:r>
+      <w:r>
+        <w:rPr>
+          <w:rFonts w:ascii="Courier New" w:eastAsia="Times New Roman" w:hAnsi="Courier New" w:cs="Courier New"/>
+          <w:b/>
+          <w:bCs/>
+          <w:sz w:val="20"/>
+          <w:szCs w:val="20"/>
+        </w:rPr>
+        <w:t xml:space="preserve"> for it to happen</w:t>
+      </w:r>
+    </w:p>
+    <w:p>
+      <w:pPr>
+        <w:spacing w:before="100" w:beforeAutospacing="1" w:after="100" w:afterAutospacing="1" w:line="240" w:lineRule="auto"/>
+        <w:ind w:left="720"/>
+        <w:rPr>
+          <w:rFonts w:ascii="Courier New" w:eastAsia="Times New Roman" w:hAnsi="Courier New" w:cs="Courier New"/>
+          <w:sz w:val="20"/>
+          <w:szCs w:val="20"/>
+        </w:rPr>
+      </w:pPr>
+      <w:r>
+        <w:rPr>
+          <w:rFonts w:ascii="Courier New" w:eastAsia="Times New Roman" w:hAnsi="Courier New" w:cs="Courier New"/>
+          <w:sz w:val="20"/>
+          <w:szCs w:val="20"/>
+        </w:rPr>
+        <w:drawing>
+          <wp:inline distT="0" distB="0" distL="0" distR="0" wp14:anchorId="4F0FF96E" wp14:editId="5C7B9C1E">
+            <wp:extent cx="5943600" cy="4418965"/>
+            <wp:effectExtent l="0" t="0" r="0" b="635"/>
+            <wp:docPr id="213996573" name="Picture 1"/>
+            <wp:cNvGraphicFramePr>
+              <a:graphicFrameLocks xmlns:a="http://schemas.openxmlformats.org/drawingml/2006/main" noChangeAspect="1"/>
+            </wp:cNvGraphicFramePr>
+            <a:graphic xmlns:a="http://schemas.openxmlformats.org/drawingml/2006/main">
+              <a:graphicData uri="http://schemas.openxmlformats.org/drawingml/2006/picture">
+                <pic:pic xmlns:pic="http://schemas.openxmlformats.org/drawingml/2006/picture">
+                  <pic:nvPicPr>
+                    <pic:cNvPr id="213996573" name=""/>
+                    <pic:cNvPicPr/>
+                  </pic:nvPicPr>
+                  <pic:blipFill>
+                    <a:blip r:embed="rId20"/>
+                    <a:stretch>
+                      <a:fillRect/>
+                    </a:stretch>
+                  </pic:blipFill>
+                  <pic:spPr>
+                    <a:xfrm>
+                      <a:off x="0" y="0"/>
+                      <a:ext cx="5943600" cy="4418965"/>
+                    </a:xfrm>
+                    <a:prstGeom prst="rect">
+                      <a:avLst/>
+                    </a:prstGeom>
+                  </pic:spPr>
+                </pic:pic>
+              </a:graphicData>
+            </a:graphic>
+          </wp:inline>
+        </w:drawing>
+      </w:r>
+    </w:p>
+    <w:p>
+      <w:pPr>
+        <w:spacing w:before="100" w:beforeAutospacing="1" w:after="100" w:afterAutospacing="1" w:line="240" w:lineRule="auto"/>
+        <w:ind w:left="720"/>
+        <w:rPr>
+          <w:rFonts w:ascii="Courier New" w:eastAsia="Times New Roman" w:hAnsi="Courier New" w:cs="Courier New"/>
+          <w:sz w:val="20"/>
+          <w:szCs w:val="20"/>
+        </w:rPr>
+      </w:pPr>
+    </w:p>
+    <w:p>
+      <w:pPr>
+        <w:spacing w:before="100" w:beforeAutospacing="1" w:after="100" w:afterAutospacing="1" w:line="240" w:lineRule="auto"/>
+        <w:ind w:left="720"/>
+        <w:rPr>
+          <w:rFonts w:ascii="Courier New" w:eastAsia="Times New Roman" w:hAnsi="Courier New" w:cs="Courier New"/>
+          <w:sz w:val="20"/>
+          <w:szCs w:val="20"/>
+        </w:rPr>
+      </w:pPr>
+      <w:r>
+        <w:rPr>
+          <w:rFonts w:ascii="Courier New" w:eastAsia="Times New Roman" w:hAnsi="Courier New" w:cs="Courier New"/>
+          <w:b/>
+          <w:bCs/>
+          <w:sz w:val="20"/>
+          <w:szCs w:val="20"/>
+        </w:rPr>
+        <w:lastRenderedPageBreak/>
+        <w:t>Here is what we see when the routing change does happen</w:t>
+      </w:r>
+      <w:r>
+        <w:rPr>
+          <w:rFonts w:ascii="Courier New" w:eastAsia="Times New Roman" w:hAnsi="Courier New" w:cs="Courier New"/>
+          <w:sz w:val="20"/>
+          <w:szCs w:val="20"/>
+        </w:rPr>
+        <w:br/>
+      </w:r>
+      <w:r>
+        <w:rPr>
+          <w:rFonts w:ascii="Courier New" w:eastAsia="Times New Roman" w:hAnsi="Courier New" w:cs="Courier New"/>
+          <w:sz w:val="20"/>
+          <w:szCs w:val="20"/>
+        </w:rPr>
+        <w:br/>
+      </w:r>
+      <w:r>
+        <w:rPr>
+          <w:rFonts w:ascii="Courier New" w:eastAsia="Times New Roman" w:hAnsi="Courier New" w:cs="Courier New"/>
+          <w:sz w:val="20"/>
+          <w:szCs w:val="20"/>
+        </w:rPr>
+        <w:drawing>
+          <wp:inline distT="0" distB="0" distL="0" distR="0" wp14:anchorId="018E4611" wp14:editId="4A229A3F">
+            <wp:extent cx="3886537" cy="777307"/>
+            <wp:effectExtent l="0" t="0" r="0" b="3810"/>
+            <wp:docPr id="1312550923" name="Picture 1"/>
+            <wp:cNvGraphicFramePr>
+              <a:graphicFrameLocks xmlns:a="http://schemas.openxmlformats.org/drawingml/2006/main" noChangeAspect="1"/>
+            </wp:cNvGraphicFramePr>
+            <a:graphic xmlns:a="http://schemas.openxmlformats.org/drawingml/2006/main">
+              <a:graphicData uri="http://schemas.openxmlformats.org/drawingml/2006/picture">
+                <pic:pic xmlns:pic="http://schemas.openxmlformats.org/drawingml/2006/picture">
+                  <pic:nvPicPr>
+                    <pic:cNvPr id="1312550923" name=""/>
+                    <pic:cNvPicPr/>
+                  </pic:nvPicPr>
+                  <pic:blipFill>
+                    <a:blip r:embed="rId21"/>
+                    <a:stretch>
+                      <a:fillRect/>
+                    </a:stretch>
+                  </pic:blipFill>
+                  <pic:spPr>
+                    <a:xfrm>
+                      <a:off x="0" y="0"/>
+                      <a:ext cx="3886537" cy="777307"/>
+                    </a:xfrm>
+                    <a:prstGeom prst="rect">
+                      <a:avLst/>
+                    </a:prstGeom>
+                  </pic:spPr>
+                </pic:pic>
+              </a:graphicData>
+            </a:graphic>
+          </wp:inline>
+        </w:drawing>
+      </w:r>
+    </w:p>
+    <w:p>
+      <w:pPr>
         <w:numPr>
           <w:ilvl w:val="0"/>
           <w:numId w:val="5"/>
@@ -2425,7 +3002,58 @@
           <w:sz w:val="20"/>
           <w:szCs w:val="20"/>
         </w:rPr>
-        <w:t xml:space="preserve">Question 2.12 - Write up a short hypothesize on the timeframe for the next instruction using your working knowledge of RIP. </w:t>
+        <w:t xml:space="preserve">Question 2.12 - Write up a short </w:t>
+      </w:r>
+      <w:proofErr w:type="gramStart"/>
+      <w:r>
+        <w:rPr>
+          <w:rFonts w:ascii="Courier New" w:eastAsia="Times New Roman" w:hAnsi="Courier New" w:cs="Courier New"/>
+          <w:sz w:val="20"/>
+          <w:szCs w:val="20"/>
+        </w:rPr>
+        <w:t>hypothesize</w:t>
+      </w:r>
+      <w:proofErr w:type="gramEnd"/>
+      <w:r>
+        <w:rPr>
+          <w:rFonts w:ascii="Courier New" w:eastAsia="Times New Roman" w:hAnsi="Courier New" w:cs="Courier New"/>
+          <w:sz w:val="20"/>
+          <w:szCs w:val="20"/>
+        </w:rPr>
+        <w:t xml:space="preserve"> on the timeframe for the next instruction using your working knowledge of RIP. </w:t>
+      </w:r>
+    </w:p>
+    <w:p>
+      <w:pPr>
+        <w:spacing w:before="100" w:beforeAutospacing="1" w:after="100" w:afterAutospacing="1" w:line="240" w:lineRule="auto"/>
+        <w:ind w:left="720"/>
+        <w:rPr>
+          <w:rFonts w:ascii="Courier New" w:eastAsia="Times New Roman" w:hAnsi="Courier New" w:cs="Courier New"/>
+          <w:b/>
+          <w:bCs/>
+          <w:sz w:val="20"/>
+          <w:szCs w:val="20"/>
+        </w:rPr>
+      </w:pPr>
+      <w:r>
+        <w:rPr>
+          <w:rFonts w:ascii="Courier New" w:eastAsia="Times New Roman" w:hAnsi="Courier New" w:cs="Courier New"/>
+          <w:b/>
+          <w:bCs/>
+          <w:sz w:val="20"/>
+          <w:szCs w:val="20"/>
+        </w:rPr>
+        <w:t>Now in this case because the Router 3 goes down completely, RIP will send a triggered update so the convergence should happen much faste</w:t>
+      </w:r>
+      <w:r>
+        <w:rPr>
+          <w:rFonts w:ascii="Courier New" w:eastAsia="Times New Roman" w:hAnsi="Courier New" w:cs="Courier New"/>
+          <w:b/>
+          <w:bCs/>
+          <w:sz w:val="20"/>
+          <w:szCs w:val="20"/>
+        </w:rPr>
+        <w:t>r around a minute.</w:t>
       </w:r>
     </w:p>
     <w:p>
@@ -2469,7 +3097,102 @@
           <w:sz w:val="20"/>
           <w:szCs w:val="20"/>
         </w:rPr>
-        <w:t xml:space="preserve">Question 2.13 - Show and explain the actual timeframe using your logs for support. Explain any difference from your hypothesis. </w:t>
+        <w:t>Question 2.13 - Show and explain the actual timeframe using your logs for support. Explain any difference from your hypothesis.</w:t>
+      </w:r>
+    </w:p>
+    <w:p>
+      <w:pPr>
+        <w:spacing w:before="100" w:beforeAutospacing="1" w:after="100" w:afterAutospacing="1" w:line="240" w:lineRule="auto"/>
+        <w:ind w:left="720"/>
+        <w:rPr>
+          <w:rFonts w:ascii="Courier New" w:eastAsia="Times New Roman" w:hAnsi="Courier New" w:cs="Courier New"/>
+          <w:sz w:val="20"/>
+          <w:szCs w:val="20"/>
+        </w:rPr>
+      </w:pPr>
+      <w:r>
+        <w:rPr>
+          <w:rFonts w:ascii="Courier New" w:eastAsia="Times New Roman" w:hAnsi="Courier New" w:cs="Courier New"/>
+          <w:sz w:val="20"/>
+          <w:szCs w:val="20"/>
+        </w:rPr>
+        <w:t xml:space="preserve"> </w:t>
+      </w:r>
+      <w:r>
+        <w:rPr>
+          <w:rFonts w:ascii="Courier New" w:eastAsia="Times New Roman" w:hAnsi="Courier New" w:cs="Courier New"/>
+          <w:sz w:val="20"/>
+          <w:szCs w:val="20"/>
+        </w:rPr>
+        <w:drawing>
+          <wp:inline distT="0" distB="0" distL="0" distR="0" wp14:anchorId="35563E0A" wp14:editId="3C2EA467">
+            <wp:extent cx="5943600" cy="4039870"/>
+            <wp:effectExtent l="0" t="0" r="0" b="0"/>
+            <wp:docPr id="1016727868" name="Picture 1"/>
+            <wp:cNvGraphicFramePr>
+              <a:graphicFrameLocks xmlns:a="http://schemas.openxmlformats.org/drawingml/2006/main" noChangeAspect="1"/>
+            </wp:cNvGraphicFramePr>
+            <a:graphic xmlns:a="http://schemas.openxmlformats.org/drawingml/2006/main">
+              <a:graphicData uri="http://schemas.openxmlformats.org/drawingml/2006/picture">
+                <pic:pic xmlns:pic="http://schemas.openxmlformats.org/drawingml/2006/picture">
+                  <pic:nvPicPr>
+                    <pic:cNvPr id="1016727868" name=""/>
+                    <pic:cNvPicPr/>
+                  </pic:nvPicPr>
+                  <pic:blipFill>
+                    <a:blip r:embed="rId22"/>
+                    <a:stretch>
+                      <a:fillRect/>
+                    </a:stretch>
+                  </pic:blipFill>
+                  <pic:spPr>
+                    <a:xfrm>
+                      <a:off x="0" y="0"/>
+                      <a:ext cx="5943600" cy="4039870"/>
+                    </a:xfrm>
+                    <a:prstGeom prst="rect">
+                      <a:avLst/>
+                    </a:prstGeom>
+                  </pic:spPr>
+                </pic:pic>
+              </a:graphicData>
+            </a:graphic>
+          </wp:inline>
+        </w:drawing>
+      </w:r>
+    </w:p>
+    <w:p>
+      <w:pPr>
+        <w:spacing w:before="100" w:beforeAutospacing="1" w:after="100" w:afterAutospacing="1" w:line="240" w:lineRule="auto"/>
+        <w:ind w:left="720"/>
+        <w:rPr>
+          <w:rFonts w:ascii="Courier New" w:eastAsia="Times New Roman" w:hAnsi="Courier New" w:cs="Courier New"/>
+          <w:sz w:val="20"/>
+          <w:szCs w:val="20"/>
+        </w:rPr>
+      </w:pPr>
+    </w:p>
+    <w:p>
+      <w:pPr>
+        <w:spacing w:before="100" w:beforeAutospacing="1" w:after="100" w:afterAutospacing="1" w:line="240" w:lineRule="auto"/>
+        <w:ind w:left="720"/>
+        <w:rPr>
+          <w:rFonts w:ascii="Courier New" w:eastAsia="Times New Roman" w:hAnsi="Courier New" w:cs="Courier New"/>
+          <w:b/>
+          <w:bCs/>
+          <w:sz w:val="20"/>
+          <w:szCs w:val="20"/>
+        </w:rPr>
+      </w:pPr>
+      <w:r>
+        <w:rPr>
+          <w:rFonts w:ascii="Courier New" w:eastAsia="Times New Roman" w:hAnsi="Courier New" w:cs="Courier New"/>
+          <w:b/>
+          <w:bCs/>
+          <w:sz w:val="20"/>
+          <w:szCs w:val="20"/>
+        </w:rPr>
+        <w:t>What we see is that the convergence took close to 2 minutes.</w:t>
       </w:r>
     </w:p>
     <w:p>
@@ -2491,6 +3214,7 @@
           <w:sz w:val="20"/>
           <w:szCs w:val="20"/>
         </w:rPr>
+        <w:lastRenderedPageBreak/>
         <w:t xml:space="preserve">Continue observations, power R3 back on and wait for the network to converge. </w:t>
       </w:r>
     </w:p>
@@ -2518,6 +3242,29 @@
     </w:p>
     <w:p>
       <w:pPr>
+        <w:spacing w:before="100" w:beforeAutospacing="1" w:after="100" w:afterAutospacing="1" w:line="240" w:lineRule="auto"/>
+        <w:ind w:left="720"/>
+        <w:rPr>
+          <w:rFonts w:ascii="Courier New" w:eastAsia="Times New Roman" w:hAnsi="Courier New" w:cs="Courier New"/>
+          <w:b/>
+          <w:bCs/>
+          <w:sz w:val="20"/>
+          <w:szCs w:val="20"/>
+        </w:rPr>
+      </w:pPr>
+      <w:r>
+        <w:rPr>
+          <w:rFonts w:ascii="Courier New" w:eastAsia="Times New Roman" w:hAnsi="Courier New" w:cs="Courier New"/>
+          <w:b/>
+          <w:bCs/>
+          <w:sz w:val="20"/>
+          <w:szCs w:val="20"/>
+        </w:rPr>
+        <w:t>When R3 joins the topology back again we see that certain routes are changed back because R3 provides a smaller hop count metric to those destination routes.</w:t>
+      </w:r>
+    </w:p>
+    <w:p>
+      <w:pPr>
         <w:numPr>
           <w:ilvl w:val="0"/>
           <w:numId w:val="5"/>
@@ -2535,7 +3282,70 @@
           <w:sz w:val="20"/>
           <w:szCs w:val="20"/>
         </w:rPr>
-        <w:t xml:space="preserve">Question 2.15 - Explain the difference if any between the three failure and one recovery scenario. </w:t>
+        <w:t xml:space="preserve">Question 2.15 - Explain the difference if any between the three </w:t>
+      </w:r>
+      <w:proofErr w:type="gramStart"/>
+      <w:r>
+        <w:rPr>
+          <w:rFonts w:ascii="Courier New" w:eastAsia="Times New Roman" w:hAnsi="Courier New" w:cs="Courier New"/>
+          <w:sz w:val="20"/>
+          <w:szCs w:val="20"/>
+        </w:rPr>
+        <w:t>failure</w:t>
+      </w:r>
+      <w:proofErr w:type="gramEnd"/>
+      <w:r>
+        <w:rPr>
+          <w:rFonts w:ascii="Courier New" w:eastAsia="Times New Roman" w:hAnsi="Courier New" w:cs="Courier New"/>
+          <w:sz w:val="20"/>
+          <w:szCs w:val="20"/>
+        </w:rPr>
+        <w:t xml:space="preserve"> and one recovery scenario. </w:t>
+      </w:r>
+    </w:p>
+    <w:p>
+      <w:pPr>
+        <w:spacing w:before="100" w:beforeAutospacing="1" w:after="100" w:afterAutospacing="1" w:line="240" w:lineRule="auto"/>
+        <w:ind w:left="720"/>
+        <w:rPr>
+          <w:rFonts w:ascii="Courier New" w:eastAsia="Times New Roman" w:hAnsi="Courier New" w:cs="Courier New"/>
+          <w:b/>
+          <w:bCs/>
+          <w:sz w:val="20"/>
+          <w:szCs w:val="20"/>
+        </w:rPr>
+      </w:pPr>
+      <w:r>
+        <w:rPr>
+          <w:rFonts w:ascii="Courier New" w:eastAsia="Times New Roman" w:hAnsi="Courier New" w:cs="Courier New"/>
+          <w:b/>
+          <w:bCs/>
+          <w:sz w:val="20"/>
+          <w:szCs w:val="20"/>
+        </w:rPr>
+        <w:t xml:space="preserve">One difference was that for the VLAN mismatch there was no triggered update </w:t>
+      </w:r>
+      <w:proofErr w:type="gramStart"/>
+      <w:r>
+        <w:rPr>
+          <w:rFonts w:ascii="Courier New" w:eastAsia="Times New Roman" w:hAnsi="Courier New" w:cs="Courier New"/>
+          <w:b/>
+          <w:bCs/>
+          <w:sz w:val="20"/>
+          <w:szCs w:val="20"/>
+        </w:rPr>
+        <w:t>sent,</w:t>
+      </w:r>
+      <w:proofErr w:type="gramEnd"/>
+      <w:r>
+        <w:rPr>
+          <w:rFonts w:ascii="Courier New" w:eastAsia="Times New Roman" w:hAnsi="Courier New" w:cs="Courier New"/>
+          <w:b/>
+          <w:bCs/>
+          <w:sz w:val="20"/>
+          <w:szCs w:val="20"/>
+        </w:rPr>
+        <w:t xml:space="preserve"> it was rather dependent on the timeout for the route to be thrown out. Whereas in other scenarios the interface goes down so it sends out a triggered update making those updates slightly faster.</w:t>
       </w:r>
     </w:p>
     <w:p>
@@ -2563,21 +3373,109 @@
     <w:p>
       <w:pPr>
         <w:spacing w:before="100" w:beforeAutospacing="1" w:after="100" w:afterAutospacing="1" w:line="240" w:lineRule="auto"/>
-        <w:rPr>
-          <w:rFonts w:ascii="Courier New" w:eastAsia="Times New Roman" w:hAnsi="Courier New" w:cs="Courier New"/>
-          <w:sz w:val="20"/>
-          <w:szCs w:val="20"/>
-        </w:rPr>
-      </w:pPr>
-      <w:r>
-        <w:rPr>
-          <w:rFonts w:ascii="Courier New" w:eastAsia="Times New Roman" w:hAnsi="Courier New" w:cs="Courier New"/>
-          <w:b/>
-          <w:bCs/>
-          <w:sz w:val="20"/>
-          <w:szCs w:val="20"/>
-        </w:rPr>
-        <w:lastRenderedPageBreak/>
+        <w:ind w:left="720"/>
+        <w:rPr>
+          <w:rFonts w:ascii="Courier New" w:eastAsia="Times New Roman" w:hAnsi="Courier New" w:cs="Courier New"/>
+          <w:b/>
+          <w:bCs/>
+          <w:sz w:val="20"/>
+          <w:szCs w:val="20"/>
+        </w:rPr>
+      </w:pPr>
+      <w:r>
+        <w:rPr>
+          <w:rFonts w:ascii="Courier New" w:eastAsia="Times New Roman" w:hAnsi="Courier New" w:cs="Courier New"/>
+          <w:b/>
+          <w:bCs/>
+          <w:sz w:val="20"/>
+          <w:szCs w:val="20"/>
+        </w:rPr>
+        <w:t xml:space="preserve">We did the testing via automation scripts using </w:t>
+      </w:r>
+      <w:proofErr w:type="spellStart"/>
+      <w:r>
+        <w:rPr>
+          <w:rFonts w:ascii="Courier New" w:eastAsia="Times New Roman" w:hAnsi="Courier New" w:cs="Courier New"/>
+          <w:b/>
+          <w:bCs/>
+          <w:sz w:val="20"/>
+          <w:szCs w:val="20"/>
+        </w:rPr>
+        <w:t>netmiko</w:t>
+      </w:r>
+      <w:proofErr w:type="spellEnd"/>
+      <w:r>
+        <w:rPr>
+          <w:rFonts w:ascii="Courier New" w:eastAsia="Times New Roman" w:hAnsi="Courier New" w:cs="Courier New"/>
+          <w:b/>
+          <w:bCs/>
+          <w:sz w:val="20"/>
+          <w:szCs w:val="20"/>
+        </w:rPr>
+        <w:t xml:space="preserve">, we continued pinging in loops and made the changes as needed for different scenarios, we also logged the </w:t>
+      </w:r>
+      <w:proofErr w:type="gramStart"/>
+      <w:r>
+        <w:rPr>
+          <w:rFonts w:ascii="Courier New" w:eastAsia="Times New Roman" w:hAnsi="Courier New" w:cs="Courier New"/>
+          <w:b/>
+          <w:bCs/>
+          <w:sz w:val="20"/>
+          <w:szCs w:val="20"/>
+        </w:rPr>
+        <w:t>fail</w:t>
+      </w:r>
+      <w:proofErr w:type="gramEnd"/>
+      <w:r>
+        <w:rPr>
+          <w:rFonts w:ascii="Courier New" w:eastAsia="Times New Roman" w:hAnsi="Courier New" w:cs="Courier New"/>
+          <w:b/>
+          <w:bCs/>
+          <w:sz w:val="20"/>
+          <w:szCs w:val="20"/>
+        </w:rPr>
+        <w:t xml:space="preserve"> pings and the success pings and </w:t>
+      </w:r>
+      <w:proofErr w:type="gramStart"/>
+      <w:r>
+        <w:rPr>
+          <w:rFonts w:ascii="Courier New" w:eastAsia="Times New Roman" w:hAnsi="Courier New" w:cs="Courier New"/>
+          <w:b/>
+          <w:bCs/>
+          <w:sz w:val="20"/>
+          <w:szCs w:val="20"/>
+        </w:rPr>
+        <w:t>calculate</w:t>
+      </w:r>
+      <w:proofErr w:type="gramEnd"/>
+      <w:r>
+        <w:rPr>
+          <w:rFonts w:ascii="Courier New" w:eastAsia="Times New Roman" w:hAnsi="Courier New" w:cs="Courier New"/>
+          <w:b/>
+          <w:bCs/>
+          <w:sz w:val="20"/>
+          <w:szCs w:val="20"/>
+        </w:rPr>
+        <w:t xml:space="preserve"> the time difference between them.</w:t>
+      </w:r>
+    </w:p>
+    <w:p>
+      <w:pPr>
+        <w:spacing w:before="100" w:beforeAutospacing="1" w:after="100" w:afterAutospacing="1" w:line="240" w:lineRule="auto"/>
+        <w:rPr>
+          <w:rFonts w:ascii="Courier New" w:eastAsia="Times New Roman" w:hAnsi="Courier New" w:cs="Courier New"/>
+          <w:sz w:val="20"/>
+          <w:szCs w:val="20"/>
+        </w:rPr>
+      </w:pPr>
+      <w:r>
+        <w:rPr>
+          <w:rFonts w:ascii="Courier New" w:eastAsia="Times New Roman" w:hAnsi="Courier New" w:cs="Courier New"/>
+          <w:b/>
+          <w:bCs/>
+          <w:sz w:val="20"/>
+          <w:szCs w:val="20"/>
+        </w:rPr>
         <w:t>OBJECTIVE 3</w:t>
       </w:r>
       <w:r>
@@ -2847,6 +3745,7 @@
           <w:sz w:val="20"/>
           <w:szCs w:val="20"/>
         </w:rPr>
+        <w:lastRenderedPageBreak/>
         <w:t xml:space="preserve">Question 3.7 - Ping the loopback for R1 from R5, be sure to use the loopback of R5 as the ping source. Cut and paste the command showing this. </w:t>
       </w:r>
     </w:p>
@@ -3111,7 +4010,6 @@
           <w:sz w:val="20"/>
           <w:szCs w:val="20"/>
         </w:rPr>
-        <w:lastRenderedPageBreak/>
         <w:t xml:space="preserve">Question 3.15 - Show and explain the actual timeframe using your logs for support. Explain any difference from your hypothesis. </w:t>
       </w:r>
     </w:p>
@@ -3423,6 +4321,7 @@
           <w:sz w:val="20"/>
           <w:szCs w:val="20"/>
         </w:rPr>
+        <w:lastRenderedPageBreak/>
         <w:t xml:space="preserve">Question 4.2 - What type of LSA will the RIP networks from a different group show up as on your R1 and R5 routers? Show me output proving your answer. </w:t>
       </w:r>
     </w:p>

</xml_diff>